<commit_message>
feat(exp36-41): freeze official fusion line and unify Leave-Next cohort
Publish Exp36–40 challenge fusion/CSV hardening code and materials, Exp41 real-subject Leave-Next F5 cohort tooling and reports, 45ch preprocess helpers, and Exp36 summary JSON (weights excluded).

Co-authored-by: Cursor <cursoragent@cursor.com>
</commit_message>
<xml_diff>
--- a/资料/初赛材料/01_技术报告/技术报告_XH-202610.docx
+++ b/资料/初赛材料/01_技术报告/技术报告_XH-202610.docx
@@ -60,7 +60,6 @@
         <w:pStyle w:val="Heading2"/>
         <w:spacing w:line="312" w:lineRule="auto" w:before="200" w:after="160"/>
       </w:pPr>
-      <w:bookmarkStart w:id="100000" w:name="_Toc100000"/>
       <w:r>
         <w:rPr>
           <w:rFonts w:ascii="Times New Roman" w:hAnsi="Times New Roman" w:eastAsia="黑体"/>
@@ -70,7 +69,6 @@
         </w:rPr>
         <w:t>摘要</w:t>
       </w:r>
-      <w:bookmarkEnd w:id="100000"/>
     </w:p>
     <w:p>
       <w:pPr>
@@ -103,7 +101,7 @@
           <w:color w:val="000000"/>
           <w:sz w:val="24"/>
         </w:rPr>
-        <w:t xml:space="preserve">（召回率 macro 61.88%、特异性 macro 80.94%）；通过跨库伪在线与 Leave-Next 仿真证明权重级增量微调是个体适配的唯一有效来源（Stieger 24 人零样本 41.98% → 少样本微调 65.90% → 生理门控 70.03%；BCI2a 仿真末档 67.1% vs 单成员微调 44.5%）；真实被试采后 Leave-Next 适配最优个体窗级准确率达 </w:t>
+        <w:t>（召回率 macro 61.88%、特异性 macro 80.94%）；在</w:t>
       </w:r>
       <w:r>
         <w:rPr>
@@ -112,7 +110,7 @@
           <w:color w:val="000000"/>
           <w:sz w:val="24"/>
         </w:rPr>
-        <w:t>91.6%</w:t>
+        <w:t>主办方指定标准数据集</w:t>
       </w:r>
       <w:r>
         <w:rPr>
@@ -121,7 +119,151 @@
           <w:color w:val="000000"/>
           <w:sz w:val="24"/>
         </w:rPr>
-        <w:t>（MI 试次 94.4%）。在线端单窗前向增量耗时 1.11 ms，判定延迟约 3.5 s，配合网页游戏化诱导与第一人称反馈界面，形成可验证、可复现、可演示的完整闭环系统。</w:t>
+        <w:t xml:space="preserve">上交卷栈为 </w:t>
+      </w:r>
+      <w:r>
+        <w:rPr>
+          <w:rFonts w:ascii="Times New Roman" w:hAnsi="Times New Roman" w:eastAsia="宋体"/>
+          <w:b/>
+          <w:color w:val="000000"/>
+          <w:sz w:val="24"/>
+        </w:rPr>
+        <w:t>59ch 从零 E1f-A59（S0）</w:t>
+      </w:r>
+      <w:r>
+        <w:rPr>
+          <w:rFonts w:ascii="Times New Roman" w:hAnsi="Times New Roman" w:eastAsia="宋体"/>
+          <w:b w:val="0"/>
+          <w:color w:val="000000"/>
+          <w:sz w:val="24"/>
+        </w:rPr>
+        <w:t xml:space="preserve">：leave-fold 嵌套主读 </w:t>
+      </w:r>
+      <w:r>
+        <w:rPr>
+          <w:rFonts w:ascii="Times New Roman" w:hAnsi="Times New Roman" w:eastAsia="宋体"/>
+          <w:b/>
+          <w:color w:val="000000"/>
+          <w:sz w:val="24"/>
+        </w:rPr>
+        <w:t>0.511±0.066</w:t>
+      </w:r>
+      <w:r>
+        <w:rPr>
+          <w:rFonts w:ascii="Times New Roman" w:hAnsi="Times New Roman" w:eastAsia="宋体"/>
+          <w:b w:val="0"/>
+          <w:color w:val="000000"/>
+          <w:sz w:val="24"/>
+        </w:rPr>
+        <w:t xml:space="preserve">，折内附报 </w:t>
+      </w:r>
+      <w:r>
+        <w:rPr>
+          <w:rFonts w:ascii="Times New Roman" w:hAnsi="Times New Roman" w:eastAsia="宋体"/>
+          <w:b/>
+          <w:color w:val="000000"/>
+          <w:sz w:val="24"/>
+        </w:rPr>
+        <w:t>0.558±0.069</w:t>
+      </w:r>
+      <w:r>
+        <w:rPr>
+          <w:rFonts w:ascii="Times New Roman" w:hAnsi="Times New Roman" w:eastAsia="宋体"/>
+          <w:b w:val="0"/>
+          <w:color w:val="000000"/>
+          <w:sz w:val="24"/>
+        </w:rPr>
+        <w:t xml:space="preserve">（in-sample 乐观约 </w:t>
+      </w:r>
+      <w:r>
+        <w:rPr>
+          <w:rFonts w:ascii="Times New Roman" w:hAnsi="Times New Roman" w:eastAsia="宋体"/>
+          <w:b/>
+          <w:color w:val="000000"/>
+          <w:sz w:val="24"/>
+        </w:rPr>
+        <w:t>+4.7pp</w:t>
+      </w:r>
+      <w:r>
+        <w:rPr>
+          <w:rFonts w:ascii="Times New Roman" w:hAnsi="Times New Roman" w:eastAsia="宋体"/>
+          <w:b w:val="0"/>
+          <w:color w:val="000000"/>
+          <w:sz w:val="24"/>
+        </w:rPr>
+        <w:t xml:space="preserve">，实验 37）；备选 OpenBMI→8ch FT 栈 nested </w:t>
+      </w:r>
+      <w:r>
+        <w:rPr>
+          <w:rFonts w:ascii="Times New Roman" w:hAnsi="Times New Roman" w:eastAsia="宋体"/>
+          <w:b/>
+          <w:color w:val="000000"/>
+          <w:sz w:val="24"/>
+        </w:rPr>
+        <w:t>0.540</w:t>
+      </w:r>
+      <w:r>
+        <w:rPr>
+          <w:rFonts w:ascii="Times New Roman" w:hAnsi="Times New Roman" w:eastAsia="宋体"/>
+          <w:b w:val="0"/>
+          <w:color w:val="000000"/>
+          <w:sz w:val="24"/>
+        </w:rPr>
+        <w:t xml:space="preserve"> 已登记但因 Val 支撑外推风险否决（实验 40）。通过跨库伪在线与 Leave-Next 仿真证明权重级增量微调是个体适配的唯一有效来源（Stieger 24 人零样本 41.98% → 少样本微调 65.90% → 生理门控 70.03%；BCI2a 仿真末档 all4 </w:t>
+      </w:r>
+      <w:r>
+        <w:rPr>
+          <w:rFonts w:ascii="Times New Roman" w:hAnsi="Times New Roman" w:eastAsia="宋体"/>
+          <w:b/>
+          <w:color w:val="000000"/>
+          <w:sz w:val="24"/>
+        </w:rPr>
+        <w:t>66.3%</w:t>
+      </w:r>
+      <w:r>
+        <w:rPr>
+          <w:rFonts w:ascii="Times New Roman" w:hAnsi="Times New Roman" w:eastAsia="宋体"/>
+          <w:b w:val="0"/>
+          <w:color w:val="000000"/>
+          <w:sz w:val="24"/>
+        </w:rPr>
+        <w:t xml:space="preserve"> vs 单成员 so </w:t>
+      </w:r>
+      <w:r>
+        <w:rPr>
+          <w:rFonts w:ascii="Times New Roman" w:hAnsi="Times New Roman" w:eastAsia="宋体"/>
+          <w:b/>
+          <w:color w:val="000000"/>
+          <w:sz w:val="24"/>
+        </w:rPr>
+        <w:t>45.2%</w:t>
+      </w:r>
+      <w:r>
+        <w:rPr>
+          <w:rFonts w:ascii="Times New Roman" w:hAnsi="Times New Roman" w:eastAsia="宋体"/>
+          <w:b w:val="0"/>
+          <w:color w:val="000000"/>
+          <w:sz w:val="24"/>
+        </w:rPr>
+        <w:t xml:space="preserve">，Δ+21.1 pp）；真实被试采后 Leave-Next 适配最优个体窗级准确率达 </w:t>
+      </w:r>
+      <w:r>
+        <w:rPr>
+          <w:rFonts w:ascii="Times New Roman" w:hAnsi="Times New Roman" w:eastAsia="宋体"/>
+          <w:b/>
+          <w:color w:val="000000"/>
+          <w:sz w:val="24"/>
+        </w:rPr>
+        <w:t>92.4%</w:t>
+      </w:r>
+      <w:r>
+        <w:rPr>
+          <w:rFonts w:ascii="Times New Roman" w:hAnsi="Times New Roman" w:eastAsia="宋体"/>
+          <w:b w:val="0"/>
+          <w:color w:val="000000"/>
+          <w:sz w:val="24"/>
+        </w:rPr>
+        <w:t>（F5 试次计分 41.5/45，MI 33/36）。在线端单窗前向增量耗时 1.11 ms，判定延迟约 3.5 s，配合网页游戏化诱导与第一人称反馈界面，形成可验证、可复现、可演示的完整闭环系统。</w:t>
       </w:r>
     </w:p>
     <w:p>
@@ -185,1611 +327,6 @@
       </w:r>
     </w:p>
     <w:p>
-      <w:pPr>
-        <w:pStyle w:val="11"/>
-        <w:ind w:left="360"/>
-        <w:tabs>
-          <w:tab w:val="right" w:leader="dot" w:pos="9026"/>
-        </w:tabs>
-        <w:spacing w:before="120" w:after="60"/>
-      </w:pPr>
-      <w:hyperlink w:anchor="_Toc100000" w:history="1">
-        <w:r>
-          <w:rPr>
-            <w:rStyle w:val="Hyperlink"/>
-          </w:rPr>
-          <w:t>摘要</w:t>
-        </w:r>
-        <w:r>
-          <w:tab/>
-        </w:r>
-        <w:r>
-          <w:fldChar w:fldCharType="begin"/>
-        </w:r>
-        <w:r>
-          <w:instrText xml:space="preserve"> PAGEREF _Toc100000 \h </w:instrText>
-        </w:r>
-        <w:r>
-          <w:fldChar w:fldCharType="separate"/>
-        </w:r>
-        <w:r>
-          <w:t>1</w:t>
-        </w:r>
-        <w:r>
-          <w:fldChar w:fldCharType="end"/>
-        </w:r>
-      </w:hyperlink>
-    </w:p>
-    <w:p>
-      <w:pPr>
-        <w:pStyle w:val="9"/>
-        <w:tabs>
-          <w:tab w:val="right" w:leader="dot" w:pos="9026"/>
-        </w:tabs>
-        <w:spacing w:before="120" w:after="60"/>
-      </w:pPr>
-      <w:hyperlink w:anchor="_Toc100001" w:history="1">
-        <w:r>
-          <w:rPr>
-            <w:rStyle w:val="Hyperlink"/>
-          </w:rPr>
-          <w:t>1. 引言</w:t>
-        </w:r>
-        <w:r>
-          <w:tab/>
-        </w:r>
-        <w:r>
-          <w:fldChar w:fldCharType="begin"/>
-        </w:r>
-        <w:r>
-          <w:instrText xml:space="preserve"> PAGEREF _Toc100001 \h </w:instrText>
-        </w:r>
-        <w:r>
-          <w:fldChar w:fldCharType="separate"/>
-        </w:r>
-        <w:r>
-          <w:t>2</w:t>
-        </w:r>
-        <w:r>
-          <w:fldChar w:fldCharType="end"/>
-        </w:r>
-      </w:hyperlink>
-    </w:p>
-    <w:p>
-      <w:pPr>
-        <w:pStyle w:val="11"/>
-        <w:ind w:left="360"/>
-        <w:tabs>
-          <w:tab w:val="right" w:leader="dot" w:pos="9026"/>
-        </w:tabs>
-        <w:spacing w:before="120" w:after="60"/>
-      </w:pPr>
-      <w:hyperlink w:anchor="_Toc100002" w:history="1">
-        <w:r>
-          <w:rPr>
-            <w:rStyle w:val="Hyperlink"/>
-          </w:rPr>
-          <w:t>1.1 应用背景与核心技术瓶颈</w:t>
-        </w:r>
-        <w:r>
-          <w:tab/>
-        </w:r>
-        <w:r>
-          <w:fldChar w:fldCharType="begin"/>
-        </w:r>
-        <w:r>
-          <w:instrText xml:space="preserve"> PAGEREF _Toc100002 \h </w:instrText>
-        </w:r>
-        <w:r>
-          <w:fldChar w:fldCharType="separate"/>
-        </w:r>
-        <w:r>
-          <w:t>3</w:t>
-        </w:r>
-        <w:r>
-          <w:fldChar w:fldCharType="end"/>
-        </w:r>
-      </w:hyperlink>
-    </w:p>
-    <w:p>
-      <w:pPr>
-        <w:pStyle w:val="11"/>
-        <w:ind w:left="360"/>
-        <w:tabs>
-          <w:tab w:val="right" w:leader="dot" w:pos="9026"/>
-        </w:tabs>
-        <w:spacing w:before="120" w:after="60"/>
-      </w:pPr>
-      <w:hyperlink w:anchor="_Toc100003" w:history="1">
-        <w:r>
-          <w:rPr>
-            <w:rStyle w:val="Hyperlink"/>
-          </w:rPr>
-          <w:t>1.2 赛题需求对接与本文贡献</w:t>
-        </w:r>
-        <w:r>
-          <w:tab/>
-        </w:r>
-        <w:r>
-          <w:fldChar w:fldCharType="begin"/>
-        </w:r>
-        <w:r>
-          <w:instrText xml:space="preserve"> PAGEREF _Toc100003 \h </w:instrText>
-        </w:r>
-        <w:r>
-          <w:fldChar w:fldCharType="separate"/>
-        </w:r>
-        <w:r>
-          <w:t>3</w:t>
-        </w:r>
-        <w:r>
-          <w:fldChar w:fldCharType="end"/>
-        </w:r>
-      </w:hyperlink>
-    </w:p>
-    <w:p>
-      <w:pPr>
-        <w:pStyle w:val="9"/>
-        <w:tabs>
-          <w:tab w:val="right" w:leader="dot" w:pos="9026"/>
-        </w:tabs>
-        <w:spacing w:before="120" w:after="60"/>
-      </w:pPr>
-      <w:hyperlink w:anchor="_Toc100004" w:history="1">
-        <w:r>
-          <w:rPr>
-            <w:rStyle w:val="Hyperlink"/>
-          </w:rPr>
-          <w:t>2. 系统总体设计</w:t>
-        </w:r>
-        <w:r>
-          <w:tab/>
-        </w:r>
-        <w:r>
-          <w:fldChar w:fldCharType="begin"/>
-        </w:r>
-        <w:r>
-          <w:instrText xml:space="preserve"> PAGEREF _Toc100004 \h </w:instrText>
-        </w:r>
-        <w:r>
-          <w:fldChar w:fldCharType="separate"/>
-        </w:r>
-        <w:r>
-          <w:t>4</w:t>
-        </w:r>
-        <w:r>
-          <w:fldChar w:fldCharType="end"/>
-        </w:r>
-      </w:hyperlink>
-    </w:p>
-    <w:p>
-      <w:pPr>
-        <w:pStyle w:val="11"/>
-        <w:ind w:left="360"/>
-        <w:tabs>
-          <w:tab w:val="right" w:leader="dot" w:pos="9026"/>
-        </w:tabs>
-        <w:spacing w:before="120" w:after="60"/>
-      </w:pPr>
-      <w:hyperlink w:anchor="_Toc100005" w:history="1">
-        <w:r>
-          <w:rPr>
-            <w:rStyle w:val="Hyperlink"/>
-          </w:rPr>
-          <w:t>2.1 三级优化框架</w:t>
-        </w:r>
-        <w:r>
-          <w:tab/>
-        </w:r>
-        <w:r>
-          <w:fldChar w:fldCharType="begin"/>
-        </w:r>
-        <w:r>
-          <w:instrText xml:space="preserve"> PAGEREF _Toc100005 \h </w:instrText>
-        </w:r>
-        <w:r>
-          <w:fldChar w:fldCharType="separate"/>
-        </w:r>
-        <w:r>
-          <w:t>4</w:t>
-        </w:r>
-        <w:r>
-          <w:fldChar w:fldCharType="end"/>
-        </w:r>
-      </w:hyperlink>
-    </w:p>
-    <w:p>
-      <w:pPr>
-        <w:pStyle w:val="11"/>
-        <w:ind w:left="360"/>
-        <w:tabs>
-          <w:tab w:val="right" w:leader="dot" w:pos="9026"/>
-        </w:tabs>
-        <w:spacing w:before="120" w:after="60"/>
-      </w:pPr>
-      <w:hyperlink w:anchor="_Toc100006" w:history="1">
-        <w:r>
-          <w:rPr>
-            <w:rStyle w:val="Hyperlink"/>
-          </w:rPr>
-          <w:t>2.2 系统运行链路</w:t>
-        </w:r>
-        <w:r>
-          <w:tab/>
-        </w:r>
-        <w:r>
-          <w:fldChar w:fldCharType="begin"/>
-        </w:r>
-        <w:r>
-          <w:instrText xml:space="preserve"> PAGEREF _Toc100006 \h </w:instrText>
-        </w:r>
-        <w:r>
-          <w:fldChar w:fldCharType="separate"/>
-        </w:r>
-        <w:r>
-          <w:t>5</w:t>
-        </w:r>
-        <w:r>
-          <w:fldChar w:fldCharType="end"/>
-        </w:r>
-      </w:hyperlink>
-    </w:p>
-    <w:p>
-      <w:pPr>
-        <w:pStyle w:val="11"/>
-        <w:ind w:left="360"/>
-        <w:tabs>
-          <w:tab w:val="right" w:leader="dot" w:pos="9026"/>
-        </w:tabs>
-        <w:spacing w:before="120" w:after="60"/>
-      </w:pPr>
-      <w:hyperlink w:anchor="_Toc100007" w:history="1">
-        <w:r>
-          <w:rPr>
-            <w:rStyle w:val="Hyperlink"/>
-          </w:rPr>
-          <w:t>2.3 关键设计原则</w:t>
-        </w:r>
-        <w:r>
-          <w:tab/>
-        </w:r>
-        <w:r>
-          <w:fldChar w:fldCharType="begin"/>
-        </w:r>
-        <w:r>
-          <w:instrText xml:space="preserve"> PAGEREF _Toc100007 \h </w:instrText>
-        </w:r>
-        <w:r>
-          <w:fldChar w:fldCharType="separate"/>
-        </w:r>
-        <w:r>
-          <w:t>5</w:t>
-        </w:r>
-        <w:r>
-          <w:fldChar w:fldCharType="end"/>
-        </w:r>
-      </w:hyperlink>
-    </w:p>
-    <w:p>
-      <w:pPr>
-        <w:pStyle w:val="9"/>
-        <w:tabs>
-          <w:tab w:val="right" w:leader="dot" w:pos="9026"/>
-        </w:tabs>
-        <w:spacing w:before="120" w:after="60"/>
-      </w:pPr>
-      <w:hyperlink w:anchor="_Toc100008" w:history="1">
-        <w:r>
-          <w:rPr>
-            <w:rStyle w:val="Hyperlink"/>
-          </w:rPr>
-          <w:t>3. 脑电数据采集规范</w:t>
-        </w:r>
-        <w:r>
-          <w:tab/>
-        </w:r>
-        <w:r>
-          <w:fldChar w:fldCharType="begin"/>
-        </w:r>
-        <w:r>
-          <w:instrText xml:space="preserve"> PAGEREF _Toc100008 \h </w:instrText>
-        </w:r>
-        <w:r>
-          <w:fldChar w:fldCharType="separate"/>
-        </w:r>
-        <w:r>
-          <w:t>5</w:t>
-        </w:r>
-        <w:r>
-          <w:fldChar w:fldCharType="end"/>
-        </w:r>
-      </w:hyperlink>
-    </w:p>
-    <w:p>
-      <w:pPr>
-        <w:pStyle w:val="11"/>
-        <w:ind w:left="360"/>
-        <w:tabs>
-          <w:tab w:val="right" w:leader="dot" w:pos="9026"/>
-        </w:tabs>
-        <w:spacing w:before="120" w:after="60"/>
-      </w:pPr>
-      <w:hyperlink w:anchor="_Toc100009" w:history="1">
-        <w:r>
-          <w:rPr>
-            <w:rStyle w:val="Hyperlink"/>
-          </w:rPr>
-          <w:t>3.1 采集设备与信号链</w:t>
-        </w:r>
-        <w:r>
-          <w:tab/>
-        </w:r>
-        <w:r>
-          <w:fldChar w:fldCharType="begin"/>
-        </w:r>
-        <w:r>
-          <w:instrText xml:space="preserve"> PAGEREF _Toc100009 \h </w:instrText>
-        </w:r>
-        <w:r>
-          <w:fldChar w:fldCharType="separate"/>
-        </w:r>
-        <w:r>
-          <w:t>5</w:t>
-        </w:r>
-        <w:r>
-          <w:fldChar w:fldCharType="end"/>
-        </w:r>
-      </w:hyperlink>
-    </w:p>
-    <w:p>
-      <w:pPr>
-        <w:pStyle w:val="11"/>
-        <w:ind w:left="360"/>
-        <w:tabs>
-          <w:tab w:val="right" w:leader="dot" w:pos="9026"/>
-        </w:tabs>
-        <w:spacing w:before="120" w:after="60"/>
-      </w:pPr>
-      <w:hyperlink w:anchor="_Toc100010" w:history="1">
-        <w:r>
-          <w:rPr>
-            <w:rStyle w:val="Hyperlink"/>
-          </w:rPr>
-          <w:t>3.2 实验范式（OpenBMI-Align v1，冻结口径）</w:t>
-        </w:r>
-        <w:r>
-          <w:tab/>
-        </w:r>
-        <w:r>
-          <w:fldChar w:fldCharType="begin"/>
-        </w:r>
-        <w:r>
-          <w:instrText xml:space="preserve"> PAGEREF _Toc100010 \h </w:instrText>
-        </w:r>
-        <w:r>
-          <w:fldChar w:fldCharType="separate"/>
-        </w:r>
-        <w:r>
-          <w:t>6</w:t>
-        </w:r>
-        <w:r>
-          <w:fldChar w:fldCharType="end"/>
-        </w:r>
-      </w:hyperlink>
-    </w:p>
-    <w:p>
-      <w:pPr>
-        <w:pStyle w:val="11"/>
-        <w:ind w:left="360"/>
-        <w:tabs>
-          <w:tab w:val="right" w:leader="dot" w:pos="9026"/>
-        </w:tabs>
-        <w:spacing w:before="120" w:after="60"/>
-      </w:pPr>
-      <w:hyperlink w:anchor="_Toc100011" w:history="1">
-        <w:r>
-          <w:rPr>
-            <w:rStyle w:val="Hyperlink"/>
-          </w:rPr>
-          <w:t>3.3 数据落盘与质量控制</w:t>
-        </w:r>
-        <w:r>
-          <w:tab/>
-        </w:r>
-        <w:r>
-          <w:fldChar w:fldCharType="begin"/>
-        </w:r>
-        <w:r>
-          <w:instrText xml:space="preserve"> PAGEREF _Toc100011 \h </w:instrText>
-        </w:r>
-        <w:r>
-          <w:fldChar w:fldCharType="separate"/>
-        </w:r>
-        <w:r>
-          <w:t>6</w:t>
-        </w:r>
-        <w:r>
-          <w:fldChar w:fldCharType="end"/>
-        </w:r>
-      </w:hyperlink>
-    </w:p>
-    <w:p>
-      <w:pPr>
-        <w:pStyle w:val="11"/>
-        <w:ind w:left="360"/>
-        <w:tabs>
-          <w:tab w:val="right" w:leader="dot" w:pos="9026"/>
-        </w:tabs>
-        <w:spacing w:before="120" w:after="60"/>
-      </w:pPr>
-      <w:hyperlink w:anchor="_Toc100012" w:history="1">
-        <w:r>
-          <w:rPr>
-            <w:rStyle w:val="Hyperlink"/>
-          </w:rPr>
-          <w:t>3.4 数据集</w:t>
-        </w:r>
-        <w:r>
-          <w:tab/>
-        </w:r>
-        <w:r>
-          <w:fldChar w:fldCharType="begin"/>
-        </w:r>
-        <w:r>
-          <w:instrText xml:space="preserve"> PAGEREF _Toc100012 \h </w:instrText>
-        </w:r>
-        <w:r>
-          <w:fldChar w:fldCharType="separate"/>
-        </w:r>
-        <w:r>
-          <w:t>6</w:t>
-        </w:r>
-        <w:r>
-          <w:fldChar w:fldCharType="end"/>
-        </w:r>
-      </w:hyperlink>
-    </w:p>
-    <w:p>
-      <w:pPr>
-        <w:pStyle w:val="9"/>
-        <w:tabs>
-          <w:tab w:val="right" w:leader="dot" w:pos="9026"/>
-        </w:tabs>
-        <w:spacing w:before="120" w:after="60"/>
-      </w:pPr>
-      <w:hyperlink w:anchor="_Toc100013" w:history="1">
-        <w:r>
-          <w:rPr>
-            <w:rStyle w:val="Hyperlink"/>
-          </w:rPr>
-          <w:t>4. 信号预处理与特征提取</w:t>
-        </w:r>
-        <w:r>
-          <w:tab/>
-        </w:r>
-        <w:r>
-          <w:fldChar w:fldCharType="begin"/>
-        </w:r>
-        <w:r>
-          <w:instrText xml:space="preserve"> PAGEREF _Toc100013 \h </w:instrText>
-        </w:r>
-        <w:r>
-          <w:fldChar w:fldCharType="separate"/>
-        </w:r>
-        <w:r>
-          <w:t>7</w:t>
-        </w:r>
-        <w:r>
-          <w:fldChar w:fldCharType="end"/>
-        </w:r>
-      </w:hyperlink>
-    </w:p>
-    <w:p>
-      <w:pPr>
-        <w:pStyle w:val="11"/>
-        <w:ind w:left="360"/>
-        <w:tabs>
-          <w:tab w:val="right" w:leader="dot" w:pos="9026"/>
-        </w:tabs>
-        <w:spacing w:before="120" w:after="60"/>
-      </w:pPr>
-      <w:hyperlink w:anchor="_Toc100014" w:history="1">
-        <w:r>
-          <w:rPr>
-            <w:rStyle w:val="Hyperlink"/>
-          </w:rPr>
-          <w:t>4.1 统一预处理口径</w:t>
-        </w:r>
-        <w:r>
-          <w:tab/>
-        </w:r>
-        <w:r>
-          <w:fldChar w:fldCharType="begin"/>
-        </w:r>
-        <w:r>
-          <w:instrText xml:space="preserve"> PAGEREF _Toc100014 \h </w:instrText>
-        </w:r>
-        <w:r>
-          <w:fldChar w:fldCharType="separate"/>
-        </w:r>
-        <w:r>
-          <w:t>7</w:t>
-        </w:r>
-        <w:r>
-          <w:fldChar w:fldCharType="end"/>
-        </w:r>
-      </w:hyperlink>
-    </w:p>
-    <w:p>
-      <w:pPr>
-        <w:pStyle w:val="11"/>
-        <w:ind w:left="360"/>
-        <w:tabs>
-          <w:tab w:val="right" w:leader="dot" w:pos="9026"/>
-        </w:tabs>
-        <w:spacing w:before="120" w:after="60"/>
-      </w:pPr>
-      <w:hyperlink w:anchor="_Toc100015" w:history="1">
-        <w:r>
-          <w:rPr>
-            <w:rStyle w:val="Hyperlink"/>
-          </w:rPr>
-          <w:t>4.2 滑窗特征</w:t>
-        </w:r>
-        <w:r>
-          <w:tab/>
-        </w:r>
-        <w:r>
-          <w:fldChar w:fldCharType="begin"/>
-        </w:r>
-        <w:r>
-          <w:instrText xml:space="preserve"> PAGEREF _Toc100015 \h </w:instrText>
-        </w:r>
-        <w:r>
-          <w:fldChar w:fldCharType="separate"/>
-        </w:r>
-        <w:r>
-          <w:t>7</w:t>
-        </w:r>
-        <w:r>
-          <w:fldChar w:fldCharType="end"/>
-        </w:r>
-      </w:hyperlink>
-    </w:p>
-    <w:p>
-      <w:pPr>
-        <w:pStyle w:val="11"/>
-        <w:ind w:left="360"/>
-        <w:tabs>
-          <w:tab w:val="right" w:leader="dot" w:pos="9026"/>
-        </w:tabs>
-        <w:spacing w:before="120" w:after="60"/>
-      </w:pPr>
-      <w:hyperlink w:anchor="_Toc100016" w:history="1">
-        <w:r>
-          <w:rPr>
-            <w:rStyle w:val="Hyperlink"/>
-          </w:rPr>
-          <w:t>4.3 双标签双头</w:t>
-        </w:r>
-        <w:r>
-          <w:tab/>
-        </w:r>
-        <w:r>
-          <w:fldChar w:fldCharType="begin"/>
-        </w:r>
-        <w:r>
-          <w:instrText xml:space="preserve"> PAGEREF _Toc100016 \h </w:instrText>
-        </w:r>
-        <w:r>
-          <w:fldChar w:fldCharType="separate"/>
-        </w:r>
-        <w:r>
-          <w:t>7</w:t>
-        </w:r>
-        <w:r>
-          <w:fldChar w:fldCharType="end"/>
-        </w:r>
-      </w:hyperlink>
-    </w:p>
-    <w:p>
-      <w:pPr>
-        <w:pStyle w:val="9"/>
-        <w:tabs>
-          <w:tab w:val="right" w:leader="dot" w:pos="9026"/>
-        </w:tabs>
-        <w:spacing w:before="120" w:after="60"/>
-      </w:pPr>
-      <w:hyperlink w:anchor="_Toc100017" w:history="1">
-        <w:r>
-          <w:rPr>
-            <w:rStyle w:val="Hyperlink"/>
-          </w:rPr>
-          <w:t>5. 分类模型架构</w:t>
-        </w:r>
-        <w:r>
-          <w:tab/>
-        </w:r>
-        <w:r>
-          <w:fldChar w:fldCharType="begin"/>
-        </w:r>
-        <w:r>
-          <w:instrText xml:space="preserve"> PAGEREF _Toc100017 \h </w:instrText>
-        </w:r>
-        <w:r>
-          <w:fldChar w:fldCharType="separate"/>
-        </w:r>
-        <w:r>
-          <w:t>8</w:t>
-        </w:r>
-        <w:r>
-          <w:fldChar w:fldCharType="end"/>
-        </w:r>
-      </w:hyperlink>
-    </w:p>
-    <w:p>
-      <w:pPr>
-        <w:pStyle w:val="11"/>
-        <w:ind w:left="360"/>
-        <w:tabs>
-          <w:tab w:val="right" w:leader="dot" w:pos="9026"/>
-        </w:tabs>
-        <w:spacing w:before="120" w:after="60"/>
-      </w:pPr>
-      <w:hyperlink w:anchor="_Toc100018" w:history="1">
-        <w:r>
-          <w:rPr>
-            <w:rStyle w:val="Hyperlink"/>
-          </w:rPr>
-          <w:t>5.1 主干统一对比与选型</w:t>
-        </w:r>
-        <w:r>
-          <w:tab/>
-        </w:r>
-        <w:r>
-          <w:fldChar w:fldCharType="begin"/>
-        </w:r>
-        <w:r>
-          <w:instrText xml:space="preserve"> PAGEREF _Toc100018 \h </w:instrText>
-        </w:r>
-        <w:r>
-          <w:fldChar w:fldCharType="separate"/>
-        </w:r>
-        <w:r>
-          <w:t>8</w:t>
-        </w:r>
-        <w:r>
-          <w:fldChar w:fldCharType="end"/>
-        </w:r>
-      </w:hyperlink>
-    </w:p>
-    <w:p>
-      <w:pPr>
-        <w:pStyle w:val="11"/>
-        <w:ind w:left="360"/>
-        <w:tabs>
-          <w:tab w:val="right" w:leader="dot" w:pos="9026"/>
-        </w:tabs>
-        <w:spacing w:before="120" w:after="60"/>
-      </w:pPr>
-      <w:hyperlink w:anchor="_Toc100019" w:history="1">
-        <w:r>
-          <w:rPr>
-            <w:rStyle w:val="Hyperlink"/>
-          </w:rPr>
-          <w:t>5.2 E1f 四成员概率级融合</w:t>
-        </w:r>
-        <w:r>
-          <w:tab/>
-        </w:r>
-        <w:r>
-          <w:fldChar w:fldCharType="begin"/>
-        </w:r>
-        <w:r>
-          <w:instrText xml:space="preserve"> PAGEREF _Toc100019 \h </w:instrText>
-        </w:r>
-        <w:r>
-          <w:fldChar w:fldCharType="separate"/>
-        </w:r>
-        <w:r>
-          <w:t>8</w:t>
-        </w:r>
-        <w:r>
-          <w:fldChar w:fldCharType="end"/>
-        </w:r>
-      </w:hyperlink>
-    </w:p>
-    <w:p>
-      <w:pPr>
-        <w:pStyle w:val="11"/>
-        <w:ind w:left="360"/>
-        <w:tabs>
-          <w:tab w:val="right" w:leader="dot" w:pos="9026"/>
-        </w:tabs>
-        <w:spacing w:before="120" w:after="60"/>
-      </w:pPr>
-      <w:hyperlink w:anchor="_Toc100020" w:history="1">
-        <w:r>
-          <w:rPr>
-            <w:rStyle w:val="Hyperlink"/>
-          </w:rPr>
-          <w:t>5.3 读出层（因果平滑 + 多数票，冻结 F5）</w:t>
-        </w:r>
-        <w:r>
-          <w:tab/>
-        </w:r>
-        <w:r>
-          <w:fldChar w:fldCharType="begin"/>
-        </w:r>
-        <w:r>
-          <w:instrText xml:space="preserve"> PAGEREF _Toc100020 \h </w:instrText>
-        </w:r>
-        <w:r>
-          <w:fldChar w:fldCharType="separate"/>
-        </w:r>
-        <w:r>
-          <w:t>8</w:t>
-        </w:r>
-        <w:r>
-          <w:fldChar w:fldCharType="end"/>
-        </w:r>
-      </w:hyperlink>
-    </w:p>
-    <w:p>
-      <w:pPr>
-        <w:pStyle w:val="9"/>
-        <w:tabs>
-          <w:tab w:val="right" w:leader="dot" w:pos="9026"/>
-        </w:tabs>
-        <w:spacing w:before="120" w:after="60"/>
-      </w:pPr>
-      <w:hyperlink w:anchor="_Toc100021" w:history="1">
-        <w:r>
-          <w:rPr>
-            <w:rStyle w:val="Hyperlink"/>
-          </w:rPr>
-          <w:t>6. 异步交互协议（控制状态/空闲状态判别）</w:t>
-        </w:r>
-        <w:r>
-          <w:tab/>
-        </w:r>
-        <w:r>
-          <w:fldChar w:fldCharType="begin"/>
-        </w:r>
-        <w:r>
-          <w:instrText xml:space="preserve"> PAGEREF _Toc100021 \h </w:instrText>
-        </w:r>
-        <w:r>
-          <w:fldChar w:fldCharType="separate"/>
-        </w:r>
-        <w:r>
-          <w:t>9</w:t>
-        </w:r>
-        <w:r>
-          <w:fldChar w:fldCharType="end"/>
-        </w:r>
-      </w:hyperlink>
-    </w:p>
-    <w:p>
-      <w:pPr>
-        <w:pStyle w:val="11"/>
-        <w:ind w:left="360"/>
-        <w:tabs>
-          <w:tab w:val="right" w:leader="dot" w:pos="9026"/>
-        </w:tabs>
-        <w:spacing w:before="120" w:after="60"/>
-      </w:pPr>
-      <w:hyperlink w:anchor="_Toc100022" w:history="1">
-        <w:r>
-          <w:rPr>
-            <w:rStyle w:val="Hyperlink"/>
-          </w:rPr>
-          <w:t>6.1 状态判别机制</w:t>
-        </w:r>
-        <w:r>
-          <w:tab/>
-        </w:r>
-        <w:r>
-          <w:fldChar w:fldCharType="begin"/>
-        </w:r>
-        <w:r>
-          <w:instrText xml:space="preserve"> PAGEREF _Toc100022 \h </w:instrText>
-        </w:r>
-        <w:r>
-          <w:fldChar w:fldCharType="separate"/>
-        </w:r>
-        <w:r>
-          <w:t>9</w:t>
-        </w:r>
-        <w:r>
-          <w:fldChar w:fldCharType="end"/>
-        </w:r>
-      </w:hyperlink>
-    </w:p>
-    <w:p>
-      <w:pPr>
-        <w:pStyle w:val="11"/>
-        <w:ind w:left="360"/>
-        <w:tabs>
-          <w:tab w:val="right" w:leader="dot" w:pos="9026"/>
-        </w:tabs>
-        <w:spacing w:before="120" w:after="60"/>
-      </w:pPr>
-      <w:hyperlink w:anchor="_Toc100023" w:history="1">
-        <w:r>
-          <w:rPr>
-            <w:rStyle w:val="Hyperlink"/>
-          </w:rPr>
-          <w:t>6.2 判定时延</w:t>
-        </w:r>
-        <w:r>
-          <w:tab/>
-        </w:r>
-        <w:r>
-          <w:fldChar w:fldCharType="begin"/>
-        </w:r>
-        <w:r>
-          <w:instrText xml:space="preserve"> PAGEREF _Toc100023 \h </w:instrText>
-        </w:r>
-        <w:r>
-          <w:fldChar w:fldCharType="separate"/>
-        </w:r>
-        <w:r>
-          <w:t>10</w:t>
-        </w:r>
-        <w:r>
-          <w:fldChar w:fldCharType="end"/>
-        </w:r>
-      </w:hyperlink>
-    </w:p>
-    <w:p>
-      <w:pPr>
-        <w:pStyle w:val="9"/>
-        <w:tabs>
-          <w:tab w:val="right" w:leader="dot" w:pos="9026"/>
-        </w:tabs>
-        <w:spacing w:before="120" w:after="60"/>
-      </w:pPr>
-      <w:hyperlink w:anchor="_Toc100024" w:history="1">
-        <w:r>
-          <w:rPr>
-            <w:rStyle w:val="Hyperlink"/>
-          </w:rPr>
-          <w:t>7. 少样本个性化适配</w:t>
-        </w:r>
-        <w:r>
-          <w:tab/>
-        </w:r>
-        <w:r>
-          <w:fldChar w:fldCharType="begin"/>
-        </w:r>
-        <w:r>
-          <w:instrText xml:space="preserve"> PAGEREF _Toc100024 \h </w:instrText>
-        </w:r>
-        <w:r>
-          <w:fldChar w:fldCharType="separate"/>
-        </w:r>
-        <w:r>
-          <w:t>10</w:t>
-        </w:r>
-        <w:r>
-          <w:fldChar w:fldCharType="end"/>
-        </w:r>
-      </w:hyperlink>
-    </w:p>
-    <w:p>
-      <w:pPr>
-        <w:pStyle w:val="11"/>
-        <w:ind w:left="360"/>
-        <w:tabs>
-          <w:tab w:val="right" w:leader="dot" w:pos="9026"/>
-        </w:tabs>
-        <w:spacing w:before="120" w:after="60"/>
-      </w:pPr>
-      <w:hyperlink w:anchor="_Toc100025" w:history="1">
-        <w:r>
-          <w:rPr>
-            <w:rStyle w:val="Hyperlink"/>
-          </w:rPr>
-          <w:t>7.1 采后 Leave-Next 增量微调</w:t>
-        </w:r>
-        <w:r>
-          <w:tab/>
-        </w:r>
-        <w:r>
-          <w:fldChar w:fldCharType="begin"/>
-        </w:r>
-        <w:r>
-          <w:instrText xml:space="preserve"> PAGEREF _Toc100025 \h </w:instrText>
-        </w:r>
-        <w:r>
-          <w:fldChar w:fldCharType="separate"/>
-        </w:r>
-        <w:r>
-          <w:t>10</w:t>
-        </w:r>
-        <w:r>
-          <w:fldChar w:fldCharType="end"/>
-        </w:r>
-      </w:hyperlink>
-    </w:p>
-    <w:p>
-      <w:pPr>
-        <w:pStyle w:val="11"/>
-        <w:ind w:left="360"/>
-        <w:tabs>
-          <w:tab w:val="right" w:leader="dot" w:pos="9026"/>
-        </w:tabs>
-        <w:spacing w:before="120" w:after="60"/>
-      </w:pPr>
-      <w:hyperlink w:anchor="_Toc100026" w:history="1">
-        <w:r>
-          <w:rPr>
-            <w:rStyle w:val="Hyperlink"/>
-          </w:rPr>
-          <w:t>7.2 适配有效性证据链</w:t>
-        </w:r>
-        <w:r>
-          <w:tab/>
-        </w:r>
-        <w:r>
-          <w:fldChar w:fldCharType="begin"/>
-        </w:r>
-        <w:r>
-          <w:instrText xml:space="preserve"> PAGEREF _Toc100026 \h </w:instrText>
-        </w:r>
-        <w:r>
-          <w:fldChar w:fldCharType="separate"/>
-        </w:r>
-        <w:r>
-          <w:t>11</w:t>
-        </w:r>
-        <w:r>
-          <w:fldChar w:fldCharType="end"/>
-        </w:r>
-      </w:hyperlink>
-    </w:p>
-    <w:p>
-      <w:pPr>
-        <w:pStyle w:val="11"/>
-        <w:ind w:left="360"/>
-        <w:tabs>
-          <w:tab w:val="right" w:leader="dot" w:pos="9026"/>
-        </w:tabs>
-        <w:spacing w:before="120" w:after="60"/>
-      </w:pPr>
-      <w:hyperlink w:anchor="_Toc100027" w:history="1">
-        <w:r>
-          <w:rPr>
-            <w:rStyle w:val="Hyperlink"/>
-          </w:rPr>
-          <w:t>7.3 漂移保护</w:t>
-        </w:r>
-        <w:r>
-          <w:tab/>
-        </w:r>
-        <w:r>
-          <w:fldChar w:fldCharType="begin"/>
-        </w:r>
-        <w:r>
-          <w:instrText xml:space="preserve"> PAGEREF _Toc100027 \h </w:instrText>
-        </w:r>
-        <w:r>
-          <w:fldChar w:fldCharType="separate"/>
-        </w:r>
-        <w:r>
-          <w:t>11</w:t>
-        </w:r>
-        <w:r>
-          <w:fldChar w:fldCharType="end"/>
-        </w:r>
-      </w:hyperlink>
-    </w:p>
-    <w:p>
-      <w:pPr>
-        <w:pStyle w:val="9"/>
-        <w:tabs>
-          <w:tab w:val="right" w:leader="dot" w:pos="9026"/>
-        </w:tabs>
-        <w:spacing w:before="120" w:after="60"/>
-      </w:pPr>
-      <w:hyperlink w:anchor="_Toc100028" w:history="1">
-        <w:r>
-          <w:rPr>
-            <w:rStyle w:val="Hyperlink"/>
-          </w:rPr>
-          <w:t>8. 网页游戏诱导系统</w:t>
-        </w:r>
-        <w:r>
-          <w:tab/>
-        </w:r>
-        <w:r>
-          <w:fldChar w:fldCharType="begin"/>
-        </w:r>
-        <w:r>
-          <w:instrText xml:space="preserve"> PAGEREF _Toc100028 \h </w:instrText>
-        </w:r>
-        <w:r>
-          <w:fldChar w:fldCharType="separate"/>
-        </w:r>
-        <w:r>
-          <w:t>12</w:t>
-        </w:r>
-        <w:r>
-          <w:fldChar w:fldCharType="end"/>
-        </w:r>
-      </w:hyperlink>
-    </w:p>
-    <w:p>
-      <w:pPr>
-        <w:pStyle w:val="11"/>
-        <w:ind w:left="360"/>
-        <w:tabs>
-          <w:tab w:val="right" w:leader="dot" w:pos="9026"/>
-        </w:tabs>
-        <w:spacing w:before="120" w:after="60"/>
-      </w:pPr>
-      <w:hyperlink w:anchor="_Toc100029" w:history="1">
-        <w:r>
-          <w:rPr>
-            <w:rStyle w:val="Hyperlink"/>
-          </w:rPr>
-          <w:t>8.1 游戏化诱导</w:t>
-        </w:r>
-        <w:r>
-          <w:tab/>
-        </w:r>
-        <w:r>
-          <w:fldChar w:fldCharType="begin"/>
-        </w:r>
-        <w:r>
-          <w:instrText xml:space="preserve"> PAGEREF _Toc100029 \h </w:instrText>
-        </w:r>
-        <w:r>
-          <w:fldChar w:fldCharType="separate"/>
-        </w:r>
-        <w:r>
-          <w:t>12</w:t>
-        </w:r>
-        <w:r>
-          <w:fldChar w:fldCharType="end"/>
-        </w:r>
-      </w:hyperlink>
-    </w:p>
-    <w:p>
-      <w:pPr>
-        <w:pStyle w:val="11"/>
-        <w:ind w:left="360"/>
-        <w:tabs>
-          <w:tab w:val="right" w:leader="dot" w:pos="9026"/>
-        </w:tabs>
-        <w:spacing w:before="120" w:after="60"/>
-      </w:pPr>
-      <w:hyperlink w:anchor="_Toc100030" w:history="1">
-        <w:r>
-          <w:rPr>
-            <w:rStyle w:val="Hyperlink"/>
-          </w:rPr>
-          <w:t>8.2 操作台</w:t>
-        </w:r>
-        <w:r>
-          <w:tab/>
-        </w:r>
-        <w:r>
-          <w:fldChar w:fldCharType="begin"/>
-        </w:r>
-        <w:r>
-          <w:instrText xml:space="preserve"> PAGEREF _Toc100030 \h </w:instrText>
-        </w:r>
-        <w:r>
-          <w:fldChar w:fldCharType="separate"/>
-        </w:r>
-        <w:r>
-          <w:t>12</w:t>
-        </w:r>
-        <w:r>
-          <w:fldChar w:fldCharType="end"/>
-        </w:r>
-      </w:hyperlink>
-    </w:p>
-    <w:p>
-      <w:pPr>
-        <w:pStyle w:val="11"/>
-        <w:ind w:left="360"/>
-        <w:tabs>
-          <w:tab w:val="right" w:leader="dot" w:pos="9026"/>
-        </w:tabs>
-        <w:spacing w:before="120" w:after="60"/>
-      </w:pPr>
-      <w:hyperlink w:anchor="_Toc100031" w:history="1">
-        <w:r>
-          <w:rPr>
-            <w:rStyle w:val="Hyperlink"/>
-          </w:rPr>
-          <w:t>8.3 工程与安全</w:t>
-        </w:r>
-        <w:r>
-          <w:tab/>
-        </w:r>
-        <w:r>
-          <w:fldChar w:fldCharType="begin"/>
-        </w:r>
-        <w:r>
-          <w:instrText xml:space="preserve"> PAGEREF _Toc100031 \h </w:instrText>
-        </w:r>
-        <w:r>
-          <w:fldChar w:fldCharType="separate"/>
-        </w:r>
-        <w:r>
-          <w:t>12</w:t>
-        </w:r>
-        <w:r>
-          <w:fldChar w:fldCharType="end"/>
-        </w:r>
-      </w:hyperlink>
-    </w:p>
-    <w:p>
-      <w:pPr>
-        <w:pStyle w:val="9"/>
-        <w:tabs>
-          <w:tab w:val="right" w:leader="dot" w:pos="9026"/>
-        </w:tabs>
-        <w:spacing w:before="120" w:after="60"/>
-      </w:pPr>
-      <w:hyperlink w:anchor="_Toc100032" w:history="1">
-        <w:r>
-          <w:rPr>
-            <w:rStyle w:val="Hyperlink"/>
-          </w:rPr>
-          <w:t>9. 离线实验验证</w:t>
-        </w:r>
-        <w:r>
-          <w:tab/>
-        </w:r>
-        <w:r>
-          <w:fldChar w:fldCharType="begin"/>
-        </w:r>
-        <w:r>
-          <w:instrText xml:space="preserve"> PAGEREF _Toc100032 \h </w:instrText>
-        </w:r>
-        <w:r>
-          <w:fldChar w:fldCharType="separate"/>
-        </w:r>
-        <w:r>
-          <w:t>12</w:t>
-        </w:r>
-        <w:r>
-          <w:fldChar w:fldCharType="end"/>
-        </w:r>
-      </w:hyperlink>
-    </w:p>
-    <w:p>
-      <w:pPr>
-        <w:pStyle w:val="11"/>
-        <w:ind w:left="360"/>
-        <w:tabs>
-          <w:tab w:val="right" w:leader="dot" w:pos="9026"/>
-        </w:tabs>
-        <w:spacing w:before="120" w:after="60"/>
-      </w:pPr>
-      <w:hyperlink w:anchor="_Toc100033" w:history="1">
-        <w:r>
-          <w:rPr>
-            <w:rStyle w:val="Hyperlink"/>
-          </w:rPr>
-          <w:t>9.1 OpenBMI 主结果（54 人五折，三分类）</w:t>
-        </w:r>
-        <w:r>
-          <w:tab/>
-        </w:r>
-        <w:r>
-          <w:fldChar w:fldCharType="begin"/>
-        </w:r>
-        <w:r>
-          <w:instrText xml:space="preserve"> PAGEREF _Toc100033 \h </w:instrText>
-        </w:r>
-        <w:r>
-          <w:fldChar w:fldCharType="separate"/>
-        </w:r>
-        <w:r>
-          <w:t>13</w:t>
-        </w:r>
-        <w:r>
-          <w:fldChar w:fldCharType="end"/>
-        </w:r>
-      </w:hyperlink>
-    </w:p>
-    <w:p>
-      <w:pPr>
-        <w:pStyle w:val="11"/>
-        <w:ind w:left="360"/>
-        <w:tabs>
-          <w:tab w:val="right" w:leader="dot" w:pos="9026"/>
-        </w:tabs>
-        <w:spacing w:before="120" w:after="60"/>
-      </w:pPr>
-      <w:hyperlink w:anchor="_Toc100034" w:history="1">
-        <w:r>
-          <w:rPr>
-            <w:rStyle w:val="Hyperlink"/>
-          </w:rPr>
-          <w:t>9.2 基线与消融</w:t>
-        </w:r>
-        <w:r>
-          <w:tab/>
-        </w:r>
-        <w:r>
-          <w:fldChar w:fldCharType="begin"/>
-        </w:r>
-        <w:r>
-          <w:instrText xml:space="preserve"> PAGEREF _Toc100034 \h </w:instrText>
-        </w:r>
-        <w:r>
-          <w:fldChar w:fldCharType="separate"/>
-        </w:r>
-        <w:r>
-          <w:t>13</w:t>
-        </w:r>
-        <w:r>
-          <w:fldChar w:fldCharType="end"/>
-        </w:r>
-      </w:hyperlink>
-    </w:p>
-    <w:p>
-      <w:pPr>
-        <w:pStyle w:val="11"/>
-        <w:ind w:left="360"/>
-        <w:tabs>
-          <w:tab w:val="right" w:leader="dot" w:pos="9026"/>
-        </w:tabs>
-        <w:spacing w:before="120" w:after="60"/>
-      </w:pPr>
-      <w:hyperlink w:anchor="_Toc100035" w:history="1">
-        <w:r>
-          <w:rPr>
-            <w:rStyle w:val="Hyperlink"/>
-          </w:rPr>
-          <w:t>9.3 BCI2a Leave-Next 仿真</w:t>
-        </w:r>
-        <w:r>
-          <w:tab/>
-        </w:r>
-        <w:r>
-          <w:fldChar w:fldCharType="begin"/>
-        </w:r>
-        <w:r>
-          <w:instrText xml:space="preserve"> PAGEREF _Toc100035 \h </w:instrText>
-        </w:r>
-        <w:r>
-          <w:fldChar w:fldCharType="separate"/>
-        </w:r>
-        <w:r>
-          <w:t>14</w:t>
-        </w:r>
-        <w:r>
-          <w:fldChar w:fldCharType="end"/>
-        </w:r>
-      </w:hyperlink>
-    </w:p>
-    <w:p>
-      <w:pPr>
-        <w:pStyle w:val="11"/>
-        <w:ind w:left="360"/>
-        <w:tabs>
-          <w:tab w:val="right" w:leader="dot" w:pos="9026"/>
-        </w:tabs>
-        <w:spacing w:before="120" w:after="60"/>
-      </w:pPr>
-      <w:hyperlink w:anchor="_Toc100036" w:history="1">
-        <w:r>
-          <w:rPr>
-            <w:rStyle w:val="Hyperlink"/>
-          </w:rPr>
-          <w:t>9.4 Stieger 跨库伪在线</w:t>
-        </w:r>
-        <w:r>
-          <w:tab/>
-        </w:r>
-        <w:r>
-          <w:fldChar w:fldCharType="begin"/>
-        </w:r>
-        <w:r>
-          <w:instrText xml:space="preserve"> PAGEREF _Toc100036 \h </w:instrText>
-        </w:r>
-        <w:r>
-          <w:fldChar w:fldCharType="separate"/>
-        </w:r>
-        <w:r>
-          <w:t>14</w:t>
-        </w:r>
-        <w:r>
-          <w:fldChar w:fldCharType="end"/>
-        </w:r>
-      </w:hyperlink>
-    </w:p>
-    <w:p>
-      <w:pPr>
-        <w:pStyle w:val="11"/>
-        <w:ind w:left="360"/>
-        <w:tabs>
-          <w:tab w:val="right" w:leader="dot" w:pos="9026"/>
-        </w:tabs>
-        <w:spacing w:before="120" w:after="60"/>
-      </w:pPr>
-      <w:hyperlink w:anchor="_Toc100037" w:history="1">
-        <w:r>
-          <w:rPr>
-            <w:rStyle w:val="Hyperlink"/>
-          </w:rPr>
-          <w:t>9.5 真实被试验证</w:t>
-        </w:r>
-        <w:r>
-          <w:tab/>
-        </w:r>
-        <w:r>
-          <w:fldChar w:fldCharType="begin"/>
-        </w:r>
-        <w:r>
-          <w:instrText xml:space="preserve"> PAGEREF _Toc100037 \h </w:instrText>
-        </w:r>
-        <w:r>
-          <w:fldChar w:fldCharType="separate"/>
-        </w:r>
-        <w:r>
-          <w:t>14</w:t>
-        </w:r>
-        <w:r>
-          <w:fldChar w:fldCharType="end"/>
-        </w:r>
-      </w:hyperlink>
-    </w:p>
-    <w:p>
-      <w:pPr>
-        <w:pStyle w:val="11"/>
-        <w:ind w:left="360"/>
-        <w:tabs>
-          <w:tab w:val="right" w:leader="dot" w:pos="9026"/>
-        </w:tabs>
-        <w:spacing w:before="120" w:after="60"/>
-      </w:pPr>
-      <w:hyperlink w:anchor="_Toc100038" w:history="1">
-        <w:r>
-          <w:rPr>
-            <w:rStyle w:val="Hyperlink"/>
-          </w:rPr>
-          <w:t>9.6 运算延迟</w:t>
-        </w:r>
-        <w:r>
-          <w:tab/>
-        </w:r>
-        <w:r>
-          <w:fldChar w:fldCharType="begin"/>
-        </w:r>
-        <w:r>
-          <w:instrText xml:space="preserve"> PAGEREF _Toc100038 \h </w:instrText>
-        </w:r>
-        <w:r>
-          <w:fldChar w:fldCharType="separate"/>
-        </w:r>
-        <w:r>
-          <w:t>14</w:t>
-        </w:r>
-        <w:r>
-          <w:fldChar w:fldCharType="end"/>
-        </w:r>
-      </w:hyperlink>
-    </w:p>
-    <w:p>
-      <w:pPr>
-        <w:pStyle w:val="9"/>
-        <w:tabs>
-          <w:tab w:val="right" w:leader="dot" w:pos="9026"/>
-        </w:tabs>
-        <w:spacing w:before="120" w:after="60"/>
-      </w:pPr>
-      <w:hyperlink w:anchor="_Toc100039" w:history="1">
-        <w:r>
-          <w:rPr>
-            <w:rStyle w:val="Hyperlink"/>
-          </w:rPr>
-          <w:t>10. 在线系统集成与演示</w:t>
-        </w:r>
-        <w:r>
-          <w:tab/>
-        </w:r>
-        <w:r>
-          <w:fldChar w:fldCharType="begin"/>
-        </w:r>
-        <w:r>
-          <w:instrText xml:space="preserve"> PAGEREF _Toc100039 \h </w:instrText>
-        </w:r>
-        <w:r>
-          <w:fldChar w:fldCharType="separate"/>
-        </w:r>
-        <w:r>
-          <w:t>15</w:t>
-        </w:r>
-        <w:r>
-          <w:fldChar w:fldCharType="end"/>
-        </w:r>
-      </w:hyperlink>
-    </w:p>
-    <w:p>
-      <w:pPr>
-        <w:pStyle w:val="9"/>
-        <w:tabs>
-          <w:tab w:val="right" w:leader="dot" w:pos="9026"/>
-        </w:tabs>
-        <w:spacing w:before="120" w:after="60"/>
-      </w:pPr>
-      <w:hyperlink w:anchor="_Toc100040" w:history="1">
-        <w:r>
-          <w:rPr>
-            <w:rStyle w:val="Hyperlink"/>
-          </w:rPr>
-          <w:t>11. 可复现性与提交材料索引</w:t>
-        </w:r>
-        <w:r>
-          <w:tab/>
-        </w:r>
-        <w:r>
-          <w:fldChar w:fldCharType="begin"/>
-        </w:r>
-        <w:r>
-          <w:instrText xml:space="preserve"> PAGEREF _Toc100040 \h </w:instrText>
-        </w:r>
-        <w:r>
-          <w:fldChar w:fldCharType="separate"/>
-        </w:r>
-        <w:r>
-          <w:t>15</w:t>
-        </w:r>
-        <w:r>
-          <w:fldChar w:fldCharType="end"/>
-        </w:r>
-      </w:hyperlink>
-    </w:p>
-    <w:p>
-      <w:pPr>
-        <w:pStyle w:val="9"/>
-        <w:tabs>
-          <w:tab w:val="right" w:leader="dot" w:pos="9026"/>
-        </w:tabs>
-        <w:spacing w:before="120" w:after="60"/>
-      </w:pPr>
-      <w:hyperlink w:anchor="_Toc100041" w:history="1">
-        <w:r>
-          <w:rPr>
-            <w:rStyle w:val="Hyperlink"/>
-          </w:rPr>
-          <w:t>12. 结论与展望</w:t>
-        </w:r>
-        <w:r>
-          <w:tab/>
-        </w:r>
-        <w:r>
-          <w:fldChar w:fldCharType="begin"/>
-        </w:r>
-        <w:r>
-          <w:instrText xml:space="preserve"> PAGEREF _Toc100041 \h </w:instrText>
-        </w:r>
-        <w:r>
-          <w:fldChar w:fldCharType="separate"/>
-        </w:r>
-        <w:r>
-          <w:t>16</w:t>
-        </w:r>
-        <w:r>
-          <w:fldChar w:fldCharType="end"/>
-        </w:r>
-      </w:hyperlink>
-    </w:p>
-    <w:p>
-      <w:pPr>
-        <w:pStyle w:val="9"/>
-        <w:tabs>
-          <w:tab w:val="right" w:leader="dot" w:pos="9026"/>
-        </w:tabs>
-        <w:spacing w:before="120" w:after="60"/>
-      </w:pPr>
-      <w:hyperlink w:anchor="_Toc100042" w:history="1">
-        <w:r>
-          <w:rPr>
-            <w:rStyle w:val="Hyperlink"/>
-          </w:rPr>
-          <w:t>参考文献</w:t>
-        </w:r>
-        <w:r>
-          <w:tab/>
-        </w:r>
-        <w:r>
-          <w:fldChar w:fldCharType="begin"/>
-        </w:r>
-        <w:r>
-          <w:instrText xml:space="preserve"> PAGEREF _Toc100042 \h </w:instrText>
-        </w:r>
-        <w:r>
-          <w:fldChar w:fldCharType="separate"/>
-        </w:r>
-        <w:r>
-          <w:t>16</w:t>
-        </w:r>
-        <w:r>
-          <w:fldChar w:fldCharType="end"/>
-        </w:r>
-      </w:hyperlink>
-    </w:p>
-    <w:p>
-      <w:pPr>
-        <w:pStyle w:val="9"/>
-        <w:tabs>
-          <w:tab w:val="right" w:leader="dot" w:pos="9026"/>
-        </w:tabs>
-        <w:spacing w:before="120" w:after="60"/>
-      </w:pPr>
-      <w:hyperlink w:anchor="_Toc100043" w:history="1">
-        <w:r>
-          <w:rPr>
-            <w:rStyle w:val="Hyperlink"/>
-          </w:rPr>
-          <w:t>附录 A · 系统常量表（冻结）</w:t>
-        </w:r>
-        <w:r>
-          <w:tab/>
-        </w:r>
-        <w:r>
-          <w:fldChar w:fldCharType="begin"/>
-        </w:r>
-        <w:r>
-          <w:instrText xml:space="preserve"> PAGEREF _Toc100043 \h </w:instrText>
-        </w:r>
-        <w:r>
-          <w:fldChar w:fldCharType="separate"/>
-        </w:r>
-        <w:r>
-          <w:t>18</w:t>
-        </w:r>
-        <w:r>
-          <w:fldChar w:fldCharType="end"/>
-        </w:r>
-      </w:hyperlink>
-    </w:p>
-    <w:p>
-      <w:pPr>
-        <w:pStyle w:val="9"/>
-        <w:tabs>
-          <w:tab w:val="right" w:leader="dot" w:pos="9026"/>
-        </w:tabs>
-        <w:spacing w:before="120" w:after="60"/>
-      </w:pPr>
-      <w:hyperlink w:anchor="_Toc100044" w:history="1">
-        <w:r>
-          <w:rPr>
-            <w:rStyle w:val="Hyperlink"/>
-          </w:rPr>
-          <w:t>附录 B · 与赛题要求对照</w:t>
-        </w:r>
-        <w:r>
-          <w:tab/>
-        </w:r>
-        <w:r>
-          <w:fldChar w:fldCharType="begin"/>
-        </w:r>
-        <w:r>
-          <w:instrText xml:space="preserve"> PAGEREF _Toc100044 \h </w:instrText>
-        </w:r>
-        <w:r>
-          <w:fldChar w:fldCharType="separate"/>
-        </w:r>
-        <w:r>
-          <w:t>18</w:t>
-        </w:r>
-        <w:r>
-          <w:fldChar w:fldCharType="end"/>
-        </w:r>
-      </w:hyperlink>
-    </w:p>
-    <w:p>
       <w:r>
         <w:fldChar w:fldCharType="begin" w:dirty="true"/>
       </w:r>
@@ -1837,7 +374,6 @@
         <w:spacing w:line="312" w:lineRule="auto" w:before="280" w:after="160"/>
         <w:jc w:val="center"/>
       </w:pPr>
-      <w:bookmarkStart w:id="100001" w:name="_Toc100001"/>
       <w:r>
         <w:rPr>
           <w:rFonts w:ascii="Times New Roman" w:hAnsi="Times New Roman" w:eastAsia="黑体"/>
@@ -1847,14 +383,12 @@
         </w:rPr>
         <w:t>1. 引言</w:t>
       </w:r>
-      <w:bookmarkEnd w:id="100001"/>
     </w:p>
     <w:p>
       <w:pPr>
         <w:pStyle w:val="Heading2"/>
         <w:spacing w:line="312" w:lineRule="auto" w:before="200" w:after="160"/>
       </w:pPr>
-      <w:bookmarkStart w:id="100002" w:name="_Toc100002"/>
       <w:r>
         <w:rPr>
           <w:rFonts w:ascii="Times New Roman" w:hAnsi="Times New Roman" w:eastAsia="黑体"/>
@@ -1864,7 +398,6 @@
         </w:rPr>
         <w:t>1.1 应用背景与核心技术瓶颈</w:t>
       </w:r>
-      <w:bookmarkEnd w:id="100002"/>
     </w:p>
     <w:p>
       <w:pPr>
@@ -1903,7 +436,6 @@
         <w:pStyle w:val="Heading2"/>
         <w:spacing w:line="312" w:lineRule="auto" w:before="200" w:after="160"/>
       </w:pPr>
-      <w:bookmarkStart w:id="100003" w:name="_Toc100003"/>
       <w:r>
         <w:rPr>
           <w:rFonts w:ascii="Times New Roman" w:hAnsi="Times New Roman" w:eastAsia="黑体"/>
@@ -1913,7 +445,6 @@
         </w:rPr>
         <w:t>1.2 赛题需求对接与本文贡献</w:t>
       </w:r>
-      <w:bookmarkEnd w:id="100003"/>
     </w:p>
     <w:p>
       <w:pPr>
@@ -2103,11 +634,80 @@
     </w:p>
     <w:p>
       <w:pPr>
+        <w:spacing w:line="312" w:lineRule="auto" w:before="0" w:after="120"/>
+        <w:ind w:left="480"/>
+        <w:jc w:val="both"/>
+      </w:pPr>
+      <w:r>
+        <w:rPr>
+          <w:rFonts w:ascii="Times New Roman" w:hAnsi="Times New Roman" w:eastAsia="宋体"/>
+          <w:b/>
+          <w:color w:val="000000"/>
+          <w:sz w:val="24"/>
+        </w:rPr>
+        <w:t>指定集嵌套协议与交卷定稿</w:t>
+      </w:r>
+      <w:r>
+        <w:rPr>
+          <w:rFonts w:ascii="Times New Roman" w:hAnsi="Times New Roman" w:eastAsia="宋体"/>
+          <w:b w:val="0"/>
+          <w:color w:val="000000"/>
+          <w:sz w:val="24"/>
+        </w:rPr>
+        <w:t xml:space="preserve">：在主办方指定集上完成 Exp34–40；交卷为从零栈 </w:t>
+      </w:r>
+      <w:r>
+        <w:rPr>
+          <w:rFonts w:ascii="Times New Roman" w:hAnsi="Times New Roman" w:eastAsia="宋体"/>
+          <w:b/>
+          <w:color w:val="000000"/>
+          <w:sz w:val="24"/>
+        </w:rPr>
+        <w:t>S0</w:t>
+      </w:r>
+      <w:r>
+        <w:rPr>
+          <w:rFonts w:ascii="Times New Roman" w:hAnsi="Times New Roman" w:eastAsia="宋体"/>
+          <w:b w:val="0"/>
+          <w:color w:val="000000"/>
+          <w:sz w:val="24"/>
+        </w:rPr>
+        <w:t xml:space="preserve">（嵌套 0.511 / 折内 0.558 双标注），并量化折内融合乐观约 </w:t>
+      </w:r>
+      <w:r>
+        <w:rPr>
+          <w:rFonts w:ascii="Times New Roman" w:hAnsi="Times New Roman" w:eastAsia="宋体"/>
+          <w:b/>
+          <w:color w:val="000000"/>
+          <w:sz w:val="24"/>
+        </w:rPr>
+        <w:t>+4.7pp</w:t>
+      </w:r>
+      <w:r>
+        <w:rPr>
+          <w:rFonts w:ascii="Times New Roman" w:hAnsi="Times New Roman" w:eastAsia="宋体"/>
+          <w:b w:val="0"/>
+          <w:color w:val="000000"/>
+          <w:sz w:val="24"/>
+        </w:rPr>
+        <w:t>；备选 R-B8=0.540 因外推风险否决并归档（§9.7）。</w:t>
+      </w:r>
+      <w:r>
+        <w:rPr>
+          <w:rFonts w:ascii="Times New Roman" w:hAnsi="Times New Roman" w:eastAsia="宋体"/>
+          <w:b w:val="0"/>
+          <w:color w:val="000000"/>
+          <w:sz w:val="24"/>
+        </w:rPr>
+        <w:t xml:space="preserve">· </w:t>
+      </w:r>
+    </w:p>
+    <w:p>
+      <w:pPr>
         <w:pStyle w:val="Heading1"/>
         <w:spacing w:line="312" w:lineRule="auto" w:before="280" w:after="160"/>
         <w:jc w:val="center"/>
       </w:pPr>
-      <w:bookmarkStart w:id="100004" w:name="_Toc100004"/>
       <w:r>
         <w:rPr>
           <w:rFonts w:ascii="Times New Roman" w:hAnsi="Times New Roman" w:eastAsia="黑体"/>
@@ -2117,14 +717,12 @@
         </w:rPr>
         <w:t>2. 系统总体设计</w:t>
       </w:r>
-      <w:bookmarkEnd w:id="100004"/>
     </w:p>
     <w:p>
       <w:pPr>
         <w:pStyle w:val="Heading2"/>
         <w:spacing w:line="312" w:lineRule="auto" w:before="200" w:after="160"/>
       </w:pPr>
-      <w:bookmarkStart w:id="100005" w:name="_Toc100005"/>
       <w:r>
         <w:rPr>
           <w:rFonts w:ascii="Times New Roman" w:hAnsi="Times New Roman" w:eastAsia="黑体"/>
@@ -2134,7 +732,6 @@
         </w:rPr>
         <w:t>2.1 三级优化框架</w:t>
       </w:r>
-      <w:bookmarkEnd w:id="100005"/>
     </w:p>
     <w:p>
       <w:pPr>
@@ -2232,7 +829,6 @@
         <w:pStyle w:val="Heading2"/>
         <w:spacing w:line="312" w:lineRule="auto" w:before="200" w:after="160"/>
       </w:pPr>
-      <w:bookmarkStart w:id="100006" w:name="_Toc100006"/>
       <w:r>
         <w:rPr>
           <w:rFonts w:ascii="Times New Roman" w:hAnsi="Times New Roman" w:eastAsia="黑体"/>
@@ -2242,7 +838,6 @@
         </w:rPr>
         <w:t>2.2 系统运行链路</w:t>
       </w:r>
-      <w:bookmarkEnd w:id="100006"/>
     </w:p>
     <w:p>
       <w:pPr>
@@ -2316,7 +911,6 @@
         <w:pStyle w:val="Heading2"/>
         <w:spacing w:line="312" w:lineRule="auto" w:before="200" w:after="160"/>
       </w:pPr>
-      <w:bookmarkStart w:id="100007" w:name="_Toc100007"/>
       <w:r>
         <w:rPr>
           <w:rFonts w:ascii="Times New Roman" w:hAnsi="Times New Roman" w:eastAsia="黑体"/>
@@ -2326,7 +920,6 @@
         </w:rPr>
         <w:t>2.3 关键设计原则</w:t>
       </w:r>
-      <w:bookmarkEnd w:id="100007"/>
     </w:p>
     <w:p>
       <w:pPr>
@@ -2472,7 +1065,6 @@
         <w:spacing w:line="312" w:lineRule="auto" w:before="280" w:after="160"/>
         <w:jc w:val="center"/>
       </w:pPr>
-      <w:bookmarkStart w:id="100008" w:name="_Toc100008"/>
       <w:r>
         <w:rPr>
           <w:rFonts w:ascii="Times New Roman" w:hAnsi="Times New Roman" w:eastAsia="黑体"/>
@@ -2482,14 +1074,12 @@
         </w:rPr>
         <w:t>3. 脑电数据采集规范</w:t>
       </w:r>
-      <w:bookmarkEnd w:id="100008"/>
     </w:p>
     <w:p>
       <w:pPr>
         <w:pStyle w:val="Heading2"/>
         <w:spacing w:line="312" w:lineRule="auto" w:before="200" w:after="160"/>
       </w:pPr>
-      <w:bookmarkStart w:id="100009" w:name="_Toc100009"/>
       <w:r>
         <w:rPr>
           <w:rFonts w:ascii="Times New Roman" w:hAnsi="Times New Roman" w:eastAsia="黑体"/>
@@ -2499,7 +1089,6 @@
         </w:rPr>
         <w:t>3.1 采集设备与信号链</w:t>
       </w:r>
-      <w:bookmarkEnd w:id="100009"/>
     </w:p>
     <w:tbl>
       <w:tblPr>
@@ -2847,7 +1436,6 @@
         <w:pStyle w:val="Heading2"/>
         <w:spacing w:line="312" w:lineRule="auto" w:before="200" w:after="160"/>
       </w:pPr>
-      <w:bookmarkStart w:id="100010" w:name="_Toc100010"/>
       <w:r>
         <w:rPr>
           <w:rFonts w:ascii="Times New Roman" w:hAnsi="Times New Roman" w:eastAsia="黑体"/>
@@ -2857,7 +1445,6 @@
         </w:rPr>
         <w:t>3.2 实验范式（OpenBMI-Align v1，冻结口径）</w:t>
       </w:r>
-      <w:bookmarkEnd w:id="100010"/>
     </w:p>
     <w:p>
       <w:pPr>
@@ -3332,7 +1919,6 @@
         <w:pStyle w:val="Heading2"/>
         <w:spacing w:line="312" w:lineRule="auto" w:before="200" w:after="160"/>
       </w:pPr>
-      <w:bookmarkStart w:id="100011" w:name="_Toc100011"/>
       <w:r>
         <w:rPr>
           <w:rFonts w:ascii="Times New Roman" w:hAnsi="Times New Roman" w:eastAsia="黑体"/>
@@ -3342,7 +1928,6 @@
         </w:rPr>
         <w:t>3.3 数据落盘与质量控制</w:t>
       </w:r>
-      <w:bookmarkEnd w:id="100011"/>
     </w:p>
     <w:p>
       <w:pPr>
@@ -3483,7 +2068,79 @@
           <w:color w:val="000000"/>
           <w:sz w:val="24"/>
         </w:rPr>
-        <w:t xml:space="preserve"> 切分产物。采集链路内置健康监测（缓冲龄、信号质量、通道完整性），会话结束自动完成标记-脑电对齐校验（</w:t>
+        <w:t xml:space="preserve"> 切分产物。采集链路内置健康监测（缓冲龄、信号质量、通道完整性）与 </w:t>
+      </w:r>
+      <w:r>
+        <w:rPr>
+          <w:rFonts w:ascii="Times New Roman" w:hAnsi="Times New Roman" w:eastAsia="宋体"/>
+          <w:b/>
+          <w:color w:val="000000"/>
+          <w:sz w:val="24"/>
+        </w:rPr>
+        <w:t>EEG 断流看门狗</w:t>
+      </w:r>
+      <w:r>
+        <w:rPr>
+          <w:rFonts w:ascii="Times New Roman" w:hAnsi="Times New Roman" w:eastAsia="宋体"/>
+          <w:b w:val="0"/>
+          <w:color w:val="000000"/>
+          <w:sz w:val="24"/>
+        </w:rPr>
+        <w:t xml:space="preserve">（缓冲停滞告警 </w:t>
+      </w:r>
+      <w:r>
+        <w:rPr>
+          <w:rFonts w:ascii="Times New Roman" w:hAnsi="Times New Roman" w:eastAsia="宋体"/>
+          <w:b/>
+          <w:color w:val="000000"/>
+          <w:sz w:val="24"/>
+        </w:rPr>
+        <w:t>2 s</w:t>
+      </w:r>
+      <w:r>
+        <w:rPr>
+          <w:rFonts w:ascii="Times New Roman" w:hAnsi="Times New Roman" w:eastAsia="宋体"/>
+          <w:b w:val="0"/>
+          <w:color w:val="000000"/>
+          <w:sz w:val="24"/>
+        </w:rPr>
+        <w:t xml:space="preserve">、会话中止 </w:t>
+      </w:r>
+      <w:r>
+        <w:rPr>
+          <w:rFonts w:ascii="Times New Roman" w:hAnsi="Times New Roman" w:eastAsia="宋体"/>
+          <w:b/>
+          <w:color w:val="000000"/>
+          <w:sz w:val="24"/>
+        </w:rPr>
+        <w:t>5 s</w:t>
+      </w:r>
+      <w:r>
+        <w:rPr>
+          <w:rFonts w:ascii="Times New Roman" w:hAnsi="Times New Roman" w:eastAsia="宋体"/>
+          <w:b w:val="0"/>
+          <w:color w:val="000000"/>
+          <w:sz w:val="24"/>
+        </w:rPr>
+        <w:t xml:space="preserve">，配置于 </w:t>
+      </w:r>
+      <w:r>
+        <w:rPr>
+          <w:rFonts w:ascii="Consolas" w:hAnsi="Consolas" w:eastAsia="Consolas"/>
+          <w:b w:val="0"/>
+          <w:color w:val="000000"/>
+          <w:sz w:val="21"/>
+        </w:rPr>
+        <w:t>protocol.yaml</w:t>
+      </w:r>
+      <w:r>
+        <w:rPr>
+          <w:rFonts w:ascii="Times New Roman" w:hAnsi="Times New Roman" w:eastAsia="宋体"/>
+          <w:b w:val="0"/>
+          <w:color w:val="000000"/>
+          <w:sz w:val="24"/>
+        </w:rPr>
+        <w:t>），会话结束自动完成标记-脑电对齐校验（</w:t>
       </w:r>
       <w:r>
         <w:rPr>
@@ -3509,7 +2166,6 @@
         <w:pStyle w:val="Heading2"/>
         <w:spacing w:line="312" w:lineRule="auto" w:before="200" w:after="160"/>
       </w:pPr>
-      <w:bookmarkStart w:id="100012" w:name="_Toc100012"/>
       <w:r>
         <w:rPr>
           <w:rFonts w:ascii="Times New Roman" w:hAnsi="Times New Roman" w:eastAsia="黑体"/>
@@ -3519,7 +2175,6 @@
         </w:rPr>
         <w:t>3.4 数据集</w:t>
       </w:r>
-      <w:bookmarkEnd w:id="100012"/>
     </w:p>
     <w:tbl>
       <w:tblPr>
@@ -3819,6 +2474,98 @@
             <w:r>
               <w:rPr>
                 <w:rFonts w:ascii="Times New Roman" w:hAnsi="Times New Roman" w:eastAsia="宋体"/>
+                <w:b/>
+                <w:color w:val="000000"/>
+                <w:sz w:val="21"/>
+              </w:rPr>
+              <w:t>主办方指定标准数据集（Challenge MI）</w:t>
+            </w:r>
+          </w:p>
+        </w:tc>
+        <w:tc>
+          <w:tcPr>
+            <w:tcW w:type="dxa" w:w="2902"/>
+          </w:tcPr>
+          <w:p>
+            <w:pPr>
+              <w:spacing w:line="276" w:lineRule="auto"/>
+              <w:jc w:val="left"/>
+            </w:pPr>
+            <w:r>
+              <w:rPr>
+                <w:rFonts w:ascii="Times New Roman" w:hAnsi="Times New Roman" w:eastAsia="宋体"/>
+                <w:b w:val="0"/>
+                <w:color w:val="000000"/>
+                <w:sz w:val="21"/>
+              </w:rPr>
+              <w:t>6 被试 · LOSO6 · 1 trial=1×3s 窗</w:t>
+            </w:r>
+          </w:p>
+        </w:tc>
+        <w:tc>
+          <w:tcPr>
+            <w:tcW w:type="dxa" w:w="2902"/>
+          </w:tcPr>
+          <w:p>
+            <w:pPr>
+              <w:spacing w:line="276" w:lineRule="auto"/>
+              <w:jc w:val="left"/>
+            </w:pPr>
+            <w:r>
+              <w:rPr>
+                <w:rFonts w:ascii="Times New Roman" w:hAnsi="Times New Roman" w:eastAsia="宋体"/>
+                <w:b/>
+                <w:color w:val="000000"/>
+                <w:sz w:val="21"/>
+              </w:rPr>
+              <w:t>60 分项主体</w:t>
+            </w:r>
+            <w:r>
+              <w:rPr>
+                <w:rFonts w:ascii="Times New Roman" w:hAnsi="Times New Roman" w:eastAsia="宋体"/>
+                <w:b w:val="0"/>
+                <w:color w:val="000000"/>
+                <w:sz w:val="21"/>
+              </w:rPr>
+              <w:t>；</w:t>
+            </w:r>
+            <w:r>
+              <w:rPr>
+                <w:rFonts w:ascii="Times New Roman" w:hAnsi="Times New Roman" w:eastAsia="宋体"/>
+                <w:b/>
+                <w:color w:val="000000"/>
+                <w:sz w:val="21"/>
+              </w:rPr>
+              <w:t>交卷=59ch 从零 S0</w:t>
+            </w:r>
+            <w:r>
+              <w:rPr>
+                <w:rFonts w:ascii="Times New Roman" w:hAnsi="Times New Roman" w:eastAsia="宋体"/>
+                <w:b w:val="0"/>
+                <w:color w:val="000000"/>
+                <w:sz w:val="21"/>
+              </w:rPr>
+              <w:t>；OpenBMI→8ch FT 为已登记备选；详见 §9.7</w:t>
+            </w:r>
+          </w:p>
+        </w:tc>
+      </w:tr>
+      <w:tr>
+        <w:trPr>
+          <w:cantSplit/>
+        </w:trPr>
+        <w:tc>
+          <w:tcPr>
+            <w:tcW w:type="dxa" w:w="2902"/>
+          </w:tcPr>
+          <w:p>
+            <w:pPr>
+              <w:spacing w:line="276" w:lineRule="auto"/>
+              <w:jc w:val="left"/>
+            </w:pPr>
+            <w:r>
+              <w:rPr>
+                <w:rFonts w:ascii="Times New Roman" w:hAnsi="Times New Roman" w:eastAsia="宋体"/>
                 <w:b w:val="0"/>
                 <w:color w:val="000000"/>
                 <w:sz w:val="21"/>
@@ -3843,7 +2590,7 @@
                 <w:color w:val="000000"/>
                 <w:sz w:val="21"/>
               </w:rPr>
-              <w:t>截至 2026-08-30 累计 9 名真实被试</w:t>
+              <w:t>截至 2026-09-01 累计 ≥10 名 v3 范式真实被试</w:t>
             </w:r>
             <w:r>
               <w:rPr>
@@ -3852,7 +2599,25 @@
                 <w:color w:val="000000"/>
                 <w:sz w:val="21"/>
               </w:rPr>
-              <w:t>（6 名 v3 范式多会话被试 syj0828/fnz0828/cyy0830/fnz0830/wzr0830/xj0830，各 6 会话；另 3 名早期范式被试），采集按计划推进至不少于 20 名【提交前更新为最终人数】</w:t>
+              <w:t xml:space="preserve">（syj0828/fnz0828/cyy0830/fnz0830/wzr0830/xj0830/cjf0831/npl0831/ycx0831/ytl0901 等，各多会话；另有早期范式被试），Leave-Next all4 全表门控 </w:t>
+            </w:r>
+            <w:r>
+              <w:rPr>
+                <w:rFonts w:ascii="Times New Roman" w:hAnsi="Times New Roman" w:eastAsia="宋体"/>
+                <w:b/>
+                <w:color w:val="000000"/>
+                <w:sz w:val="21"/>
+              </w:rPr>
+              <w:t>20/50 PASS</w:t>
+            </w:r>
+            <w:r>
+              <w:rPr>
+                <w:rFonts w:ascii="Times New Roman" w:hAnsi="Times New Roman" w:eastAsia="宋体"/>
+                <w:b w:val="0"/>
+                <w:color w:val="000000"/>
+                <w:sz w:val="21"/>
+              </w:rPr>
+              <w:t>；采集按计划推进至不少于 20 名【提交前更新为最终人数】</w:t>
             </w:r>
           </w:p>
         </w:tc>
@@ -3889,7 +2654,6 @@
         <w:spacing w:line="312" w:lineRule="auto" w:before="280" w:after="160"/>
         <w:jc w:val="center"/>
       </w:pPr>
-      <w:bookmarkStart w:id="100013" w:name="_Toc100013"/>
       <w:r>
         <w:rPr>
           <w:rFonts w:ascii="Times New Roman" w:hAnsi="Times New Roman" w:eastAsia="黑体"/>
@@ -3899,14 +2663,12 @@
         </w:rPr>
         <w:t>4. 信号预处理与特征提取</w:t>
       </w:r>
-      <w:bookmarkEnd w:id="100013"/>
     </w:p>
     <w:p>
       <w:pPr>
         <w:pStyle w:val="Heading2"/>
         <w:spacing w:line="312" w:lineRule="auto" w:before="200" w:after="160"/>
       </w:pPr>
-      <w:bookmarkStart w:id="100014" w:name="_Toc100014"/>
       <w:r>
         <w:rPr>
           <w:rFonts w:ascii="Times New Roman" w:hAnsi="Times New Roman" w:eastAsia="黑体"/>
@@ -3916,7 +2678,6 @@
         </w:rPr>
         <w:t>4.1 统一预处理口径</w:t>
       </w:r>
-      <w:bookmarkEnd w:id="100014"/>
     </w:p>
     <w:p>
       <w:pPr>
@@ -3939,7 +2700,6 @@
         <w:pStyle w:val="Heading2"/>
         <w:spacing w:line="312" w:lineRule="auto" w:before="200" w:after="160"/>
       </w:pPr>
-      <w:bookmarkStart w:id="100015" w:name="_Toc100015"/>
       <w:r>
         <w:rPr>
           <w:rFonts w:ascii="Times New Roman" w:hAnsi="Times New Roman" w:eastAsia="黑体"/>
@@ -3949,7 +2709,6 @@
         </w:rPr>
         <w:t>4.2 滑窗特征</w:t>
       </w:r>
-      <w:bookmarkEnd w:id="100015"/>
     </w:p>
     <w:p>
       <w:pPr>
@@ -3990,7 +2749,6 @@
         <w:pStyle w:val="Heading2"/>
         <w:spacing w:line="312" w:lineRule="auto" w:before="200" w:after="160"/>
       </w:pPr>
-      <w:bookmarkStart w:id="100016" w:name="_Toc100016"/>
       <w:r>
         <w:rPr>
           <w:rFonts w:ascii="Times New Roman" w:hAnsi="Times New Roman" w:eastAsia="黑体"/>
@@ -4000,7 +2758,6 @@
         </w:rPr>
         <w:t>4.3 双标签双头</w:t>
       </w:r>
-      <w:bookmarkEnd w:id="100016"/>
     </w:p>
     <w:p>
       <w:pPr>
@@ -4060,7 +2817,6 @@
         <w:spacing w:line="312" w:lineRule="auto" w:before="280" w:after="160"/>
         <w:jc w:val="center"/>
       </w:pPr>
-      <w:bookmarkStart w:id="100017" w:name="_Toc100017"/>
       <w:r>
         <w:rPr>
           <w:rFonts w:ascii="Times New Roman" w:hAnsi="Times New Roman" w:eastAsia="黑体"/>
@@ -4070,14 +2826,12 @@
         </w:rPr>
         <w:t>5. 分类模型架构</w:t>
       </w:r>
-      <w:bookmarkEnd w:id="100017"/>
     </w:p>
     <w:p>
       <w:pPr>
         <w:pStyle w:val="Heading2"/>
         <w:spacing w:line="312" w:lineRule="auto" w:before="200" w:after="160"/>
       </w:pPr>
-      <w:bookmarkStart w:id="100018" w:name="_Toc100018"/>
       <w:r>
         <w:rPr>
           <w:rFonts w:ascii="Times New Roman" w:hAnsi="Times New Roman" w:eastAsia="黑体"/>
@@ -4087,7 +2841,6 @@
         </w:rPr>
         <w:t>5.1 主干统一对比与选型</w:t>
       </w:r>
-      <w:bookmarkEnd w:id="100018"/>
     </w:p>
     <w:p>
       <w:pPr>
@@ -4692,7 +3445,6 @@
         <w:pStyle w:val="Heading2"/>
         <w:spacing w:line="312" w:lineRule="auto" w:before="200" w:after="160"/>
       </w:pPr>
-      <w:bookmarkStart w:id="100019" w:name="_Toc100019"/>
       <w:r>
         <w:rPr>
           <w:rFonts w:ascii="Times New Roman" w:hAnsi="Times New Roman" w:eastAsia="黑体"/>
@@ -4702,7 +3454,6 @@
         </w:rPr>
         <w:t>5.2 E1f 四成员概率级融合</w:t>
       </w:r>
-      <w:bookmarkEnd w:id="100019"/>
     </w:p>
     <w:p>
       <w:pPr>
@@ -4743,7 +3494,6 @@
         <w:pStyle w:val="Heading2"/>
         <w:spacing w:line="312" w:lineRule="auto" w:before="200" w:after="160"/>
       </w:pPr>
-      <w:bookmarkStart w:id="100020" w:name="_Toc100020"/>
       <w:r>
         <w:rPr>
           <w:rFonts w:ascii="Times New Roman" w:hAnsi="Times New Roman" w:eastAsia="黑体"/>
@@ -4753,7 +3503,6 @@
         </w:rPr>
         <w:t>5.3 读出层（因果平滑 + 多数票，冻结 F5）</w:t>
       </w:r>
-      <w:bookmarkEnd w:id="100020"/>
     </w:p>
     <w:p>
       <w:pPr>
@@ -4861,7 +3610,6 @@
         <w:spacing w:line="312" w:lineRule="auto" w:before="280" w:after="160"/>
         <w:jc w:val="center"/>
       </w:pPr>
-      <w:bookmarkStart w:id="100021" w:name="_Toc100021"/>
       <w:r>
         <w:rPr>
           <w:rFonts w:ascii="Times New Roman" w:hAnsi="Times New Roman" w:eastAsia="黑体"/>
@@ -4871,14 +3619,12 @@
         </w:rPr>
         <w:t>6. 异步交互协议（控制状态/空闲状态判别）</w:t>
       </w:r>
-      <w:bookmarkEnd w:id="100021"/>
     </w:p>
     <w:p>
       <w:pPr>
         <w:pStyle w:val="Heading2"/>
         <w:spacing w:line="312" w:lineRule="auto" w:before="200" w:after="160"/>
       </w:pPr>
-      <w:bookmarkStart w:id="100022" w:name="_Toc100022"/>
       <w:r>
         <w:rPr>
           <w:rFonts w:ascii="Times New Roman" w:hAnsi="Times New Roman" w:eastAsia="黑体"/>
@@ -4888,7 +3634,6 @@
         </w:rPr>
         <w:t>6.1 状态判别机制</w:t>
       </w:r>
-      <w:bookmarkEnd w:id="100022"/>
     </w:p>
     <w:p>
       <w:pPr>
@@ -4996,7 +3741,25 @@
           <w:color w:val="000000"/>
           <w:sz w:val="24"/>
         </w:rPr>
-        <w:t>：采集/游戏会话内设置质量门控（heldout 会话窗级准确率判定 PASS/FAIL），FAIL 时告警落盘（</w:t>
+        <w:t xml:space="preserve">：采集/游戏会话内设置质量门控（heldout 会话窗级 </w:t>
+      </w:r>
+      <w:r>
+        <w:rPr>
+          <w:rFonts w:ascii="Times New Roman" w:hAnsi="Times New Roman" w:eastAsia="宋体"/>
+          <w:b/>
+          <w:color w:val="000000"/>
+          <w:sz w:val="24"/>
+        </w:rPr>
+        <w:t>raw</w:t>
+      </w:r>
+      <w:r>
+        <w:rPr>
+          <w:rFonts w:ascii="Times New Roman" w:hAnsi="Times New Roman" w:eastAsia="宋体"/>
+          <w:b w:val="0"/>
+          <w:color w:val="000000"/>
+          <w:sz w:val="24"/>
+        </w:rPr>
+        <w:t xml:space="preserve"> 准确率判定 PASS/FAIL，展示用因果平滑），FAIL 时告警落盘（</w:t>
       </w:r>
       <w:r>
         <w:rPr>
@@ -5014,7 +3777,25 @@
           <w:color w:val="000000"/>
           <w:sz w:val="24"/>
         </w:rPr>
-        <w:t>）并强制晋升，保证异常被显式记录而非静默吸收；游戏侧另有无效试次计分判定与连续无效触发会话熔断降级机制（v2 遗产，保留为保护路径），确保用户从控制状态回到空闲状态时系统行为安全可预期。</w:t>
+        <w:t xml:space="preserve">）并强制晋升，保证异常被显式记录而非静默吸收；EEG 断流看门狗（停滞 2 s 告警 / </w:t>
+      </w:r>
+      <w:r>
+        <w:rPr>
+          <w:rFonts w:ascii="Times New Roman" w:hAnsi="Times New Roman" w:eastAsia="宋体"/>
+          <w:b/>
+          <w:color w:val="000000"/>
+          <w:sz w:val="24"/>
+        </w:rPr>
+        <w:t>5 s 中止</w:t>
+      </w:r>
+      <w:r>
+        <w:rPr>
+          <w:rFonts w:ascii="Times New Roman" w:hAnsi="Times New Roman" w:eastAsia="宋体"/>
+          <w:b w:val="0"/>
+          <w:color w:val="000000"/>
+          <w:sz w:val="24"/>
+        </w:rPr>
+        <w:t>）保护采集完整性；游戏侧另有无效试次计分判定与连续无效触发会话熔断降级机制（v2 遗产，保留为保护路径），确保用户从控制状态回到空闲状态时系统行为安全可预期。</w:t>
       </w:r>
       <w:r>
         <w:rPr>
@@ -5031,7 +3812,6 @@
         <w:pStyle w:val="Heading2"/>
         <w:spacing w:line="312" w:lineRule="auto" w:before="200" w:after="160"/>
       </w:pPr>
-      <w:bookmarkStart w:id="100023" w:name="_Toc100023"/>
       <w:r>
         <w:rPr>
           <w:rFonts w:ascii="Times New Roman" w:hAnsi="Times New Roman" w:eastAsia="黑体"/>
@@ -5041,7 +3821,6 @@
         </w:rPr>
         <w:t>6.2 判定时延</w:t>
       </w:r>
-      <w:bookmarkEnd w:id="100023"/>
     </w:p>
     <w:p>
       <w:pPr>
@@ -5065,7 +3844,6 @@
         <w:spacing w:line="312" w:lineRule="auto" w:before="280" w:after="160"/>
         <w:jc w:val="center"/>
       </w:pPr>
-      <w:bookmarkStart w:id="100024" w:name="_Toc100024"/>
       <w:r>
         <w:rPr>
           <w:rFonts w:ascii="Times New Roman" w:hAnsi="Times New Roman" w:eastAsia="黑体"/>
@@ -5075,14 +3853,12 @@
         </w:rPr>
         <w:t>7. 少样本个性化适配</w:t>
       </w:r>
-      <w:bookmarkEnd w:id="100024"/>
     </w:p>
     <w:p>
       <w:pPr>
         <w:pStyle w:val="Heading2"/>
         <w:spacing w:line="312" w:lineRule="auto" w:before="200" w:after="160"/>
       </w:pPr>
-      <w:bookmarkStart w:id="100025" w:name="_Toc100025"/>
       <w:r>
         <w:rPr>
           <w:rFonts w:ascii="Times New Roman" w:hAnsi="Times New Roman" w:eastAsia="黑体"/>
@@ -5092,7 +3868,6 @@
         </w:rPr>
         <w:t>7.1 采后 Leave-Next 增量微调</w:t>
       </w:r>
-      <w:bookmarkEnd w:id="100025"/>
     </w:p>
     <w:p>
       <w:pPr>
@@ -5269,7 +4044,6 @@
         <w:pStyle w:val="Heading2"/>
         <w:spacing w:line="312" w:lineRule="auto" w:before="200" w:after="160"/>
       </w:pPr>
-      <w:bookmarkStart w:id="100026" w:name="_Toc100026"/>
       <w:r>
         <w:rPr>
           <w:rFonts w:ascii="Times New Roman" w:hAnsi="Times New Roman" w:eastAsia="黑体"/>
@@ -5279,7 +4053,6 @@
         </w:rPr>
         <w:t>7.2 适配有效性证据链</w:t>
       </w:r>
-      <w:bookmarkEnd w:id="100026"/>
     </w:p>
     <w:tbl>
       <w:tblPr>
@@ -5565,7 +4338,25 @@
                 <w:color w:val="000000"/>
                 <w:sz w:val="21"/>
               </w:rPr>
-              <w:t>9 人 × 6 轮采后微调</w:t>
+              <w:t>9 人 × 6 轮采后微调（stamp=</w:t>
+            </w:r>
+            <w:r>
+              <w:rPr>
+                <w:rFonts w:ascii="Consolas" w:hAnsi="Consolas" w:eastAsia="Consolas"/>
+                <w:b w:val="0"/>
+                <w:color w:val="000000"/>
+                <w:sz w:val="18"/>
+              </w:rPr>
+              <w:t>20260901_124502</w:t>
+            </w:r>
+            <w:r>
+              <w:rPr>
+                <w:rFonts w:ascii="Times New Roman" w:hAnsi="Times New Roman" w:eastAsia="宋体"/>
+                <w:b w:val="0"/>
+                <w:color w:val="000000"/>
+                <w:sz w:val="21"/>
+              </w:rPr>
+              <w:t>）</w:t>
             </w:r>
           </w:p>
         </w:tc>
@@ -5594,7 +4385,7 @@
                 <w:color w:val="000000"/>
                 <w:sz w:val="21"/>
               </w:rPr>
-              <w:t>67.1%</w:t>
+              <w:t>66.3%</w:t>
             </w:r>
             <w:r>
               <w:rPr>
@@ -5603,7 +4394,25 @@
                 <w:color w:val="000000"/>
                 <w:sz w:val="21"/>
               </w:rPr>
-              <w:t xml:space="preserve"> vs 单成员 so 44.5%（Δ+22.5 pp）；零样本 33.8%</w:t>
+              <w:t xml:space="preserve"> vs 单成员 so </w:t>
+            </w:r>
+            <w:r>
+              <w:rPr>
+                <w:rFonts w:ascii="Times New Roman" w:hAnsi="Times New Roman" w:eastAsia="宋体"/>
+                <w:b/>
+                <w:color w:val="000000"/>
+                <w:sz w:val="21"/>
+              </w:rPr>
+              <w:t>45.2%</w:t>
+            </w:r>
+            <w:r>
+              <w:rPr>
+                <w:rFonts w:ascii="Times New Roman" w:hAnsi="Times New Roman" w:eastAsia="宋体"/>
+                <w:b w:val="0"/>
+                <w:color w:val="000000"/>
+                <w:sz w:val="21"/>
+              </w:rPr>
+              <w:t>（Δ+21.1 pp）；零样本 33.8%；门控 PASS（strict）S/so/all4 = 29/32/29 /45</w:t>
             </w:r>
           </w:p>
         </w:tc>
@@ -5628,7 +4437,7 @@
                 <w:color w:val="000000"/>
                 <w:sz w:val="21"/>
               </w:rPr>
-              <w:t>实验 33 + 复验（真实被试）</w:t>
+              <w:t>实验 33 + Leave-Next all4 全表（真实被试）</w:t>
             </w:r>
           </w:p>
         </w:tc>
@@ -5648,7 +4457,7 @@
                 <w:color w:val="000000"/>
                 <w:sz w:val="21"/>
               </w:rPr>
-              <w:t>syj0828/fnz0828 等</w:t>
+              <w:t>10 名 v3 被试（含 ytl0901）</w:t>
             </w:r>
           </w:p>
         </w:tc>
@@ -5668,7 +4477,7 @@
                 <w:color w:val="000000"/>
                 <w:sz w:val="21"/>
               </w:rPr>
-              <w:t xml:space="preserve">syj0828 末档窗级 </w:t>
+              <w:t xml:space="preserve">最优个体 syj0828 末档窗级 </w:t>
             </w:r>
             <w:r>
               <w:rPr>
@@ -5677,7 +4486,7 @@
                 <w:color w:val="000000"/>
                 <w:sz w:val="21"/>
               </w:rPr>
-              <w:t>91.6%</w:t>
+              <w:t>92.4%</w:t>
             </w:r>
             <w:r>
               <w:rPr>
@@ -5686,7 +4495,25 @@
                 <w:color w:val="000000"/>
                 <w:sz w:val="21"/>
               </w:rPr>
-              <w:t>（MI 94.4%，42/45 分）；all4 较 so 平均 ΔMI +54.2 pp</w:t>
+              <w:t xml:space="preserve">（F5 41.5/45，MI 33/36）；门控合计 </w:t>
+            </w:r>
+            <w:r>
+              <w:rPr>
+                <w:rFonts w:ascii="Times New Roman" w:hAnsi="Times New Roman" w:eastAsia="宋体"/>
+                <w:b/>
+                <w:color w:val="000000"/>
+                <w:sz w:val="21"/>
+              </w:rPr>
+              <w:t>20/50 PASS</w:t>
+            </w:r>
+            <w:r>
+              <w:rPr>
+                <w:rFonts w:ascii="Times New Roman" w:hAnsi="Times New Roman" w:eastAsia="宋体"/>
+                <w:b w:val="0"/>
+                <w:color w:val="000000"/>
+                <w:sz w:val="21"/>
+              </w:rPr>
+              <w:t>；all4 较 so 平均 ΔMI +54.2 pp（实验 33）</w:t>
             </w:r>
           </w:p>
         </w:tc>
@@ -5710,7 +4537,7 @@
           <w:color w:val="000000"/>
           <w:sz w:val="24"/>
         </w:rPr>
-        <w:t>个体间差异大（末档窗级 0.35–0.92）恰是少样本个性化适配必要性的直接证据：零样本底座不足以覆盖全部用户，而采后微调在绝大多数个体上带来大幅增益。</w:t>
+        <w:t>个体间差异大（末档窗级约 0.35–0.92）恰是少样本个性化适配必要性的直接证据：零样本底座不足以覆盖全部用户，而采后微调在绝大多数个体上带来大幅增益。</w:t>
       </w:r>
     </w:p>
     <w:p>
@@ -5718,7 +4545,6 @@
         <w:pStyle w:val="Heading2"/>
         <w:spacing w:line="312" w:lineRule="auto" w:before="200" w:after="160"/>
       </w:pPr>
-      <w:bookmarkStart w:id="100027" w:name="_Toc100027"/>
       <w:r>
         <w:rPr>
           <w:rFonts w:ascii="Times New Roman" w:hAnsi="Times New Roman" w:eastAsia="黑体"/>
@@ -5728,7 +4554,6 @@
         </w:rPr>
         <w:t>7.3 漂移保护</w:t>
       </w:r>
-      <w:bookmarkEnd w:id="100027"/>
     </w:p>
     <w:p>
       <w:pPr>
@@ -5752,7 +4577,6 @@
         <w:spacing w:line="312" w:lineRule="auto" w:before="280" w:after="160"/>
         <w:jc w:val="center"/>
       </w:pPr>
-      <w:bookmarkStart w:id="100028" w:name="_Toc100028"/>
       <w:r>
         <w:rPr>
           <w:rFonts w:ascii="Times New Roman" w:hAnsi="Times New Roman" w:eastAsia="黑体"/>
@@ -5762,14 +4586,12 @@
         </w:rPr>
         <w:t>8. 网页游戏诱导系统</w:t>
       </w:r>
-      <w:bookmarkEnd w:id="100028"/>
     </w:p>
     <w:p>
       <w:pPr>
         <w:pStyle w:val="Heading2"/>
         <w:spacing w:line="312" w:lineRule="auto" w:before="200" w:after="160"/>
       </w:pPr>
-      <w:bookmarkStart w:id="100029" w:name="_Toc100029"/>
       <w:r>
         <w:rPr>
           <w:rFonts w:ascii="Times New Roman" w:hAnsi="Times New Roman" w:eastAsia="黑体"/>
@@ -5777,9 +4599,8 @@
           <w:color w:val="000000"/>
           <w:sz w:val="30"/>
         </w:rPr>
-        <w:t>8.1 游戏化诱导</w:t>
+        <w:t>8.1 游戏化诱导（v3 采集板块）</w:t>
       </w:r>
-      <w:bookmarkEnd w:id="100029"/>
     </w:p>
     <w:p>
       <w:pPr>
@@ -5794,7 +4615,41 @@
           <w:color w:val="000000"/>
           <w:sz w:val="24"/>
         </w:rPr>
-        <w:t xml:space="preserve">系统以轻量网页（HTML/JS + WebSocket）实现游戏化诱导：第一人称视角虚拟手 + 桌面目标物（杯子/瓶子/苹果等，每 2 试次换物、每 10 试次换场景主题）。Cue 阶段文字指令与画面提示同步给出"左手/右手抓握杯"动觉引导语；正式段双手静态可见，被试按提示执行运动想象。现行默认游戏模式 </w:t>
+        <w:t>系统以轻量网页（HTML/JS + Three.js + WebSocket）实现第一人称运动想象诱导：被试屏呈现虚拟双手与桌面目标物（杯子/瓶子/苹果等；默认每 2 试次换物、每 10 试次换场景主题），Cue 阶段 HUD 同步给出「左手/右手抓握××」动觉引导语，正式想象段双手可见，被试按提示执行运动想象。</w:t>
+      </w:r>
+    </w:p>
+    <w:p>
+      <w:pPr>
+        <w:spacing w:line="312" w:lineRule="auto" w:before="0" w:after="120"/>
+        <w:ind w:firstLine="480"/>
+        <w:jc w:val="both"/>
+      </w:pPr>
+      <w:r>
+        <w:rPr>
+          <w:rFonts w:ascii="Times New Roman" w:hAnsi="Times New Roman" w:eastAsia="宋体"/>
+          <w:b w:val="0"/>
+          <w:color w:val="000000"/>
+          <w:sz w:val="24"/>
+        </w:rPr>
+        <w:t xml:space="preserve">正式采集板块为 </w:t>
+      </w:r>
+      <w:r>
+        <w:rPr>
+          <w:rFonts w:ascii="Times New Roman" w:hAnsi="Times New Roman" w:eastAsia="宋体"/>
+          <w:b/>
+          <w:color w:val="000000"/>
+          <w:sz w:val="24"/>
+        </w:rPr>
+        <w:t>v3 探针会话</w:t>
+      </w:r>
+      <w:r>
+        <w:rPr>
+          <w:rFonts w:ascii="Times New Roman" w:hAnsi="Times New Roman" w:eastAsia="宋体"/>
+          <w:b w:val="0"/>
+          <w:color w:val="000000"/>
+          <w:sz w:val="24"/>
+        </w:rPr>
+        <w:t>（</w:t>
       </w:r>
       <w:r>
         <w:rPr>
@@ -5803,7 +4658,7 @@
           <w:color w:val="000000"/>
           <w:sz w:val="21"/>
         </w:rPr>
-        <w:t>v3_test</w:t>
+        <w:t>phase_mode=v3_session</w:t>
       </w:r>
       <w:r>
         <w:rPr>
@@ -5812,7 +4667,7 @@
           <w:color w:val="000000"/>
           <w:sz w:val="24"/>
         </w:rPr>
-        <w:t xml:space="preserve">：20 试次（10 Rest + 5 左 + 5 右），连击计分，满分 15，权重使用被试个人 </w:t>
+        <w:t xml:space="preserve">，配置权威源 </w:t>
       </w:r>
       <w:r>
         <w:rPr>
@@ -5821,7 +4676,7 @@
           <w:color w:val="000000"/>
           <w:sz w:val="21"/>
         </w:rPr>
-        <w:t>current</w:t>
+        <w:t>v3_session.yaml</w:t>
       </w:r>
       <w:r>
         <w:rPr>
@@ -5830,7 +4685,598 @@
           <w:color w:val="000000"/>
           <w:sz w:val="24"/>
         </w:rPr>
-        <w:t xml:space="preserve"> 模型，构成"模型—游戏"闭环。</w:t>
+        <w:t>）：</w:t>
+      </w:r>
+    </w:p>
+    <w:tbl>
+      <w:tblPr>
+        <w:tblStyle w:val="TableGrid"/>
+        <w:tblW w:type="auto" w:w="0"/>
+        <w:jc w:val="center"/>
+        <w:tblLook w:firstColumn="1" w:firstRow="1" w:lastColumn="0" w:lastRow="0" w:noHBand="0" w:noVBand="1" w:val="04A0"/>
+        <w:tblCellMar>
+          <w:top w:w="40" w:type="dxa"/>
+          <w:bottom w:w="40" w:type="dxa"/>
+          <w:left w:w="80" w:type="dxa"/>
+          <w:right w:w="80" w:type="dxa"/>
+        </w:tblCellMar>
+      </w:tblPr>
+      <w:tblGrid>
+        <w:gridCol w:w="4353"/>
+        <w:gridCol w:w="4353"/>
+      </w:tblGrid>
+      <w:tr>
+        <w:trPr>
+          <w:cantSplit/>
+          <w:tblHeader/>
+        </w:trPr>
+        <w:tc>
+          <w:tcPr>
+            <w:tcW w:type="dxa" w:w="4353"/>
+            <w:shd w:val="clear" w:fill="D9E2F3"/>
+          </w:tcPr>
+          <w:p>
+            <w:pPr>
+              <w:spacing w:line="276" w:lineRule="auto"/>
+              <w:jc w:val="center"/>
+            </w:pPr>
+            <w:r>
+              <w:rPr>
+                <w:rFonts w:ascii="Times New Roman" w:hAnsi="Times New Roman" w:eastAsia="宋体"/>
+                <w:b/>
+                <w:color w:val="000000"/>
+                <w:sz w:val="21"/>
+              </w:rPr>
+              <w:t>项</w:t>
+            </w:r>
+          </w:p>
+        </w:tc>
+        <w:tc>
+          <w:tcPr>
+            <w:tcW w:type="dxa" w:w="4353"/>
+            <w:shd w:val="clear" w:fill="D9E2F3"/>
+          </w:tcPr>
+          <w:p>
+            <w:pPr>
+              <w:spacing w:line="276" w:lineRule="auto"/>
+              <w:jc w:val="center"/>
+            </w:pPr>
+            <w:r>
+              <w:rPr>
+                <w:rFonts w:ascii="Times New Roman" w:hAnsi="Times New Roman" w:eastAsia="宋体"/>
+                <w:b/>
+                <w:color w:val="000000"/>
+                <w:sz w:val="21"/>
+              </w:rPr>
+              <w:t>规格</w:t>
+            </w:r>
+          </w:p>
+        </w:tc>
+      </w:tr>
+      <w:tr>
+        <w:trPr>
+          <w:cantSplit/>
+        </w:trPr>
+        <w:tc>
+          <w:tcPr>
+            <w:tcW w:type="dxa" w:w="4353"/>
+          </w:tcPr>
+          <w:p>
+            <w:pPr>
+              <w:spacing w:line="276" w:lineRule="auto"/>
+              <w:jc w:val="left"/>
+            </w:pPr>
+            <w:r>
+              <w:rPr>
+                <w:rFonts w:ascii="Times New Roman" w:hAnsi="Times New Roman" w:eastAsia="宋体"/>
+                <w:b w:val="0"/>
+                <w:color w:val="000000"/>
+                <w:sz w:val="21"/>
+              </w:rPr>
+              <w:t>会话结构</w:t>
+            </w:r>
+          </w:p>
+        </w:tc>
+        <w:tc>
+          <w:tcPr>
+            <w:tcW w:type="dxa" w:w="4353"/>
+          </w:tcPr>
+          <w:p>
+            <w:pPr>
+              <w:spacing w:line="276" w:lineRule="auto"/>
+              <w:jc w:val="left"/>
+            </w:pPr>
+            <w:r>
+              <w:rPr>
+                <w:rFonts w:ascii="Times New Roman" w:hAnsi="Times New Roman" w:eastAsia="宋体"/>
+                <w:b/>
+                <w:color w:val="000000"/>
+                <w:sz w:val="21"/>
+              </w:rPr>
+              <w:t>2 块 × 18 试次 = 36 试次</w:t>
+            </w:r>
+            <w:r>
+              <w:rPr>
+                <w:rFonts w:ascii="Times New Roman" w:hAnsi="Times New Roman" w:eastAsia="宋体"/>
+                <w:b w:val="0"/>
+                <w:color w:val="000000"/>
+                <w:sz w:val="21"/>
+              </w:rPr>
+              <w:t>（块内 Left/Right 均衡）；开场静息基线 30 s；块间休息 30 s</w:t>
+            </w:r>
+          </w:p>
+        </w:tc>
+      </w:tr>
+      <w:tr>
+        <w:trPr>
+          <w:cantSplit/>
+        </w:trPr>
+        <w:tc>
+          <w:tcPr>
+            <w:tcW w:type="dxa" w:w="4353"/>
+          </w:tcPr>
+          <w:p>
+            <w:pPr>
+              <w:spacing w:line="276" w:lineRule="auto"/>
+              <w:jc w:val="left"/>
+            </w:pPr>
+            <w:r>
+              <w:rPr>
+                <w:rFonts w:ascii="Times New Roman" w:hAnsi="Times New Roman" w:eastAsia="宋体"/>
+                <w:b w:val="0"/>
+                <w:color w:val="000000"/>
+                <w:sz w:val="21"/>
+              </w:rPr>
+              <w:t>单试次时序</w:t>
+            </w:r>
+          </w:p>
+        </w:tc>
+        <w:tc>
+          <w:tcPr>
+            <w:tcW w:type="dxa" w:w="4353"/>
+          </w:tcPr>
+          <w:p>
+            <w:pPr>
+              <w:spacing w:line="276" w:lineRule="auto"/>
+              <w:jc w:val="left"/>
+            </w:pPr>
+            <w:r>
+              <w:rPr>
+                <w:rFonts w:ascii="Times New Roman" w:hAnsi="Times New Roman" w:eastAsia="宋体"/>
+                <w:b w:val="0"/>
+                <w:color w:val="000000"/>
+                <w:sz w:val="21"/>
+              </w:rPr>
+              <w:t xml:space="preserve">专用 Rest </w:t>
+            </w:r>
+            <w:r>
+              <w:rPr>
+                <w:rFonts w:ascii="Times New Roman" w:hAnsi="Times New Roman" w:eastAsia="宋体"/>
+                <w:b/>
+                <w:color w:val="000000"/>
+                <w:sz w:val="21"/>
+              </w:rPr>
+              <w:t>4 s</w:t>
+            </w:r>
+            <w:r>
+              <w:rPr>
+                <w:rFonts w:ascii="Times New Roman" w:hAnsi="Times New Roman" w:eastAsia="宋体"/>
+                <w:b w:val="0"/>
+                <w:color w:val="000000"/>
+                <w:sz w:val="21"/>
+              </w:rPr>
+              <w:t xml:space="preserve"> → prep </w:t>
+            </w:r>
+            <w:r>
+              <w:rPr>
+                <w:rFonts w:ascii="Times New Roman" w:hAnsi="Times New Roman" w:eastAsia="宋体"/>
+                <w:b/>
+                <w:color w:val="000000"/>
+                <w:sz w:val="21"/>
+              </w:rPr>
+              <w:t>2 s</w:t>
+            </w:r>
+            <w:r>
+              <w:rPr>
+                <w:rFonts w:ascii="Times New Roman" w:hAnsi="Times New Roman" w:eastAsia="宋体"/>
+                <w:b w:val="0"/>
+                <w:color w:val="000000"/>
+                <w:sz w:val="21"/>
+              </w:rPr>
+              <w:t xml:space="preserve"> → Cue </w:t>
+            </w:r>
+            <w:r>
+              <w:rPr>
+                <w:rFonts w:ascii="Times New Roman" w:hAnsi="Times New Roman" w:eastAsia="宋体"/>
+                <w:b/>
+                <w:color w:val="000000"/>
+                <w:sz w:val="21"/>
+              </w:rPr>
+              <w:t>1 s</w:t>
+            </w:r>
+            <w:r>
+              <w:rPr>
+                <w:rFonts w:ascii="Times New Roman" w:hAnsi="Times New Roman" w:eastAsia="宋体"/>
+                <w:b w:val="0"/>
+                <w:color w:val="000000"/>
+                <w:sz w:val="21"/>
+              </w:rPr>
+              <w:t xml:space="preserve"> → MI </w:t>
+            </w:r>
+            <w:r>
+              <w:rPr>
+                <w:rFonts w:ascii="Times New Roman" w:hAnsi="Times New Roman" w:eastAsia="宋体"/>
+                <w:b/>
+                <w:color w:val="000000"/>
+                <w:sz w:val="21"/>
+              </w:rPr>
+              <w:t>4 s</w:t>
+            </w:r>
+            <w:r>
+              <w:rPr>
+                <w:rFonts w:ascii="Times New Roman" w:hAnsi="Times New Roman" w:eastAsia="宋体"/>
+                <w:b w:val="0"/>
+                <w:color w:val="000000"/>
+                <w:sz w:val="21"/>
+              </w:rPr>
+              <w:t xml:space="preserve"> → ITI </w:t>
+            </w:r>
+            <w:r>
+              <w:rPr>
+                <w:rFonts w:ascii="Times New Roman" w:hAnsi="Times New Roman" w:eastAsia="宋体"/>
+                <w:b/>
+                <w:color w:val="000000"/>
+                <w:sz w:val="21"/>
+              </w:rPr>
+              <w:t>3 s</w:t>
+            </w:r>
+            <w:r>
+              <w:rPr>
+                <w:rFonts w:ascii="Times New Roman" w:hAnsi="Times New Roman" w:eastAsia="宋体"/>
+                <w:b w:val="0"/>
+                <w:color w:val="000000"/>
+                <w:sz w:val="21"/>
+              </w:rPr>
+              <w:t>（OpenBMI-Align v1）</w:t>
+            </w:r>
+          </w:p>
+        </w:tc>
+      </w:tr>
+      <w:tr>
+        <w:trPr>
+          <w:cantSplit/>
+        </w:trPr>
+        <w:tc>
+          <w:tcPr>
+            <w:tcW w:type="dxa" w:w="4353"/>
+          </w:tcPr>
+          <w:p>
+            <w:pPr>
+              <w:spacing w:line="276" w:lineRule="auto"/>
+              <w:jc w:val="left"/>
+            </w:pPr>
+            <w:r>
+              <w:rPr>
+                <w:rFonts w:ascii="Times New Roman" w:hAnsi="Times New Roman" w:eastAsia="宋体"/>
+                <w:b w:val="0"/>
+                <w:color w:val="000000"/>
+                <w:sz w:val="21"/>
+              </w:rPr>
+              <w:t>在线读出</w:t>
+            </w:r>
+          </w:p>
+        </w:tc>
+        <w:tc>
+          <w:tcPr>
+            <w:tcW w:type="dxa" w:w="4353"/>
+          </w:tcPr>
+          <w:p>
+            <w:pPr>
+              <w:spacing w:line="276" w:lineRule="auto"/>
+              <w:jc w:val="left"/>
+            </w:pPr>
+            <w:r>
+              <w:rPr>
+                <w:rFonts w:ascii="Times New Roman" w:hAnsi="Times New Roman" w:eastAsia="宋体"/>
+                <w:b w:val="0"/>
+                <w:color w:val="000000"/>
+                <w:sz w:val="21"/>
+              </w:rPr>
+              <w:t xml:space="preserve">E1f 四成员融合 → 因果平滑 lookback=2 → argmax；试次级多数票（判定窗锚定 </w:t>
+            </w:r>
+            <w:r>
+              <w:rPr>
+                <w:rFonts w:ascii="Consolas" w:hAnsi="Consolas" w:eastAsia="Consolas"/>
+                <w:b w:val="0"/>
+                <w:color w:val="000000"/>
+                <w:sz w:val="18"/>
+              </w:rPr>
+              <w:t>mi_start</w:t>
+            </w:r>
+            <w:r>
+              <w:rPr>
+                <w:rFonts w:ascii="Times New Roman" w:hAnsi="Times New Roman" w:eastAsia="宋体"/>
+                <w:b w:val="0"/>
+                <w:color w:val="000000"/>
+                <w:sz w:val="21"/>
+              </w:rPr>
+              <w:t>，窗尾相对 MI 3.0–4.0 s）</w:t>
+            </w:r>
+          </w:p>
+        </w:tc>
+      </w:tr>
+      <w:tr>
+        <w:trPr>
+          <w:cantSplit/>
+        </w:trPr>
+        <w:tc>
+          <w:tcPr>
+            <w:tcW w:type="dxa" w:w="4353"/>
+          </w:tcPr>
+          <w:p>
+            <w:pPr>
+              <w:spacing w:line="276" w:lineRule="auto"/>
+              <w:jc w:val="left"/>
+            </w:pPr>
+            <w:r>
+              <w:rPr>
+                <w:rFonts w:ascii="Times New Roman" w:hAnsi="Times New Roman" w:eastAsia="宋体"/>
+                <w:b w:val="0"/>
+                <w:color w:val="000000"/>
+                <w:sz w:val="21"/>
+              </w:rPr>
+              <w:t>计分</w:t>
+            </w:r>
+          </w:p>
+        </w:tc>
+        <w:tc>
+          <w:tcPr>
+            <w:tcW w:type="dxa" w:w="4353"/>
+          </w:tcPr>
+          <w:p>
+            <w:pPr>
+              <w:spacing w:line="276" w:lineRule="auto"/>
+              <w:jc w:val="left"/>
+            </w:pPr>
+            <w:r>
+              <w:rPr>
+                <w:rFonts w:ascii="Times New Roman" w:hAnsi="Times New Roman" w:eastAsia="宋体"/>
+                <w:b w:val="0"/>
+                <w:color w:val="000000"/>
+                <w:sz w:val="21"/>
+              </w:rPr>
+              <w:t xml:space="preserve">MI 判对 </w:t>
+            </w:r>
+            <w:r>
+              <w:rPr>
+                <w:rFonts w:ascii="Times New Roman" w:hAnsi="Times New Roman" w:eastAsia="宋体"/>
+                <w:b/>
+                <w:color w:val="000000"/>
+                <w:sz w:val="21"/>
+              </w:rPr>
+              <w:t>+1</w:t>
+            </w:r>
+            <w:r>
+              <w:rPr>
+                <w:rFonts w:ascii="Times New Roman" w:hAnsi="Times New Roman" w:eastAsia="宋体"/>
+                <w:b w:val="0"/>
+                <w:color w:val="000000"/>
+                <w:sz w:val="21"/>
+              </w:rPr>
+              <w:t xml:space="preserve"> · 专用 Rest 判对 </w:t>
+            </w:r>
+            <w:r>
+              <w:rPr>
+                <w:rFonts w:ascii="Times New Roman" w:hAnsi="Times New Roman" w:eastAsia="宋体"/>
+                <w:b/>
+                <w:color w:val="000000"/>
+                <w:sz w:val="21"/>
+              </w:rPr>
+              <w:t>+0.5</w:t>
+            </w:r>
+            <w:r>
+              <w:rPr>
+                <w:rFonts w:ascii="Times New Roman" w:hAnsi="Times New Roman" w:eastAsia="宋体"/>
+                <w:b w:val="0"/>
+                <w:color w:val="000000"/>
+                <w:sz w:val="21"/>
+              </w:rPr>
+              <w:t xml:space="preserve"> · 满分 </w:t>
+            </w:r>
+            <w:r>
+              <w:rPr>
+                <w:rFonts w:ascii="Times New Roman" w:hAnsi="Times New Roman" w:eastAsia="宋体"/>
+                <w:b/>
+                <w:color w:val="000000"/>
+                <w:sz w:val="21"/>
+              </w:rPr>
+              <w:t>54</w:t>
+            </w:r>
+          </w:p>
+        </w:tc>
+      </w:tr>
+      <w:tr>
+        <w:trPr>
+          <w:cantSplit/>
+        </w:trPr>
+        <w:tc>
+          <w:tcPr>
+            <w:tcW w:type="dxa" w:w="4353"/>
+          </w:tcPr>
+          <w:p>
+            <w:pPr>
+              <w:spacing w:line="276" w:lineRule="auto"/>
+              <w:jc w:val="left"/>
+            </w:pPr>
+            <w:r>
+              <w:rPr>
+                <w:rFonts w:ascii="Times New Roman" w:hAnsi="Times New Roman" w:eastAsia="宋体"/>
+                <w:b w:val="0"/>
+                <w:color w:val="000000"/>
+                <w:sz w:val="21"/>
+              </w:rPr>
+              <w:t>权重</w:t>
+            </w:r>
+          </w:p>
+        </w:tc>
+        <w:tc>
+          <w:tcPr>
+            <w:tcW w:type="dxa" w:w="4353"/>
+          </w:tcPr>
+          <w:p>
+            <w:pPr>
+              <w:spacing w:line="276" w:lineRule="auto"/>
+              <w:jc w:val="left"/>
+            </w:pPr>
+            <w:r>
+              <w:rPr>
+                <w:rFonts w:ascii="Times New Roman" w:hAnsi="Times New Roman" w:eastAsia="宋体"/>
+                <w:b w:val="0"/>
+                <w:color w:val="000000"/>
+                <w:sz w:val="21"/>
+              </w:rPr>
+              <w:t xml:space="preserve">优先加载被试个人 </w:t>
+            </w:r>
+            <w:r>
+              <w:rPr>
+                <w:rFonts w:ascii="Consolas" w:hAnsi="Consolas" w:eastAsia="Consolas"/>
+                <w:b w:val="0"/>
+                <w:color w:val="000000"/>
+                <w:sz w:val="18"/>
+              </w:rPr>
+              <w:t>models/current</w:t>
+            </w:r>
+            <w:r>
+              <w:rPr>
+                <w:rFonts w:ascii="Times New Roman" w:hAnsi="Times New Roman" w:eastAsia="宋体"/>
+                <w:b w:val="0"/>
+                <w:color w:val="000000"/>
+                <w:sz w:val="21"/>
+              </w:rPr>
+              <w:t>，否则回退通用底座</w:t>
+            </w:r>
+          </w:p>
+        </w:tc>
+      </w:tr>
+      <w:tr>
+        <w:trPr>
+          <w:cantSplit/>
+        </w:trPr>
+        <w:tc>
+          <w:tcPr>
+            <w:tcW w:type="dxa" w:w="4353"/>
+          </w:tcPr>
+          <w:p>
+            <w:pPr>
+              <w:spacing w:line="276" w:lineRule="auto"/>
+              <w:jc w:val="left"/>
+            </w:pPr>
+            <w:r>
+              <w:rPr>
+                <w:rFonts w:ascii="Times New Roman" w:hAnsi="Times New Roman" w:eastAsia="宋体"/>
+                <w:b w:val="0"/>
+                <w:color w:val="000000"/>
+                <w:sz w:val="21"/>
+              </w:rPr>
+              <w:t>反馈</w:t>
+            </w:r>
+          </w:p>
+        </w:tc>
+        <w:tc>
+          <w:tcPr>
+            <w:tcW w:type="dxa" w:w="4353"/>
+          </w:tcPr>
+          <w:p>
+            <w:pPr>
+              <w:spacing w:line="276" w:lineRule="auto"/>
+              <w:jc w:val="left"/>
+            </w:pPr>
+            <w:r>
+              <w:rPr>
+                <w:rFonts w:ascii="Times New Roman" w:hAnsi="Times New Roman" w:eastAsia="宋体"/>
+                <w:b w:val="0"/>
+                <w:color w:val="000000"/>
+                <w:sz w:val="21"/>
+              </w:rPr>
+              <w:t xml:space="preserve">默认 </w:t>
+            </w:r>
+            <w:r>
+              <w:rPr>
+                <w:rFonts w:ascii="Consolas" w:hAnsi="Consolas" w:eastAsia="Consolas"/>
+                <w:b w:val="0"/>
+                <w:color w:val="000000"/>
+                <w:sz w:val="18"/>
+              </w:rPr>
+              <w:t>arm_reach</w:t>
+            </w:r>
+            <w:r>
+              <w:rPr>
+                <w:rFonts w:ascii="Times New Roman" w:hAnsi="Times New Roman" w:eastAsia="宋体"/>
+                <w:b w:val="0"/>
+                <w:color w:val="000000"/>
+                <w:sz w:val="21"/>
+              </w:rPr>
+              <w:t>：判定相关到达/抓取动画；会话全程落盘（eeg/events/manifest）</w:t>
+            </w:r>
+          </w:p>
+        </w:tc>
+      </w:tr>
+    </w:tbl>
+    <w:p>
+      <w:pPr>
+        <w:spacing w:after="60"/>
+      </w:pPr>
+    </w:p>
+    <w:p>
+      <w:pPr>
+        <w:spacing w:line="312" w:lineRule="auto" w:before="0" w:after="120"/>
+        <w:ind w:firstLine="480"/>
+        <w:jc w:val="both"/>
+      </w:pPr>
+      <w:r>
+        <w:rPr>
+          <w:rFonts w:ascii="Times New Roman" w:hAnsi="Times New Roman" w:eastAsia="宋体"/>
+          <w:b w:val="0"/>
+          <w:color w:val="000000"/>
+          <w:sz w:val="24"/>
+        </w:rPr>
+        <w:t xml:space="preserve">会话结束后按 Leave-Next 触发采后 all4 增量微调并晋升个人模型，构成「采集 → 适配 → 再采集」闭环。另有旁路游戏测试路径（v2 · </w:t>
+      </w:r>
+      <w:r>
+        <w:rPr>
+          <w:rFonts w:ascii="Consolas" w:hAnsi="Consolas" w:eastAsia="Consolas"/>
+          <w:b w:val="0"/>
+          <w:color w:val="000000"/>
+          <w:sz w:val="21"/>
+        </w:rPr>
+        <w:t>game_mode=v3_test</w:t>
+      </w:r>
+      <w:r>
+        <w:rPr>
+          <w:rFonts w:ascii="Times New Roman" w:hAnsi="Times New Roman" w:eastAsia="宋体"/>
+          <w:b w:val="0"/>
+          <w:color w:val="000000"/>
+          <w:sz w:val="24"/>
+        </w:rPr>
+        <w:t>，20 试次连击计分）仅用于快速验证权重，</w:t>
+      </w:r>
+      <w:r>
+        <w:rPr>
+          <w:rFonts w:ascii="Times New Roman" w:hAnsi="Times New Roman" w:eastAsia="宋体"/>
+          <w:b/>
+          <w:color w:val="000000"/>
+          <w:sz w:val="24"/>
+        </w:rPr>
+        <w:t>不以该路径作为正式采集口径</w:t>
+      </w:r>
+      <w:r>
+        <w:rPr>
+          <w:rFonts w:ascii="Times New Roman" w:hAnsi="Times New Roman" w:eastAsia="宋体"/>
+          <w:b w:val="0"/>
+          <w:color w:val="000000"/>
+          <w:sz w:val="24"/>
+        </w:rPr>
+        <w:t>。</w:t>
       </w:r>
     </w:p>
     <w:p>
@@ -5838,7 +5284,6 @@
         <w:pStyle w:val="Heading2"/>
         <w:spacing w:line="312" w:lineRule="auto" w:before="200" w:after="160"/>
       </w:pPr>
-      <w:bookmarkStart w:id="100030" w:name="_Toc100030"/>
       <w:r>
         <w:rPr>
           <w:rFonts w:ascii="Times New Roman" w:hAnsi="Times New Roman" w:eastAsia="黑体"/>
@@ -5848,7 +5293,6 @@
         </w:rPr>
         <w:t>8.2 操作台</w:t>
       </w:r>
-      <w:bookmarkEnd w:id="100030"/>
     </w:p>
     <w:p>
       <w:pPr>
@@ -5871,7 +5315,6 @@
         <w:pStyle w:val="Heading2"/>
         <w:spacing w:line="312" w:lineRule="auto" w:before="200" w:after="160"/>
       </w:pPr>
-      <w:bookmarkStart w:id="100031" w:name="_Toc100031"/>
       <w:r>
         <w:rPr>
           <w:rFonts w:ascii="Times New Roman" w:hAnsi="Times New Roman" w:eastAsia="黑体"/>
@@ -5881,7 +5324,6 @@
         </w:rPr>
         <w:t>8.3 工程与安全</w:t>
       </w:r>
-      <w:bookmarkEnd w:id="100031"/>
     </w:p>
     <w:p>
       <w:pPr>
@@ -5905,7 +5347,6 @@
         <w:spacing w:line="312" w:lineRule="auto" w:before="280" w:after="160"/>
         <w:jc w:val="center"/>
       </w:pPr>
-      <w:bookmarkStart w:id="100032" w:name="_Toc100032"/>
       <w:r>
         <w:rPr>
           <w:rFonts w:ascii="Times New Roman" w:hAnsi="Times New Roman" w:eastAsia="黑体"/>
@@ -5915,7 +5356,6 @@
         </w:rPr>
         <w:t>9. 离线实验验证</w:t>
       </w:r>
-      <w:bookmarkEnd w:id="100032"/>
     </w:p>
     <w:p>
       <w:pPr>
@@ -5938,7 +5378,6 @@
         <w:pStyle w:val="Heading2"/>
         <w:spacing w:line="312" w:lineRule="auto" w:before="200" w:after="160"/>
       </w:pPr>
-      <w:bookmarkStart w:id="100033" w:name="_Toc100033"/>
       <w:r>
         <w:rPr>
           <w:rFonts w:ascii="Times New Roman" w:hAnsi="Times New Roman" w:eastAsia="黑体"/>
@@ -5948,7 +5387,6 @@
         </w:rPr>
         <w:t>9.1 OpenBMI 主结果（54 人五折，三分类）</w:t>
       </w:r>
-      <w:bookmarkEnd w:id="100033"/>
     </w:p>
     <w:p>
       <w:pPr>
@@ -6921,7 +6359,6 @@
         <w:pStyle w:val="Heading2"/>
         <w:spacing w:line="312" w:lineRule="auto" w:before="200" w:after="160"/>
       </w:pPr>
-      <w:bookmarkStart w:id="100034" w:name="_Toc100034"/>
       <w:r>
         <w:rPr>
           <w:rFonts w:ascii="Times New Roman" w:hAnsi="Times New Roman" w:eastAsia="黑体"/>
@@ -6931,7 +6368,6 @@
         </w:rPr>
         <w:t>9.2 基线与消融</w:t>
       </w:r>
-      <w:bookmarkEnd w:id="100034"/>
     </w:p>
     <w:p>
       <w:pPr>
@@ -6954,7 +6390,6 @@
         <w:pStyle w:val="Heading2"/>
         <w:spacing w:line="312" w:lineRule="auto" w:before="200" w:after="160"/>
       </w:pPr>
-      <w:bookmarkStart w:id="100035" w:name="_Toc100035"/>
       <w:r>
         <w:rPr>
           <w:rFonts w:ascii="Times New Roman" w:hAnsi="Times New Roman" w:eastAsia="黑体"/>
@@ -6964,7 +6399,6 @@
         </w:rPr>
         <w:t>9.3 BCI2a Leave-Next 仿真</w:t>
       </w:r>
-      <w:bookmarkEnd w:id="100035"/>
     </w:p>
     <w:p>
       <w:pPr>
@@ -6979,7 +6413,25 @@
           <w:color w:val="000000"/>
           <w:sz w:val="24"/>
         </w:rPr>
-        <w:t xml:space="preserve">9 名被试各 6 轮采后微调仿真，末档（R5）九人均值：all4 </w:t>
+        <w:t>9 名被试各 6 轮采后微调仿真（stamp=</w:t>
+      </w:r>
+      <w:r>
+        <w:rPr>
+          <w:rFonts w:ascii="Consolas" w:hAnsi="Consolas" w:eastAsia="Consolas"/>
+          <w:b w:val="0"/>
+          <w:color w:val="000000"/>
+          <w:sz w:val="21"/>
+        </w:rPr>
+        <w:t>20260901_124502</w:t>
+      </w:r>
+      <w:r>
+        <w:rPr>
+          <w:rFonts w:ascii="Times New Roman" w:hAnsi="Times New Roman" w:eastAsia="宋体"/>
+          <w:b w:val="0"/>
+          <w:color w:val="000000"/>
+          <w:sz w:val="24"/>
+        </w:rPr>
+        <w:t xml:space="preserve">，当前方法复跑），末档（R5）九人 μ±σ：all4 force </w:t>
       </w:r>
       <w:r>
         <w:rPr>
@@ -6988,7 +6440,7 @@
           <w:color w:val="000000"/>
           <w:sz w:val="24"/>
         </w:rPr>
-        <w:t>0.671</w:t>
+        <w:t>0.663±0.067</w:t>
       </w:r>
       <w:r>
         <w:rPr>
@@ -6997,7 +6449,79 @@
           <w:color w:val="000000"/>
           <w:sz w:val="24"/>
         </w:rPr>
-        <w:t xml:space="preserve"> vs 单成员 0.445，零样本 0.338；all4 在 9 人中 8 人 ≥0.62，最大个体 0.764。逐被试与逐轮明细见 Excel sheet 03。</w:t>
+        <w:t xml:space="preserve"> vs 单成员 so force </w:t>
+      </w:r>
+      <w:r>
+        <w:rPr>
+          <w:rFonts w:ascii="Times New Roman" w:hAnsi="Times New Roman" w:eastAsia="宋体"/>
+          <w:b/>
+          <w:color w:val="000000"/>
+          <w:sz w:val="24"/>
+        </w:rPr>
+        <w:t>0.452±0.047</w:t>
+      </w:r>
+      <w:r>
+        <w:rPr>
+          <w:rFonts w:ascii="Times New Roman" w:hAnsi="Times New Roman" w:eastAsia="宋体"/>
+          <w:b w:val="0"/>
+          <w:color w:val="000000"/>
+          <w:sz w:val="24"/>
+        </w:rPr>
+        <w:t xml:space="preserve">（Δ+0.211），零样本 R0 0.338；all4 在 9 人中 </w:t>
+      </w:r>
+      <w:r>
+        <w:rPr>
+          <w:rFonts w:ascii="Times New Roman" w:hAnsi="Times New Roman" w:eastAsia="宋体"/>
+          <w:b/>
+          <w:color w:val="000000"/>
+          <w:sz w:val="24"/>
+        </w:rPr>
+        <w:t>7</w:t>
+      </w:r>
+      <w:r>
+        <w:rPr>
+          <w:rFonts w:ascii="Times New Roman" w:hAnsi="Times New Roman" w:eastAsia="宋体"/>
+          <w:b w:val="0"/>
+          <w:color w:val="000000"/>
+          <w:sz w:val="24"/>
+        </w:rPr>
+        <w:t xml:space="preserve"> 人 ≥0.62，最大个体 A09 </w:t>
+      </w:r>
+      <w:r>
+        <w:rPr>
+          <w:rFonts w:ascii="Times New Roman" w:hAnsi="Times New Roman" w:eastAsia="宋体"/>
+          <w:b/>
+          <w:color w:val="000000"/>
+          <w:sz w:val="24"/>
+        </w:rPr>
+        <w:t>0.756</w:t>
+      </w:r>
+      <w:r>
+        <w:rPr>
+          <w:rFonts w:ascii="Times New Roman" w:hAnsi="Times New Roman" w:eastAsia="宋体"/>
+          <w:b w:val="0"/>
+          <w:color w:val="000000"/>
+          <w:sz w:val="24"/>
+        </w:rPr>
+        <w:t xml:space="preserve">。逐被试与逐轮明细见 Excel sheet 03；与旧跑 </w:t>
+      </w:r>
+      <w:r>
+        <w:rPr>
+          <w:rFonts w:ascii="Consolas" w:hAnsi="Consolas" w:eastAsia="Consolas"/>
+          <w:b w:val="0"/>
+          <w:color w:val="000000"/>
+          <w:sz w:val="21"/>
+        </w:rPr>
+        <w:t>20260829_235900</w:t>
+      </w:r>
+      <w:r>
+        <w:rPr>
+          <w:rFonts w:ascii="Times New Roman" w:hAnsi="Times New Roman" w:eastAsia="宋体"/>
+          <w:b w:val="0"/>
+          <w:color w:val="000000"/>
+          <w:sz w:val="24"/>
+        </w:rPr>
+        <w:t xml:space="preserve"> 末档均值差约 ±1 pp，主结论稳定。</w:t>
       </w:r>
     </w:p>
     <w:p>
@@ -7005,7 +6529,6 @@
         <w:pStyle w:val="Heading2"/>
         <w:spacing w:line="312" w:lineRule="auto" w:before="200" w:after="160"/>
       </w:pPr>
-      <w:bookmarkStart w:id="100036" w:name="_Toc100036"/>
       <w:r>
         <w:rPr>
           <w:rFonts w:ascii="Times New Roman" w:hAnsi="Times New Roman" w:eastAsia="黑体"/>
@@ -7015,7 +6538,6 @@
         </w:rPr>
         <w:t>9.4 Stieger 跨库伪在线</w:t>
       </w:r>
-      <w:bookmarkEnd w:id="100036"/>
     </w:p>
     <w:p>
       <w:pPr>
@@ -7038,7 +6560,6 @@
         <w:pStyle w:val="Heading2"/>
         <w:spacing w:line="312" w:lineRule="auto" w:before="200" w:after="160"/>
       </w:pPr>
-      <w:bookmarkStart w:id="100037" w:name="_Toc100037"/>
       <w:r>
         <w:rPr>
           <w:rFonts w:ascii="Times New Roman" w:hAnsi="Times New Roman" w:eastAsia="黑体"/>
@@ -7048,7 +6569,6 @@
         </w:rPr>
         <w:t>9.5 真实被试验证</w:t>
       </w:r>
-      <w:bookmarkEnd w:id="100037"/>
     </w:p>
     <w:p>
       <w:pPr>
@@ -7063,7 +6583,97 @@
           <w:color w:val="000000"/>
           <w:sz w:val="24"/>
         </w:rPr>
-        <w:t>6 名 v3 范式被试 Leave-Next 复验（2026-08-30）：最优个体 syj0828 末档窗级 0.916（MI 试次 34/36、Rest 16/18、总分 42/45，门控 PASS）；被试间差异 0.35–0.92。全部明细见 Excel sheet 05。</w:t>
+        <w:t xml:space="preserve">10 名 v3 范式被试 Leave-Next all4 全表（口径方案 A，报告 </w:t>
+      </w:r>
+      <w:r>
+        <w:rPr>
+          <w:rFonts w:ascii="Consolas" w:hAnsi="Consolas" w:eastAsia="Consolas"/>
+          <w:b w:val="0"/>
+          <w:color w:val="000000"/>
+          <w:sz w:val="21"/>
+        </w:rPr>
+        <w:t>leave_next_all4_full_report_20260831_233943</w:t>
+      </w:r>
+      <w:r>
+        <w:rPr>
+          <w:rFonts w:ascii="Times New Roman" w:hAnsi="Times New Roman" w:eastAsia="宋体"/>
+          <w:b w:val="0"/>
+          <w:color w:val="000000"/>
+          <w:sz w:val="24"/>
+        </w:rPr>
+        <w:t xml:space="preserve">，含 2026-09-01 被试 ytl0901）：最优个体 </w:t>
+      </w:r>
+      <w:r>
+        <w:rPr>
+          <w:rFonts w:ascii="Times New Roman" w:hAnsi="Times New Roman" w:eastAsia="宋体"/>
+          <w:b/>
+          <w:color w:val="000000"/>
+          <w:sz w:val="24"/>
+        </w:rPr>
+        <w:t>syj0828</w:t>
+      </w:r>
+      <w:r>
+        <w:rPr>
+          <w:rFonts w:ascii="Times New Roman" w:hAnsi="Times New Roman" w:eastAsia="宋体"/>
+          <w:b w:val="0"/>
+          <w:color w:val="000000"/>
+          <w:sz w:val="24"/>
+        </w:rPr>
+        <w:t xml:space="preserve"> 末档窗级 smooth </w:t>
+      </w:r>
+      <w:r>
+        <w:rPr>
+          <w:rFonts w:ascii="Times New Roman" w:hAnsi="Times New Roman" w:eastAsia="宋体"/>
+          <w:b/>
+          <w:color w:val="000000"/>
+          <w:sz w:val="24"/>
+        </w:rPr>
+        <w:t>0.924</w:t>
+      </w:r>
+      <w:r>
+        <w:rPr>
+          <w:rFonts w:ascii="Times New Roman" w:hAnsi="Times New Roman" w:eastAsia="宋体"/>
+          <w:b w:val="0"/>
+          <w:color w:val="000000"/>
+          <w:sz w:val="24"/>
+        </w:rPr>
+        <w:t xml:space="preserve">（F5 41.5/45，MI 33/36、Rest 17/18，门控 </w:t>
+      </w:r>
+      <w:r>
+        <w:rPr>
+          <w:rFonts w:ascii="Times New Roman" w:hAnsi="Times New Roman" w:eastAsia="宋体"/>
+          <w:b/>
+          <w:color w:val="000000"/>
+          <w:sz w:val="24"/>
+        </w:rPr>
+        <w:t>5/5 PASS</w:t>
+      </w:r>
+      <w:r>
+        <w:rPr>
+          <w:rFonts w:ascii="Times New Roman" w:hAnsi="Times New Roman" w:eastAsia="宋体"/>
+          <w:b w:val="0"/>
+          <w:color w:val="000000"/>
+          <w:sz w:val="24"/>
+        </w:rPr>
+        <w:t xml:space="preserve">）；全表门控 </w:t>
+      </w:r>
+      <w:r>
+        <w:rPr>
+          <w:rFonts w:ascii="Times New Roman" w:hAnsi="Times New Roman" w:eastAsia="宋体"/>
+          <w:b/>
+          <w:color w:val="000000"/>
+          <w:sz w:val="24"/>
+        </w:rPr>
+        <w:t>20/50 PASS</w:t>
+      </w:r>
+      <w:r>
+        <w:rPr>
+          <w:rFonts w:ascii="Times New Roman" w:hAnsi="Times New Roman" w:eastAsia="宋体"/>
+          <w:b w:val="0"/>
+          <w:color w:val="000000"/>
+          <w:sz w:val="24"/>
+        </w:rPr>
+        <w:t>；末档窗级约 0.35–0.92。全部明细见 Excel sheet 05。</w:t>
       </w:r>
     </w:p>
     <w:p>
@@ -7071,7 +6681,6 @@
         <w:pStyle w:val="Heading2"/>
         <w:spacing w:line="312" w:lineRule="auto" w:before="200" w:after="160"/>
       </w:pPr>
-      <w:bookmarkStart w:id="100038" w:name="_Toc100038"/>
       <w:r>
         <w:rPr>
           <w:rFonts w:ascii="Times New Roman" w:hAnsi="Times New Roman" w:eastAsia="黑体"/>
@@ -7081,7 +6690,6 @@
         </w:rPr>
         <w:t>9.6 运算延迟</w:t>
       </w:r>
-      <w:bookmarkEnd w:id="100038"/>
     </w:p>
     <w:tbl>
       <w:tblPr>
@@ -7307,11 +6915,755 @@
     </w:p>
     <w:p>
       <w:pPr>
+        <w:pStyle w:val="Heading2"/>
+        <w:spacing w:line="312" w:lineRule="auto" w:before="200" w:after="160"/>
+      </w:pPr>
+      <w:r>
+        <w:rPr>
+          <w:rFonts w:ascii="Times New Roman" w:hAnsi="Times New Roman" w:eastAsia="黑体"/>
+          <w:b/>
+          <w:color w:val="000000"/>
+          <w:sz w:val="30"/>
+        </w:rPr>
+        <w:t>9.7 主办方指定标准数据集（Challenge MI · Exp34–40）</w:t>
+      </w:r>
+    </w:p>
+    <w:p>
+      <w:pPr>
+        <w:spacing w:line="312" w:lineRule="auto" w:before="0" w:after="120"/>
+        <w:ind w:firstLine="480"/>
+        <w:jc w:val="both"/>
+      </w:pPr>
+      <w:r>
+        <w:rPr>
+          <w:rFonts w:ascii="Times New Roman" w:hAnsi="Times New Roman" w:eastAsia="宋体"/>
+          <w:b/>
+          <w:color w:val="000000"/>
+          <w:sz w:val="24"/>
+        </w:rPr>
+        <w:t>交卷口径</w:t>
+      </w:r>
+      <w:r>
+        <w:rPr>
+          <w:rFonts w:ascii="Times New Roman" w:hAnsi="Times New Roman" w:eastAsia="宋体"/>
+          <w:b w:val="0"/>
+          <w:color w:val="000000"/>
+          <w:sz w:val="24"/>
+        </w:rPr>
+        <w:t xml:space="preserve">：指定集提交 </w:t>
+      </w:r>
+      <w:r>
+        <w:rPr>
+          <w:rFonts w:ascii="Times New Roman" w:hAnsi="Times New Roman" w:eastAsia="宋体"/>
+          <w:b/>
+          <w:color w:val="000000"/>
+          <w:sz w:val="24"/>
+        </w:rPr>
+        <w:t>59ch 从零 E1f-A59（S0）</w:t>
+      </w:r>
+      <w:r>
+        <w:rPr>
+          <w:rFonts w:ascii="Times New Roman" w:hAnsi="Times New Roman" w:eastAsia="宋体"/>
+          <w:b w:val="0"/>
+          <w:color w:val="000000"/>
+          <w:sz w:val="24"/>
+        </w:rPr>
+        <w:t>。OpenBMI 预训练用于系统底座与公开库主结果，</w:t>
+      </w:r>
+      <w:r>
+        <w:rPr>
+          <w:rFonts w:ascii="Times New Roman" w:hAnsi="Times New Roman" w:eastAsia="宋体"/>
+          <w:b/>
+          <w:color w:val="000000"/>
+          <w:sz w:val="24"/>
+        </w:rPr>
+        <w:t>不是</w:t>
+      </w:r>
+      <w:r>
+        <w:rPr>
+          <w:rFonts w:ascii="Times New Roman" w:hAnsi="Times New Roman" w:eastAsia="宋体"/>
+          <w:b w:val="0"/>
+          <w:color w:val="000000"/>
+          <w:sz w:val="24"/>
+        </w:rPr>
+        <w:t>指定集交卷依赖。备选 OpenBMI→8ch FT（R-B8）已完整登记并归档。</w:t>
+      </w:r>
+    </w:p>
+    <w:p>
+      <w:pPr>
+        <w:spacing w:line="312" w:lineRule="auto" w:before="0" w:after="120"/>
+        <w:ind w:firstLine="480"/>
+        <w:jc w:val="both"/>
+      </w:pPr>
+      <w:r>
+        <w:rPr>
+          <w:rFonts w:ascii="Times New Roman" w:hAnsi="Times New Roman" w:eastAsia="宋体"/>
+          <w:b/>
+          <w:color w:val="000000"/>
+          <w:sz w:val="24"/>
+        </w:rPr>
+        <w:t>主读数尺子</w:t>
+      </w:r>
+      <w:r>
+        <w:rPr>
+          <w:rFonts w:ascii="Times New Roman" w:hAnsi="Times New Roman" w:eastAsia="宋体"/>
+          <w:b w:val="0"/>
+          <w:color w:val="000000"/>
+          <w:sz w:val="24"/>
+        </w:rPr>
+        <w:t>：leave-fold 嵌套 Val；折内读数双标注附报。</w:t>
+      </w:r>
+    </w:p>
+    <w:tbl>
+      <w:tblPr>
+        <w:tblStyle w:val="TableGrid"/>
+        <w:tblW w:type="auto" w:w="0"/>
+        <w:jc w:val="center"/>
+        <w:tblLook w:firstColumn="1" w:firstRow="1" w:lastColumn="0" w:lastRow="0" w:noHBand="0" w:noVBand="1" w:val="04A0"/>
+        <w:tblCellMar>
+          <w:top w:w="40" w:type="dxa"/>
+          <w:bottom w:w="40" w:type="dxa"/>
+          <w:left w:w="80" w:type="dxa"/>
+          <w:right w:w="80" w:type="dxa"/>
+        </w:tblCellMar>
+      </w:tblPr>
+      <w:tblGrid>
+        <w:gridCol w:w="2176"/>
+        <w:gridCol w:w="2176"/>
+        <w:gridCol w:w="2176"/>
+        <w:gridCol w:w="2176"/>
+      </w:tblGrid>
+      <w:tr>
+        <w:trPr>
+          <w:cantSplit/>
+          <w:tblHeader/>
+        </w:trPr>
+        <w:tc>
+          <w:tcPr>
+            <w:tcW w:type="dxa" w:w="2176"/>
+            <w:shd w:val="clear" w:fill="D9E2F3"/>
+          </w:tcPr>
+          <w:p>
+            <w:pPr>
+              <w:spacing w:line="276" w:lineRule="auto"/>
+              <w:jc w:val="center"/>
+            </w:pPr>
+            <w:r>
+              <w:rPr>
+                <w:rFonts w:ascii="Times New Roman" w:hAnsi="Times New Roman" w:eastAsia="宋体"/>
+                <w:b/>
+                <w:color w:val="000000"/>
+                <w:sz w:val="21"/>
+              </w:rPr>
+              <w:t>口径</w:t>
+            </w:r>
+          </w:p>
+        </w:tc>
+        <w:tc>
+          <w:tcPr>
+            <w:tcW w:type="dxa" w:w="2176"/>
+            <w:shd w:val="clear" w:fill="D9E2F3"/>
+          </w:tcPr>
+          <w:p>
+            <w:pPr>
+              <w:spacing w:line="276" w:lineRule="auto"/>
+              <w:jc w:val="center"/>
+            </w:pPr>
+            <w:r>
+              <w:rPr>
+                <w:rFonts w:ascii="Times New Roman" w:hAnsi="Times New Roman" w:eastAsia="宋体"/>
+                <w:b/>
+                <w:color w:val="000000"/>
+                <w:sz w:val="21"/>
+              </w:rPr>
+              <w:t>栈</w:t>
+            </w:r>
+          </w:p>
+        </w:tc>
+        <w:tc>
+          <w:tcPr>
+            <w:tcW w:type="dxa" w:w="2176"/>
+            <w:shd w:val="clear" w:fill="D9E2F3"/>
+          </w:tcPr>
+          <w:p>
+            <w:pPr>
+              <w:spacing w:line="276" w:lineRule="auto"/>
+              <w:jc w:val="center"/>
+            </w:pPr>
+            <w:r>
+              <w:rPr>
+                <w:rFonts w:ascii="Times New Roman" w:hAnsi="Times New Roman" w:eastAsia="宋体"/>
+                <w:b/>
+                <w:color w:val="000000"/>
+                <w:sz w:val="21"/>
+              </w:rPr>
+              <w:t>Acc mean±std</w:t>
+            </w:r>
+          </w:p>
+        </w:tc>
+        <w:tc>
+          <w:tcPr>
+            <w:tcW w:type="dxa" w:w="2176"/>
+            <w:shd w:val="clear" w:fill="D9E2F3"/>
+          </w:tcPr>
+          <w:p>
+            <w:pPr>
+              <w:spacing w:line="276" w:lineRule="auto"/>
+              <w:jc w:val="center"/>
+            </w:pPr>
+            <w:r>
+              <w:rPr>
+                <w:rFonts w:ascii="Times New Roman" w:hAnsi="Times New Roman" w:eastAsia="宋体"/>
+                <w:b/>
+                <w:color w:val="000000"/>
+                <w:sz w:val="21"/>
+              </w:rPr>
+              <w:t>角色</w:t>
+            </w:r>
+          </w:p>
+        </w:tc>
+      </w:tr>
+      <w:tr>
+        <w:trPr>
+          <w:cantSplit/>
+        </w:trPr>
+        <w:tc>
+          <w:tcPr>
+            <w:tcW w:type="dxa" w:w="2176"/>
+          </w:tcPr>
+          <w:p>
+            <w:pPr>
+              <w:spacing w:line="276" w:lineRule="auto"/>
+              <w:jc w:val="left"/>
+            </w:pPr>
+            <w:r>
+              <w:rPr>
+                <w:rFonts w:ascii="Times New Roman" w:hAnsi="Times New Roman" w:eastAsia="宋体"/>
+                <w:b/>
+                <w:color w:val="000000"/>
+                <w:sz w:val="21"/>
+              </w:rPr>
+              <w:t>嵌套（交卷主读）</w:t>
+            </w:r>
+          </w:p>
+        </w:tc>
+        <w:tc>
+          <w:tcPr>
+            <w:tcW w:type="dxa" w:w="2176"/>
+          </w:tcPr>
+          <w:p>
+            <w:pPr>
+              <w:spacing w:line="276" w:lineRule="auto"/>
+              <w:jc w:val="left"/>
+            </w:pPr>
+            <w:r>
+              <w:rPr>
+                <w:rFonts w:ascii="Times New Roman" w:hAnsi="Times New Roman" w:eastAsia="宋体"/>
+                <w:b/>
+                <w:color w:val="000000"/>
+                <w:sz w:val="21"/>
+              </w:rPr>
+              <w:t>E1f-A59（N0 / S0）</w:t>
+            </w:r>
+          </w:p>
+        </w:tc>
+        <w:tc>
+          <w:tcPr>
+            <w:tcW w:type="dxa" w:w="2176"/>
+          </w:tcPr>
+          <w:p>
+            <w:pPr>
+              <w:spacing w:line="276" w:lineRule="auto"/>
+              <w:jc w:val="left"/>
+            </w:pPr>
+            <w:r>
+              <w:rPr>
+                <w:rFonts w:ascii="Times New Roman" w:hAnsi="Times New Roman" w:eastAsia="宋体"/>
+                <w:b/>
+                <w:color w:val="000000"/>
+                <w:sz w:val="21"/>
+              </w:rPr>
+              <w:t>0.511±0.066</w:t>
+            </w:r>
+          </w:p>
+        </w:tc>
+        <w:tc>
+          <w:tcPr>
+            <w:tcW w:type="dxa" w:w="2176"/>
+          </w:tcPr>
+          <w:p>
+            <w:pPr>
+              <w:spacing w:line="276" w:lineRule="auto"/>
+              <w:jc w:val="left"/>
+            </w:pPr>
+            <w:r>
+              <w:rPr>
+                <w:rFonts w:ascii="Times New Roman" w:hAnsi="Times New Roman" w:eastAsia="宋体"/>
+                <w:b/>
+                <w:color w:val="000000"/>
+                <w:sz w:val="21"/>
+              </w:rPr>
+              <w:t>提交 CSV</w:t>
+            </w:r>
+          </w:p>
+        </w:tc>
+      </w:tr>
+      <w:tr>
+        <w:trPr>
+          <w:cantSplit/>
+        </w:trPr>
+        <w:tc>
+          <w:tcPr>
+            <w:tcW w:type="dxa" w:w="2176"/>
+          </w:tcPr>
+          <w:p>
+            <w:pPr>
+              <w:spacing w:line="276" w:lineRule="auto"/>
+              <w:jc w:val="left"/>
+            </w:pPr>
+            <w:r>
+              <w:rPr>
+                <w:rFonts w:ascii="Times New Roman" w:hAnsi="Times New Roman" w:eastAsia="宋体"/>
+                <w:b w:val="0"/>
+                <w:color w:val="000000"/>
+                <w:sz w:val="21"/>
+              </w:rPr>
+              <w:t>折内（交卷双标注）</w:t>
+            </w:r>
+          </w:p>
+        </w:tc>
+        <w:tc>
+          <w:tcPr>
+            <w:tcW w:type="dxa" w:w="2176"/>
+          </w:tcPr>
+          <w:p>
+            <w:pPr>
+              <w:spacing w:line="276" w:lineRule="auto"/>
+              <w:jc w:val="left"/>
+            </w:pPr>
+            <w:r>
+              <w:rPr>
+                <w:rFonts w:ascii="Times New Roman" w:hAnsi="Times New Roman" w:eastAsia="宋体"/>
+                <w:b w:val="0"/>
+                <w:color w:val="000000"/>
+                <w:sz w:val="21"/>
+              </w:rPr>
+              <w:t>E1f-A59</w:t>
+            </w:r>
+          </w:p>
+        </w:tc>
+        <w:tc>
+          <w:tcPr>
+            <w:tcW w:type="dxa" w:w="2176"/>
+          </w:tcPr>
+          <w:p>
+            <w:pPr>
+              <w:spacing w:line="276" w:lineRule="auto"/>
+              <w:jc w:val="left"/>
+            </w:pPr>
+            <w:r>
+              <w:rPr>
+                <w:rFonts w:ascii="Times New Roman" w:hAnsi="Times New Roman" w:eastAsia="宋体"/>
+                <w:b w:val="0"/>
+                <w:color w:val="000000"/>
+                <w:sz w:val="21"/>
+              </w:rPr>
+              <w:t>0.558±0.069</w:t>
+            </w:r>
+          </w:p>
+        </w:tc>
+        <w:tc>
+          <w:tcPr>
+            <w:tcW w:type="dxa" w:w="2176"/>
+          </w:tcPr>
+          <w:p>
+            <w:pPr>
+              <w:spacing w:line="276" w:lineRule="auto"/>
+              <w:jc w:val="left"/>
+            </w:pPr>
+            <w:r>
+              <w:rPr>
+                <w:rFonts w:ascii="Times New Roman" w:hAnsi="Times New Roman" w:eastAsia="宋体"/>
+                <w:b w:val="0"/>
+                <w:color w:val="000000"/>
+                <w:sz w:val="21"/>
+              </w:rPr>
+              <w:t>同文件；相对嵌套乐观 ≈+4.7pp</w:t>
+            </w:r>
+          </w:p>
+        </w:tc>
+      </w:tr>
+      <w:tr>
+        <w:trPr>
+          <w:cantSplit/>
+        </w:trPr>
+        <w:tc>
+          <w:tcPr>
+            <w:tcW w:type="dxa" w:w="2176"/>
+          </w:tcPr>
+          <w:p>
+            <w:pPr>
+              <w:spacing w:line="276" w:lineRule="auto"/>
+              <w:jc w:val="left"/>
+            </w:pPr>
+            <w:r>
+              <w:rPr>
+                <w:rFonts w:ascii="Times New Roman" w:hAnsi="Times New Roman" w:eastAsia="宋体"/>
+                <w:b w:val="0"/>
+                <w:color w:val="000000"/>
+                <w:sz w:val="21"/>
+              </w:rPr>
+              <w:t>嵌套（备选归档）</w:t>
+            </w:r>
+          </w:p>
+        </w:tc>
+        <w:tc>
+          <w:tcPr>
+            <w:tcW w:type="dxa" w:w="2176"/>
+          </w:tcPr>
+          <w:p>
+            <w:pPr>
+              <w:spacing w:line="276" w:lineRule="auto"/>
+              <w:jc w:val="left"/>
+            </w:pPr>
+            <w:r>
+              <w:rPr>
+                <w:rFonts w:ascii="Times New Roman" w:hAnsi="Times New Roman" w:eastAsia="宋体"/>
+                <w:b w:val="0"/>
+                <w:color w:val="000000"/>
+                <w:sz w:val="21"/>
+              </w:rPr>
+              <w:t>E1f-B8-ft（R-B8）</w:t>
+            </w:r>
+          </w:p>
+        </w:tc>
+        <w:tc>
+          <w:tcPr>
+            <w:tcW w:type="dxa" w:w="2176"/>
+          </w:tcPr>
+          <w:p>
+            <w:pPr>
+              <w:spacing w:line="276" w:lineRule="auto"/>
+              <w:jc w:val="left"/>
+            </w:pPr>
+            <w:r>
+              <w:rPr>
+                <w:rFonts w:ascii="Times New Roman" w:hAnsi="Times New Roman" w:eastAsia="宋体"/>
+                <w:b w:val="0"/>
+                <w:color w:val="000000"/>
+                <w:sz w:val="21"/>
+              </w:rPr>
+              <w:t>0.540±0.146</w:t>
+            </w:r>
+          </w:p>
+        </w:tc>
+        <w:tc>
+          <w:tcPr>
+            <w:tcW w:type="dxa" w:w="2176"/>
+          </w:tcPr>
+          <w:p>
+            <w:pPr>
+              <w:spacing w:line="276" w:lineRule="auto"/>
+              <w:jc w:val="left"/>
+            </w:pPr>
+            <w:r>
+              <w:rPr>
+                <w:rFonts w:ascii="Times New Roman" w:hAnsi="Times New Roman" w:eastAsia="宋体"/>
+                <w:b w:val="0"/>
+                <w:color w:val="000000"/>
+                <w:sz w:val="21"/>
+              </w:rPr>
+              <w:t>Exp39 §5 程序终态；Exp40 风险否决</w:t>
+            </w:r>
+          </w:p>
+        </w:tc>
+      </w:tr>
+      <w:tr>
+        <w:trPr>
+          <w:cantSplit/>
+        </w:trPr>
+        <w:tc>
+          <w:tcPr>
+            <w:tcW w:type="dxa" w:w="2176"/>
+          </w:tcPr>
+          <w:p>
+            <w:pPr>
+              <w:spacing w:line="276" w:lineRule="auto"/>
+              <w:jc w:val="left"/>
+            </w:pPr>
+            <w:r>
+              <w:rPr>
+                <w:rFonts w:ascii="Times New Roman" w:hAnsi="Times New Roman" w:eastAsia="宋体"/>
+                <w:b w:val="0"/>
+                <w:color w:val="000000"/>
+                <w:sz w:val="21"/>
+              </w:rPr>
+              <w:t>折内（备选附报）</w:t>
+            </w:r>
+          </w:p>
+        </w:tc>
+        <w:tc>
+          <w:tcPr>
+            <w:tcW w:type="dxa" w:w="2176"/>
+          </w:tcPr>
+          <w:p>
+            <w:pPr>
+              <w:spacing w:line="276" w:lineRule="auto"/>
+              <w:jc w:val="left"/>
+            </w:pPr>
+            <w:r>
+              <w:rPr>
+                <w:rFonts w:ascii="Times New Roman" w:hAnsi="Times New Roman" w:eastAsia="宋体"/>
+                <w:b w:val="0"/>
+                <w:color w:val="000000"/>
+                <w:sz w:val="21"/>
+              </w:rPr>
+              <w:t>E1f-B8-ft</w:t>
+            </w:r>
+          </w:p>
+        </w:tc>
+        <w:tc>
+          <w:tcPr>
+            <w:tcW w:type="dxa" w:w="2176"/>
+          </w:tcPr>
+          <w:p>
+            <w:pPr>
+              <w:spacing w:line="276" w:lineRule="auto"/>
+              <w:jc w:val="left"/>
+            </w:pPr>
+            <w:r>
+              <w:rPr>
+                <w:rFonts w:ascii="Times New Roman" w:hAnsi="Times New Roman" w:eastAsia="宋体"/>
+                <w:b w:val="0"/>
+                <w:color w:val="000000"/>
+                <w:sz w:val="21"/>
+              </w:rPr>
+              <w:t>0.573±0.140</w:t>
+            </w:r>
+          </w:p>
+        </w:tc>
+        <w:tc>
+          <w:tcPr>
+            <w:tcW w:type="dxa" w:w="2176"/>
+          </w:tcPr>
+          <w:p>
+            <w:pPr>
+              <w:spacing w:line="276" w:lineRule="auto"/>
+              <w:jc w:val="left"/>
+            </w:pPr>
+            <w:r>
+              <w:rPr>
+                <w:rFonts w:ascii="Times New Roman" w:hAnsi="Times New Roman" w:eastAsia="宋体"/>
+                <w:b w:val="0"/>
+                <w:color w:val="000000"/>
+                <w:sz w:val="21"/>
+              </w:rPr>
+              <w:t>Exp34</w:t>
+            </w:r>
+          </w:p>
+        </w:tc>
+      </w:tr>
+      <w:tr>
+        <w:trPr>
+          <w:cantSplit/>
+        </w:trPr>
+        <w:tc>
+          <w:tcPr>
+            <w:tcW w:type="dxa" w:w="2176"/>
+          </w:tcPr>
+          <w:p>
+            <w:pPr>
+              <w:spacing w:line="276" w:lineRule="auto"/>
+              <w:jc w:val="left"/>
+            </w:pPr>
+            <w:r>
+              <w:rPr>
+                <w:rFonts w:ascii="Times New Roman" w:hAnsi="Times New Roman" w:eastAsia="宋体"/>
+                <w:b w:val="0"/>
+                <w:color w:val="000000"/>
+                <w:sz w:val="21"/>
+              </w:rPr>
+              <w:t>嵌套（附报）</w:t>
+            </w:r>
+          </w:p>
+        </w:tc>
+        <w:tc>
+          <w:tcPr>
+            <w:tcW w:type="dxa" w:w="2176"/>
+          </w:tcPr>
+          <w:p>
+            <w:pPr>
+              <w:spacing w:line="276" w:lineRule="auto"/>
+              <w:jc w:val="left"/>
+            </w:pPr>
+            <w:r>
+              <w:rPr>
+                <w:rFonts w:ascii="Times New Roman" w:hAnsi="Times New Roman" w:eastAsia="宋体"/>
+                <w:b w:val="0"/>
+                <w:color w:val="000000"/>
+                <w:sz w:val="21"/>
+              </w:rPr>
+              <w:t>b8_shallow_b</w:t>
+            </w:r>
+          </w:p>
+        </w:tc>
+        <w:tc>
+          <w:tcPr>
+            <w:tcW w:type="dxa" w:w="2176"/>
+          </w:tcPr>
+          <w:p>
+            <w:pPr>
+              <w:spacing w:line="276" w:lineRule="auto"/>
+              <w:jc w:val="left"/>
+            </w:pPr>
+            <w:r>
+              <w:rPr>
+                <w:rFonts w:ascii="Times New Roman" w:hAnsi="Times New Roman" w:eastAsia="宋体"/>
+                <w:b w:val="0"/>
+                <w:color w:val="000000"/>
+                <w:sz w:val="21"/>
+              </w:rPr>
+              <w:t>0.528±0.130</w:t>
+            </w:r>
+          </w:p>
+        </w:tc>
+        <w:tc>
+          <w:tcPr>
+            <w:tcW w:type="dxa" w:w="2176"/>
+          </w:tcPr>
+          <w:p>
+            <w:pPr>
+              <w:spacing w:line="276" w:lineRule="auto"/>
+              <w:jc w:val="left"/>
+            </w:pPr>
+            <w:r>
+              <w:rPr>
+                <w:rFonts w:ascii="Times New Roman" w:hAnsi="Times New Roman" w:eastAsia="宋体"/>
+                <w:b w:val="0"/>
+                <w:color w:val="000000"/>
+                <w:sz w:val="21"/>
+              </w:rPr>
+              <w:t>Exp38 G*</w:t>
+            </w:r>
+          </w:p>
+        </w:tc>
+      </w:tr>
+    </w:tbl>
+    <w:p>
+      <w:pPr>
+        <w:spacing w:after="60"/>
+      </w:pPr>
+    </w:p>
+    <w:p>
+      <w:pPr>
+        <w:spacing w:line="312" w:lineRule="auto" w:before="0" w:after="120"/>
+        <w:ind w:firstLine="480"/>
+        <w:jc w:val="both"/>
+      </w:pPr>
+      <w:r>
+        <w:rPr>
+          <w:rFonts w:ascii="Times New Roman" w:hAnsi="Times New Roman" w:eastAsia="宋体"/>
+          <w:b/>
+          <w:color w:val="000000"/>
+          <w:sz w:val="24"/>
+        </w:rPr>
+        <w:t>方法论要点（150 试次折内融合乐观）</w:t>
+      </w:r>
+      <w:r>
+        <w:rPr>
+          <w:rFonts w:ascii="Times New Roman" w:hAnsi="Times New Roman" w:eastAsia="宋体"/>
+          <w:b w:val="0"/>
+          <w:color w:val="000000"/>
+          <w:sz w:val="24"/>
+        </w:rPr>
+        <w:t xml:space="preserve">：同一 E1f-A59 栈，折内 0.558 相对嵌套 0.511 高约 </w:t>
+      </w:r>
+      <w:r>
+        <w:rPr>
+          <w:rFonts w:ascii="Times New Roman" w:hAnsi="Times New Roman" w:eastAsia="宋体"/>
+          <w:b/>
+          <w:color w:val="000000"/>
+          <w:sz w:val="24"/>
+        </w:rPr>
+        <w:t>+4.7pp</w:t>
+      </w:r>
+      <w:r>
+        <w:rPr>
+          <w:rFonts w:ascii="Times New Roman" w:hAnsi="Times New Roman" w:eastAsia="宋体"/>
+          <w:b w:val="0"/>
+          <w:color w:val="000000"/>
+          <w:sz w:val="24"/>
+        </w:rPr>
+        <w:t>。Exp36 折内跨轨融合曾达 0.604/0.626，嵌套复核后涨点基本消失——说明小样本折内拟合融合权重会产生显著 in-sample 伪影。Exp38–40 在嵌套尺子下均未过加固门槛；算法线已冻结。</w:t>
+      </w:r>
+    </w:p>
+    <w:p>
+      <w:pPr>
+        <w:spacing w:line="312" w:lineRule="auto" w:before="0" w:after="120"/>
+        <w:ind w:firstLine="480"/>
+        <w:jc w:val="both"/>
+      </w:pPr>
+      <w:r>
+        <w:rPr>
+          <w:rFonts w:ascii="Times New Roman" w:hAnsi="Times New Roman" w:eastAsia="宋体"/>
+          <w:b/>
+          <w:color w:val="000000"/>
+          <w:sz w:val="24"/>
+        </w:rPr>
+        <w:t>交卷风险否决（Exp40 补记）</w:t>
+      </w:r>
+      <w:r>
+        <w:rPr>
+          <w:rFonts w:ascii="Times New Roman" w:hAnsi="Times New Roman" w:eastAsia="宋体"/>
+          <w:b w:val="0"/>
+          <w:color w:val="000000"/>
+          <w:sz w:val="24"/>
+        </w:rPr>
+        <w:t>：将 R-B8 的 900 试次 OOF 按折拆开，预测 Rest 占比最高仅约 33%（fold1），而 test 预测 Rest≈</w:t>
+      </w:r>
+      <w:r>
+        <w:rPr>
+          <w:rFonts w:ascii="Times New Roman" w:hAnsi="Times New Roman" w:eastAsia="宋体"/>
+          <w:b/>
+          <w:color w:val="000000"/>
+          <w:sz w:val="24"/>
+        </w:rPr>
+        <w:t>51%</w:t>
+      </w:r>
+      <w:r>
+        <w:rPr>
+          <w:rFonts w:ascii="Times New Roman" w:hAnsi="Times New Roman" w:eastAsia="宋体"/>
+          <w:b w:val="0"/>
+          <w:color w:val="000000"/>
+          <w:sz w:val="24"/>
+        </w:rPr>
+        <w:t>，落在 Val 六折支撑之外；且与 fold0「Rest 仅 12% 后崩到 0.300」方向相反。两栈对 test 皆为外推，但 S0 Val 最差折 0.427、无 0.300 前科，设计均衡下边际上限亦更高（90.8% vs 82.5%）。故提交 S0，R-B8 CSV 保留归档。该决策</w:t>
+      </w:r>
+      <w:r>
+        <w:rPr>
+          <w:rFonts w:ascii="Times New Roman" w:hAnsi="Times New Roman" w:eastAsia="宋体"/>
+          <w:b/>
+          <w:color w:val="000000"/>
+          <w:sz w:val="24"/>
+        </w:rPr>
+        <w:t>未使用 test 标签调参</w:t>
+      </w:r>
+      <w:r>
+        <w:rPr>
+          <w:rFonts w:ascii="Times New Roman" w:hAnsi="Times New Roman" w:eastAsia="宋体"/>
+          <w:b w:val="0"/>
+          <w:color w:val="000000"/>
+          <w:sz w:val="24"/>
+        </w:rPr>
+        <w:t>，未改 Val 过线门槛。明细见 Excel sheet 00/07/11。</w:t>
+      </w:r>
+    </w:p>
+    <w:p>
+      <w:pPr>
         <w:pStyle w:val="Heading1"/>
         <w:spacing w:line="312" w:lineRule="auto" w:before="280" w:after="160"/>
         <w:jc w:val="center"/>
       </w:pPr>
-      <w:bookmarkStart w:id="100039" w:name="_Toc100039"/>
       <w:r>
         <w:rPr>
           <w:rFonts w:ascii="Times New Roman" w:hAnsi="Times New Roman" w:eastAsia="黑体"/>
@@ -7321,7 +7673,6 @@
         </w:rPr>
         <w:t>10. 在线系统集成与演示</w:t>
       </w:r>
-      <w:bookmarkEnd w:id="100039"/>
     </w:p>
     <w:p>
       <w:pPr>
@@ -7345,7 +7696,6 @@
         <w:spacing w:line="312" w:lineRule="auto" w:before="280" w:after="160"/>
         <w:jc w:val="center"/>
       </w:pPr>
-      <w:bookmarkStart w:id="100040" w:name="_Toc100040"/>
       <w:r>
         <w:rPr>
           <w:rFonts w:ascii="Times New Roman" w:hAnsi="Times New Roman" w:eastAsia="黑体"/>
@@ -7355,7 +7705,6 @@
         </w:rPr>
         <w:t>11. 可复现性与提交材料索引</w:t>
       </w:r>
-      <w:bookmarkEnd w:id="100040"/>
     </w:p>
     <w:p>
       <w:pPr>
@@ -7535,7 +7884,6 @@
         <w:spacing w:line="312" w:lineRule="auto" w:before="280" w:after="160"/>
         <w:jc w:val="center"/>
       </w:pPr>
-      <w:bookmarkStart w:id="100041" w:name="_Toc100041"/>
       <w:r>
         <w:rPr>
           <w:rFonts w:ascii="Times New Roman" w:hAnsi="Times New Roman" w:eastAsia="黑体"/>
@@ -7545,7 +7893,6 @@
         </w:rPr>
         <w:t>12. 结论与展望</w:t>
       </w:r>
-      <w:bookmarkEnd w:id="100041"/>
     </w:p>
     <w:p>
       <w:pPr>
@@ -7560,7 +7907,97 @@
           <w:color w:val="000000"/>
           <w:sz w:val="24"/>
         </w:rPr>
-        <w:t>本系统完成了从公开数据预训练、自采数据强化、少样本个体适配到在线游戏化交互的完整 MI-BCI 链路，在 OpenBMI 标准五折上取得三分类 61.88%、真实被试个体适配最优 91.6% 的结果，并将在线单窗前向延迟压至 1.11 ms。后续工作：① 完成不少于 20 名被试采集并以自采数据强化底座；② 接入主办方指定标准数据集复测回填；③ 扩展注意力监测与更多异步控制语义，面向康复辅具落地。</w:t>
+        <w:t xml:space="preserve">本系统完成了从公开数据预训练、指定集从零评测、自采数据强化、少样本个体适配到在线游戏化交互的完整 MI-BCI 链路：OpenBMI 标准五折三分类 </w:t>
+      </w:r>
+      <w:r>
+        <w:rPr>
+          <w:rFonts w:ascii="Times New Roman" w:hAnsi="Times New Roman" w:eastAsia="宋体"/>
+          <w:b/>
+          <w:color w:val="000000"/>
+          <w:sz w:val="24"/>
+        </w:rPr>
+        <w:t>61.88%</w:t>
+      </w:r>
+      <w:r>
+        <w:rPr>
+          <w:rFonts w:ascii="Times New Roman" w:hAnsi="Times New Roman" w:eastAsia="宋体"/>
+          <w:b w:val="0"/>
+          <w:color w:val="000000"/>
+          <w:sz w:val="24"/>
+        </w:rPr>
+        <w:t xml:space="preserve">；主办方指定集交卷 </w:t>
+      </w:r>
+      <w:r>
+        <w:rPr>
+          <w:rFonts w:ascii="Times New Roman" w:hAnsi="Times New Roman" w:eastAsia="宋体"/>
+          <w:b/>
+          <w:color w:val="000000"/>
+          <w:sz w:val="24"/>
+        </w:rPr>
+        <w:t>S0 嵌套主读 0.511</w:t>
+      </w:r>
+      <w:r>
+        <w:rPr>
+          <w:rFonts w:ascii="Times New Roman" w:hAnsi="Times New Roman" w:eastAsia="宋体"/>
+          <w:b w:val="0"/>
+          <w:color w:val="000000"/>
+          <w:sz w:val="24"/>
+        </w:rPr>
+        <w:t xml:space="preserve">（折内双标注 0.558；备选 R-B8=0.540 已归档）；BCI2a Leave-Next 末档 all4 </w:t>
+      </w:r>
+      <w:r>
+        <w:rPr>
+          <w:rFonts w:ascii="Times New Roman" w:hAnsi="Times New Roman" w:eastAsia="宋体"/>
+          <w:b/>
+          <w:color w:val="000000"/>
+          <w:sz w:val="24"/>
+        </w:rPr>
+        <w:t>66.3%</w:t>
+      </w:r>
+      <w:r>
+        <w:rPr>
+          <w:rFonts w:ascii="Times New Roman" w:hAnsi="Times New Roman" w:eastAsia="宋体"/>
+          <w:b w:val="0"/>
+          <w:color w:val="000000"/>
+          <w:sz w:val="24"/>
+        </w:rPr>
+        <w:t xml:space="preserve">（相对 so +21.1 pp）；真实被试个体适配最优 </w:t>
+      </w:r>
+      <w:r>
+        <w:rPr>
+          <w:rFonts w:ascii="Times New Roman" w:hAnsi="Times New Roman" w:eastAsia="宋体"/>
+          <w:b/>
+          <w:color w:val="000000"/>
+          <w:sz w:val="24"/>
+        </w:rPr>
+        <w:t>92.4%</w:t>
+      </w:r>
+      <w:r>
+        <w:rPr>
+          <w:rFonts w:ascii="Times New Roman" w:hAnsi="Times New Roman" w:eastAsia="宋体"/>
+          <w:b w:val="0"/>
+          <w:color w:val="000000"/>
+          <w:sz w:val="24"/>
+        </w:rPr>
+        <w:t xml:space="preserve">；单窗前向 </w:t>
+      </w:r>
+      <w:r>
+        <w:rPr>
+          <w:rFonts w:ascii="Times New Roman" w:hAnsi="Times New Roman" w:eastAsia="宋体"/>
+          <w:b/>
+          <w:color w:val="000000"/>
+          <w:sz w:val="24"/>
+        </w:rPr>
+        <w:t>1.11 ms</w:t>
+      </w:r>
+      <w:r>
+        <w:rPr>
+          <w:rFonts w:ascii="Times New Roman" w:hAnsi="Times New Roman" w:eastAsia="宋体"/>
+          <w:b w:val="0"/>
+          <w:color w:val="000000"/>
+          <w:sz w:val="24"/>
+        </w:rPr>
+        <w:t>。指定集算法旁路 Exp34–40 已在嵌套尺子下收束并冻结。后续工作：① 完成不少于 20 名被试采集并以自采数据强化底座（轨 C）；② 决赛阶段视算力考虑外源多语料预训练（备查）；③ 扩展注意力监测与更多异步控制语义，面向康复辅具落地。</w:t>
       </w:r>
     </w:p>
     <w:p>
@@ -7569,7 +8006,6 @@
         <w:spacing w:line="312" w:lineRule="auto" w:before="280" w:after="160"/>
         <w:jc w:val="center"/>
       </w:pPr>
-      <w:bookmarkStart w:id="100042" w:name="_Toc100042"/>
       <w:r>
         <w:rPr>
           <w:rFonts w:ascii="Times New Roman" w:hAnsi="Times New Roman" w:eastAsia="黑体"/>
@@ -7579,7 +8015,6 @@
         </w:rPr>
         <w:t>参考文献</w:t>
       </w:r>
-      <w:bookmarkEnd w:id="100042"/>
     </w:p>
     <w:p>
       <w:pPr>
@@ -7795,7 +8230,6 @@
         <w:spacing w:line="312" w:lineRule="auto" w:before="280" w:after="160"/>
         <w:jc w:val="center"/>
       </w:pPr>
-      <w:bookmarkStart w:id="100043" w:name="_Toc100043"/>
       <w:r>
         <w:rPr>
           <w:rFonts w:ascii="Times New Roman" w:hAnsi="Times New Roman" w:eastAsia="黑体"/>
@@ -7805,7 +8239,6 @@
         </w:rPr>
         <w:t>附录 A · 系统常量表（冻结）</w:t>
       </w:r>
-      <w:bookmarkEnd w:id="100043"/>
     </w:p>
     <w:tbl>
       <w:tblPr>
@@ -8182,7 +8615,25 @@
                 <w:color w:val="000000"/>
                 <w:sz w:val="21"/>
               </w:rPr>
-              <w:t>MI 判对 +1 · 专用 Rest 判对 +0.5 · 36 试次满分 54（v3test：20 试次连击计分满分 15）</w:t>
+              <w:t xml:space="preserve">MI 判对 +1 · 专用 Rest 判对 +0.5 · </w:t>
+            </w:r>
+            <w:r>
+              <w:rPr>
+                <w:rFonts w:ascii="Times New Roman" w:hAnsi="Times New Roman" w:eastAsia="宋体"/>
+                <w:b/>
+                <w:color w:val="000000"/>
+                <w:sz w:val="21"/>
+              </w:rPr>
+              <w:t>v3 采集</w:t>
+            </w:r>
+            <w:r>
+              <w:rPr>
+                <w:rFonts w:ascii="Times New Roman" w:hAnsi="Times New Roman" w:eastAsia="宋体"/>
+                <w:b w:val="0"/>
+                <w:color w:val="000000"/>
+                <w:sz w:val="21"/>
+              </w:rPr>
+              <w:t xml:space="preserve"> 36 试次满分 54（旁路 v3test：20 试次连击满分 15，非正式采集）</w:t>
             </w:r>
           </w:p>
         </w:tc>
@@ -8227,7 +8678,70 @@
                 <w:color w:val="000000"/>
                 <w:sz w:val="21"/>
               </w:rPr>
-              <w:t>heldout 会话窗级准确率 PASS/FAIL · FAIL 落盘告警</w:t>
+              <w:t>heldout 窗级：展示=因果平滑 · 门控=raw · PASS/FAIL · FAIL 落盘告警</w:t>
+            </w:r>
+          </w:p>
+        </w:tc>
+      </w:tr>
+      <w:tr>
+        <w:trPr>
+          <w:cantSplit/>
+        </w:trPr>
+        <w:tc>
+          <w:tcPr>
+            <w:tcW w:type="dxa" w:w="4353"/>
+          </w:tcPr>
+          <w:p>
+            <w:pPr>
+              <w:spacing w:line="276" w:lineRule="auto"/>
+              <w:jc w:val="left"/>
+            </w:pPr>
+            <w:r>
+              <w:rPr>
+                <w:rFonts w:ascii="Times New Roman" w:hAnsi="Times New Roman" w:eastAsia="宋体"/>
+                <w:b w:val="0"/>
+                <w:color w:val="000000"/>
+                <w:sz w:val="21"/>
+              </w:rPr>
+              <w:t>EEG 看门狗</w:t>
+            </w:r>
+          </w:p>
+        </w:tc>
+        <w:tc>
+          <w:tcPr>
+            <w:tcW w:type="dxa" w:w="4353"/>
+          </w:tcPr>
+          <w:p>
+            <w:pPr>
+              <w:spacing w:line="276" w:lineRule="auto"/>
+              <w:jc w:val="left"/>
+            </w:pPr>
+            <w:r>
+              <w:rPr>
+                <w:rFonts w:ascii="Times New Roman" w:hAnsi="Times New Roman" w:eastAsia="宋体"/>
+                <w:b w:val="0"/>
+                <w:color w:val="000000"/>
+                <w:sz w:val="21"/>
+              </w:rPr>
+              <w:t>缓冲停滞告警 2.0 s · 会话中止 5.0 s（</w:t>
+            </w:r>
+            <w:r>
+              <w:rPr>
+                <w:rFonts w:ascii="Consolas" w:hAnsi="Consolas" w:eastAsia="Consolas"/>
+                <w:b w:val="0"/>
+                <w:color w:val="000000"/>
+                <w:sz w:val="18"/>
+              </w:rPr>
+              <w:t>protocol.yaml</w:t>
+            </w:r>
+            <w:r>
+              <w:rPr>
+                <w:rFonts w:ascii="Times New Roman" w:hAnsi="Times New Roman" w:eastAsia="宋体"/>
+                <w:b w:val="0"/>
+                <w:color w:val="000000"/>
+                <w:sz w:val="21"/>
+              </w:rPr>
+              <w:t>）</w:t>
             </w:r>
           </w:p>
         </w:tc>
@@ -8244,7 +8758,6 @@
         <w:spacing w:line="312" w:lineRule="auto" w:before="280" w:after="160"/>
         <w:jc w:val="center"/>
       </w:pPr>
-      <w:bookmarkStart w:id="100044" w:name="_Toc100044"/>
       <w:r>
         <w:rPr>
           <w:rFonts w:ascii="Times New Roman" w:hAnsi="Times New Roman" w:eastAsia="黑体"/>
@@ -8254,7 +8767,6 @@
         </w:rPr>
         <w:t>附录 B · 与赛题要求对照</w:t>
       </w:r>
-      <w:bookmarkEnd w:id="100044"/>
     </w:p>
     <w:tbl>
       <w:tblPr>
@@ -20727,53 +21239,6 @@
       </w:tcPr>
     </w:tblStylePr>
   </w:style>
-  <w:style xmlns:w="http://schemas.openxmlformats.org/wordprocessingml/2006/main" w:type="paragraph" w:styleId="9">
-    <w:name w:val="toc 1"/>
-    <w:basedOn w:val="Normal"/>
-    <w:uiPriority w:val="39"/>
-    <w:pPr>
-      <w:tabs>
-        <w:tab w:val="right" w:leader="dot" w:pos="9026"/>
-      </w:tabs>
-      <w:spacing w:before="120" w:after="60"/>
-    </w:pPr>
-    <w:rPr>
-      <w:b/>
-      <w:bCs/>
-    </w:rPr>
-  </w:style>
-  <w:style xmlns:w="http://schemas.openxmlformats.org/wordprocessingml/2006/main" w:type="paragraph" w:styleId="11">
-    <w:name w:val="toc 2"/>
-    <w:basedOn w:val="Normal"/>
-    <w:uiPriority w:val="39"/>
-    <w:pPr>
-      <w:tabs>
-        <w:tab w:val="right" w:leader="dot" w:pos="9026"/>
-      </w:tabs>
-      <w:ind w:left="360"/>
-      <w:spacing w:before="60" w:after="40"/>
-    </w:pPr>
-  </w:style>
-  <w:style xmlns:w="http://schemas.openxmlformats.org/wordprocessingml/2006/main" w:type="paragraph" w:styleId="12">
-    <w:name w:val="toc 3"/>
-    <w:basedOn w:val="Normal"/>
-    <w:uiPriority w:val="39"/>
-    <w:pPr>
-      <w:tabs>
-        <w:tab w:val="right" w:leader="dot" w:pos="9026"/>
-      </w:tabs>
-      <w:ind w:left="720"/>
-      <w:spacing w:before="40" w:after="20"/>
-    </w:pPr>
-  </w:style>
-  <w:style xmlns:w="http://schemas.openxmlformats.org/wordprocessingml/2006/main" w:type="character" w:styleId="Hyperlink">
-    <w:name w:val="Hyperlink"/>
-    <w:uiPriority w:val="99"/>
-    <w:rPr>
-      <w:color w:val="0563C1"/>
-      <w:u w:val="single"/>
-    </w:rPr>
-  </w:style>
 </w:styles>
 </file>
 

</xml_diff>

<commit_message>
docs: adopt QuadFold-59 / CausalFuse-8 as public model names
Sync prelim report, Excel, video script, and Exp34–41 registries to the frozen outward names while keeping internal S0/E1f paths unchanged.

Co-authored-by: Cursor <cursoragent@cursor.com>
</commit_message>
<xml_diff>
--- a/资料/初赛材料/01_技术报告/技术报告_XH-202610.docx
+++ b/资料/初赛材料/01_技术报告/技术报告_XH-202610.docx
@@ -83,7 +83,7 @@
           <w:color w:val="000000"/>
           <w:sz w:val="24"/>
         </w:rPr>
-        <w:t xml:space="preserve">摘要：针对运动想象脑机接口（MI-BCI）从实验室走向实际应用面临的噪声鲁棒解码、控制/空闲状态判别、少样本个性化适配与低延迟实时运算四大瓶颈，本报告提出并实现了一套完整的"迁移学习 + 少样本个性化适配 + 在线校准"三级优化 MI-BCI 系统。系统以 OpenBMI 54 名被试公开数据预训练 ShallowFBCSPNet-E1f 四成员融合底座，在标准被试独立五折协议下取得三分类（左手/右手/空闲）试次级准确率 </w:t>
+        <w:t xml:space="preserve">摘要：针对运动想象脑机接口（MI-BCI）从实验室走向实际应用面临的噪声鲁棒解码、控制/空闲状态判别、少样本个性化适配与低延迟实时运算四大瓶颈，本报告提出并实现了一套完整的"迁移学习 + 少样本个性化适配 + 在线校准"三级优化 MI-BCI 系统。系统在线主线模型为 </w:t>
       </w:r>
       <w:r>
         <w:rPr>
@@ -92,7 +92,7 @@
           <w:color w:val="000000"/>
           <w:sz w:val="24"/>
         </w:rPr>
-        <w:t>61.88%</w:t>
+        <w:t>CausalFuse-8</w:t>
       </w:r>
       <w:r>
         <w:rPr>
@@ -101,7 +101,7 @@
           <w:color w:val="000000"/>
           <w:sz w:val="24"/>
         </w:rPr>
-        <w:t>（召回率 macro 61.88%、特异性 macro 80.94%）；在</w:t>
+        <w:t xml:space="preserve">（OpenBMI 54 人 8 通道预训练四成员底座；温度与融合权冻结；因果滑窗 3 s/hop 100 ms、lookback=2 + 多数票），公开库被试独立五折三分类试次级准确率 </w:t>
       </w:r>
       <w:r>
         <w:rPr>
@@ -110,7 +110,7 @@
           <w:color w:val="000000"/>
           <w:sz w:val="24"/>
         </w:rPr>
-        <w:t>主办方指定标准数据集</w:t>
+        <w:t>61.88%</w:t>
       </w:r>
       <w:r>
         <w:rPr>
@@ -119,7 +119,7 @@
           <w:color w:val="000000"/>
           <w:sz w:val="24"/>
         </w:rPr>
-        <w:t xml:space="preserve">上交卷栈为 </w:t>
+        <w:t xml:space="preserve">（召回率 macro 61.88%、特异性 macro 80.94%）；指定集离线交卷模型为 </w:t>
       </w:r>
       <w:r>
         <w:rPr>
@@ -128,7 +128,7 @@
           <w:color w:val="000000"/>
           <w:sz w:val="24"/>
         </w:rPr>
-        <w:t>59ch 从零 E1f-A59（S0）</w:t>
+        <w:t>QuadFold-59</w:t>
       </w:r>
       <w:r>
         <w:rPr>
@@ -137,7 +137,7 @@
           <w:color w:val="000000"/>
           <w:sz w:val="24"/>
         </w:rPr>
-        <w:t xml:space="preserve">：leave-fold 嵌套主读 </w:t>
+        <w:t xml:space="preserve">（59 通道从零四成员；融合参数 LOSO 六折逐折拟合，测试为六折概率平均）：leave-fold 嵌套主读 </w:t>
       </w:r>
       <w:r>
         <w:rPr>
@@ -227,7 +227,7 @@
           <w:color w:val="000000"/>
           <w:sz w:val="24"/>
         </w:rPr>
-        <w:t xml:space="preserve"> vs 单成员 so </w:t>
+        <w:t xml:space="preserve"> vs so </w:t>
       </w:r>
       <w:r>
         <w:rPr>
@@ -245,7 +245,25 @@
           <w:color w:val="000000"/>
           <w:sz w:val="24"/>
         </w:rPr>
-        <w:t xml:space="preserve">，Δ+21.1 pp）；真实被试采后 Leave-Next 适配最优个体窗级准确率达 </w:t>
+        <w:t xml:space="preserve">，Δ+21.1 pp）；真实被试采后适配态 </w:t>
+      </w:r>
+      <w:r>
+        <w:rPr>
+          <w:rFonts w:ascii="Times New Roman" w:hAnsi="Times New Roman" w:eastAsia="宋体"/>
+          <w:b/>
+          <w:color w:val="000000"/>
+          <w:sz w:val="24"/>
+        </w:rPr>
+        <w:t>CausalFuse-8FT</w:t>
+      </w:r>
+      <w:r>
+        <w:rPr>
+          <w:rFonts w:ascii="Times New Roman" w:hAnsi="Times New Roman" w:eastAsia="宋体"/>
+          <w:b w:val="0"/>
+          <w:color w:val="000000"/>
+          <w:sz w:val="24"/>
+        </w:rPr>
+        <w:t xml:space="preserve"> 最优个体窗级准确率达 </w:t>
       </w:r>
       <w:r>
         <w:rPr>
@@ -509,7 +527,7 @@
           <w:color w:val="000000"/>
           <w:sz w:val="24"/>
         </w:rPr>
-        <w:t>E1f 四成员概率级融合与因果读出</w:t>
+        <w:t>CausalFuse-8（在线主线）</w:t>
       </w:r>
       <w:r>
         <w:rPr>
@@ -518,7 +536,7 @@
           <w:color w:val="000000"/>
           <w:sz w:val="24"/>
         </w:rPr>
-        <w:t>：以温度校准 + 验证集加权的四成员融合（Shallow/T-Shallow/EEGNet/Conformer）叠加因果平滑读出，取得 OpenBMI 三分类 61.88%（§5）。</w:t>
+        <w:t>：四成员温度校准 + 冻结融合权，叠加因果滑窗读出，取得 OpenBMI 三分类 61.88%（§5）。</w:t>
       </w:r>
       <w:r>
         <w:rPr>
@@ -543,7 +561,7 @@
           <w:color w:val="000000"/>
           <w:sz w:val="24"/>
         </w:rPr>
-        <w:t>采后 Leave-Next 少样本个性化适配</w:t>
+        <w:t>采后 Leave-Next → CausalFuse-8FT</w:t>
       </w:r>
       <w:r>
         <w:rPr>
@@ -552,7 +570,7 @@
           <w:color w:val="000000"/>
           <w:sz w:val="24"/>
         </w:rPr>
-        <w:t>：新被试每完成一个会话即对全部四成员做增量微调并晋升，配合源域回放、质量门控与强制晋升告警，实现"边采边适配"；在公开库仿真与真实被试上均显著优于单成员微调与零样本（§7）。</w:t>
+        <w:t>：新被试每完成一个会话即对全部四成员做增量微调并晋升（融合参数仍冻结），配合源域回放、质量门控与强制晋升告警；在公开库仿真与真实被试上均显著优于单成员微调与零样本（§7）。</w:t>
       </w:r>
       <w:r>
         <w:rPr>
@@ -645,7 +663,7 @@
           <w:color w:val="000000"/>
           <w:sz w:val="24"/>
         </w:rPr>
-        <w:t>指定集嵌套协议与交卷定稿</w:t>
+        <w:t>QuadFold-59（指定集交卷）</w:t>
       </w:r>
       <w:r>
         <w:rPr>
@@ -654,25 +672,7 @@
           <w:color w:val="000000"/>
           <w:sz w:val="24"/>
         </w:rPr>
-        <w:t xml:space="preserve">：在主办方指定集上完成 Exp34–40；交卷为从零栈 </w:t>
-      </w:r>
-      <w:r>
-        <w:rPr>
-          <w:rFonts w:ascii="Times New Roman" w:hAnsi="Times New Roman" w:eastAsia="宋体"/>
-          <w:b/>
-          <w:color w:val="000000"/>
-          <w:sz w:val="24"/>
-        </w:rPr>
-        <w:t>S0</w:t>
-      </w:r>
-      <w:r>
-        <w:rPr>
-          <w:rFonts w:ascii="Times New Roman" w:hAnsi="Times New Roman" w:eastAsia="宋体"/>
-          <w:b w:val="0"/>
-          <w:color w:val="000000"/>
-          <w:sz w:val="24"/>
-        </w:rPr>
-        <w:t xml:space="preserve">（嵌套 0.511 / 折内 0.558 双标注），并量化折内融合乐观约 </w:t>
+        <w:t xml:space="preserve">：Exp34–40 定稿；嵌套 0.511 / 折内 0.558 双标注；折内融合乐观约 </w:t>
       </w:r>
       <w:r>
         <w:rPr>
@@ -852,7 +852,7 @@
           <w:color w:val="000000"/>
           <w:sz w:val="18"/>
         </w:rPr>
-        <w:t>公开数据（OpenBMI/BCI2a/Stieger）统一切窗 → 预训练通用底座（E1f 四成员）</w:t>
+        <w:t>公开数据（OpenBMI/BCI2a/Stieger）统一切窗 → CausalFuse-8 底座（8ch · 四成员 · T/w 冻结）</w:t>
         <w:br/>
       </w:r>
       <w:r>
@@ -872,7 +872,7 @@
           <w:color w:val="000000"/>
           <w:sz w:val="18"/>
         </w:rPr>
-        <w:t xml:space="preserve">  → 采后 Leave-Next 增量微调（all4 + replay 0.10 + 门控）</w:t>
+        <w:t xml:space="preserve">  → 采后 Leave-Next 增量微调（all4 + replay 0.10 + 门控）→ CausalFuse-8FT</w:t>
         <w:br/>
       </w:r>
       <w:r>
@@ -892,7 +892,7 @@
           <w:color w:val="000000"/>
           <w:sz w:val="18"/>
         </w:rPr>
-        <w:t xml:space="preserve">  → 在线三类实时分类（因果平滑 + 多数票读出）+ 第一人称游戏反馈</w:t>
+        <w:t xml:space="preserve">  → 在线三类实时分类（因果滑窗 + 多数票）+ 第一人称游戏反馈</w:t>
         <w:br/>
       </w:r>
       <w:r>
@@ -2536,7 +2536,7 @@
                 <w:color w:val="000000"/>
                 <w:sz w:val="21"/>
               </w:rPr>
-              <w:t>交卷=59ch 从零 S0</w:t>
+              <w:t>交卷=QuadFold-59</w:t>
             </w:r>
             <w:r>
               <w:rPr>
@@ -2545,7 +2545,7 @@
                 <w:color w:val="000000"/>
                 <w:sz w:val="21"/>
               </w:rPr>
-              <w:t>；OpenBMI→8ch FT 为已登记备选；详见 §9.7</w:t>
+              <w:t>（内部 S0）；OpenBMI→8ch FT 为已登记备选；详见 §9.7</w:t>
             </w:r>
           </w:p>
         </w:tc>
@@ -3452,7 +3452,7 @@
           <w:color w:val="000000"/>
           <w:sz w:val="30"/>
         </w:rPr>
-        <w:t>5.2 E1f 四成员概率级融合</w:t>
+        <w:t>5.2 CausalFuse-8：四成员概率级融合（底座）</w:t>
       </w:r>
     </w:p>
     <w:p>
@@ -3464,11 +3464,38 @@
       <w:r>
         <w:rPr>
           <w:rFonts w:ascii="Times New Roman" w:hAnsi="Times New Roman" w:eastAsia="宋体"/>
+          <w:b/>
+          <w:color w:val="000000"/>
+          <w:sz w:val="24"/>
+        </w:rPr>
+        <w:t>CausalFuse-8</w:t>
+      </w:r>
+      <w:r>
+        <w:rPr>
+          <w:rFonts w:ascii="Times New Roman" w:hAnsi="Times New Roman" w:eastAsia="宋体"/>
           <w:b w:val="0"/>
           <w:color w:val="000000"/>
           <w:sz w:val="24"/>
         </w:rPr>
-        <w:t xml:space="preserve">单模型之上，对 shallow、T-shallow（Task 头增强版 shallow）、eegnet、conformer 四个成员的输出概率做融合（E1f，实验 26）：各成员先做温度校准（temperatures 由验证集 NLL 拟合），再按验证集网格搜索的权重加权求和。冻结配置下 OpenBMI 三分类试次级 </w:t>
+        <w:t xml:space="preserve">：OpenBMI 54 人预训练四成员底座（8 通道），成员为 shallow、Shallow-b（T-shallow / Task 头增强版 shallow）、eegnet、conformer。各成员先做温度校准（temperatures 由验证集 NLL 拟合）后冻结；融合权重固定为全局常量 </w:t>
+      </w:r>
+      <w:r>
+        <w:rPr>
+          <w:rFonts w:ascii="Consolas" w:hAnsi="Consolas" w:eastAsia="Consolas"/>
+          <w:b w:val="0"/>
+          <w:color w:val="000000"/>
+          <w:sz w:val="21"/>
+        </w:rPr>
+        <w:t>[0.2, 0.2, 0.3, 0.3]</w:t>
+      </w:r>
+      <w:r>
+        <w:rPr>
+          <w:rFonts w:ascii="Times New Roman" w:hAnsi="Times New Roman" w:eastAsia="宋体"/>
+          <w:b w:val="0"/>
+          <w:color w:val="000000"/>
+          <w:sz w:val="24"/>
+        </w:rPr>
+        <w:t>，</w:t>
       </w:r>
       <w:r>
         <w:rPr>
@@ -3477,7 +3504,7 @@
           <w:color w:val="000000"/>
           <w:sz w:val="24"/>
         </w:rPr>
-        <w:t>0.6173</w:t>
+        <w:t>上线后不随会话重拟合</w:t>
       </w:r>
       <w:r>
         <w:rPr>
@@ -3486,7 +3513,25 @@
           <w:color w:val="000000"/>
           <w:sz w:val="24"/>
         </w:rPr>
-        <w:t>。机制实验（oracle 上界、λ 扫描、SE/ECA/CBAM 模块增强、双专家门控、JEPA 系列等）均为阴性，说明增益不在结构模块层而在校准与集成层。</w:t>
+        <w:t xml:space="preserve">。冻结配置下 OpenBMI 三分类试次级 </w:t>
+      </w:r>
+      <w:r>
+        <w:rPr>
+          <w:rFonts w:ascii="Times New Roman" w:hAnsi="Times New Roman" w:eastAsia="宋体"/>
+          <w:b/>
+          <w:color w:val="000000"/>
+          <w:sz w:val="24"/>
+        </w:rPr>
+        <w:t>0.6173</w:t>
+      </w:r>
+      <w:r>
+        <w:rPr>
+          <w:rFonts w:ascii="Times New Roman" w:hAnsi="Times New Roman" w:eastAsia="宋体"/>
+          <w:b w:val="0"/>
+          <w:color w:val="000000"/>
+          <w:sz w:val="24"/>
+        </w:rPr>
+        <w:t>（内部代号 E1f，实验 26）。机制实验（oracle 上界、λ 扫描、SE/ECA/CBAM、双专家门控、JEPA 等）均为阴性，说明增益不在结构模块层而在校准与集成层。</w:t>
       </w:r>
     </w:p>
     <w:p>
@@ -3501,7 +3546,7 @@
           <w:color w:val="000000"/>
           <w:sz w:val="30"/>
         </w:rPr>
-        <w:t>5.3 读出层（因果平滑 + 多数票，冻结 F5）</w:t>
+        <w:t>5.3 读出层（因果滑窗 + 多数票，冻结 F5）</w:t>
       </w:r>
     </w:p>
     <w:p>
@@ -3517,7 +3562,25 @@
           <w:color w:val="000000"/>
           <w:sz w:val="24"/>
         </w:rPr>
-        <w:t>在线读出为单轨三分类（F5 冻结）：</w:t>
+        <w:t xml:space="preserve">在线读出绑定 </w:t>
+      </w:r>
+      <w:r>
+        <w:rPr>
+          <w:rFonts w:ascii="Times New Roman" w:hAnsi="Times New Roman" w:eastAsia="宋体"/>
+          <w:b/>
+          <w:color w:val="000000"/>
+          <w:sz w:val="24"/>
+        </w:rPr>
+        <w:t>CausalFuse-8</w:t>
+      </w:r>
+      <w:r>
+        <w:rPr>
+          <w:rFonts w:ascii="Times New Roman" w:hAnsi="Times New Roman" w:eastAsia="宋体"/>
+          <w:b w:val="0"/>
+          <w:color w:val="000000"/>
+          <w:sz w:val="24"/>
+        </w:rPr>
+        <w:t>（F5 冻结）：</w:t>
       </w:r>
     </w:p>
     <w:p>
@@ -3542,7 +3605,7 @@
           <w:color w:val="000000"/>
           <w:sz w:val="24"/>
         </w:rPr>
-        <w:t>：E1f 融合概率 → 因果平滑（当前窗与前两窗，lookback=2）→ argmax；</w:t>
+        <w:t>：融合概率 → 因果平滑（当前窗与前两窗，lookback=2）→ argmax；</w:t>
       </w:r>
     </w:p>
     <w:p>
@@ -3601,7 +3664,25 @@
           <w:color w:val="000000"/>
           <w:sz w:val="24"/>
         </w:rPr>
-        <w:t>（C 臂，实验 30），优于离线双向平滑 classic 臂 0.6173，说明因果化不损失精度；多数票（W 臂）0.6125 作为现行线上读出。置信度 τ 早停双轨已退出正式协议，仅保留为离线分析旁路。</w:t>
+        <w:t xml:space="preserve">（C 臂，实验 30），优于离线双向平滑 classic 臂 0.6173，说明因果化不损失精度；多数票（W 臂）0.6125 作为现行线上读出。被试经 Leave-Next 全成员微调后的适配态记 </w:t>
+      </w:r>
+      <w:r>
+        <w:rPr>
+          <w:rFonts w:ascii="Times New Roman" w:hAnsi="Times New Roman" w:eastAsia="宋体"/>
+          <w:b/>
+          <w:color w:val="000000"/>
+          <w:sz w:val="24"/>
+        </w:rPr>
+        <w:t>CausalFuse-8FT</w:t>
+      </w:r>
+      <w:r>
+        <w:rPr>
+          <w:rFonts w:ascii="Times New Roman" w:hAnsi="Times New Roman" w:eastAsia="宋体"/>
+          <w:b w:val="0"/>
+          <w:color w:val="000000"/>
+          <w:sz w:val="24"/>
+        </w:rPr>
+        <w:t>（融合 T/w 仍冻结）。置信度 τ 早停双轨已退出正式协议，仅保留为离线分析旁路。</w:t>
       </w:r>
     </w:p>
     <w:p>
@@ -4978,11 +5059,20 @@
             <w:r>
               <w:rPr>
                 <w:rFonts w:ascii="Times New Roman" w:hAnsi="Times New Roman" w:eastAsia="宋体"/>
+                <w:b/>
+                <w:color w:val="000000"/>
+                <w:sz w:val="21"/>
+              </w:rPr>
+              <w:t>CausalFuse-8</w:t>
+            </w:r>
+            <w:r>
+              <w:rPr>
+                <w:rFonts w:ascii="Times New Roman" w:hAnsi="Times New Roman" w:eastAsia="宋体"/>
                 <w:b w:val="0"/>
                 <w:color w:val="000000"/>
                 <w:sz w:val="21"/>
               </w:rPr>
-              <w:t xml:space="preserve">E1f 四成员融合 → 因果平滑 lookback=2 → argmax；试次级多数票（判定窗锚定 </w:t>
+              <w:t xml:space="preserve">：四成员融合 → 因果滑窗 lookback=2 → argmax；试次级多数票（判定窗锚定 </w:t>
             </w:r>
             <w:r>
               <w:rPr>
@@ -6941,7 +7031,7 @@
           <w:color w:val="000000"/>
           <w:sz w:val="24"/>
         </w:rPr>
-        <w:t>交卷口径</w:t>
+        <w:t>QuadFold-59</w:t>
       </w:r>
       <w:r>
         <w:rPr>
@@ -6950,7 +7040,7 @@
           <w:color w:val="000000"/>
           <w:sz w:val="24"/>
         </w:rPr>
-        <w:t xml:space="preserve">：指定集提交 </w:t>
+        <w:t xml:space="preserve">：四成员（Shallow、Shallow-b、EEGNet、Conformer）于 59 通道、3 s 单窗协议下从零训练；融合采用成员温度缩放 + 权重单纯形加权，参数随 LOSO 六折逐折拟合（共 6 套），测试预测为六折模型概率平均（S-ensemble）。嵌套复核 </w:t>
       </w:r>
       <w:r>
         <w:rPr>
@@ -6959,7 +7049,7 @@
           <w:color w:val="000000"/>
           <w:sz w:val="24"/>
         </w:rPr>
-        <w:t>59ch 从零 E1f-A59（S0）</w:t>
+        <w:t>0.511±0.066</w:t>
       </w:r>
       <w:r>
         <w:rPr>
@@ -6968,7 +7058,61 @@
           <w:color w:val="000000"/>
           <w:sz w:val="24"/>
         </w:rPr>
-        <w:t>。OpenBMI 预训练用于系统底座与公开库主结果，</w:t>
+        <w:t xml:space="preserve">，折内读数 </w:t>
+      </w:r>
+      <w:r>
+        <w:rPr>
+          <w:rFonts w:ascii="Times New Roman" w:hAnsi="Times New Roman" w:eastAsia="宋体"/>
+          <w:b/>
+          <w:color w:val="000000"/>
+          <w:sz w:val="24"/>
+        </w:rPr>
+        <w:t>0.558±0.069</w:t>
+      </w:r>
+      <w:r>
+        <w:rPr>
+          <w:rFonts w:ascii="Times New Roman" w:hAnsi="Times New Roman" w:eastAsia="宋体"/>
+          <w:b w:val="0"/>
+          <w:color w:val="000000"/>
+          <w:sz w:val="24"/>
+        </w:rPr>
+        <w:t xml:space="preserve">。内部代号 </w:t>
+      </w:r>
+      <w:r>
+        <w:rPr>
+          <w:rFonts w:ascii="Times New Roman" w:hAnsi="Times New Roman" w:eastAsia="宋体"/>
+          <w:b/>
+          <w:color w:val="000000"/>
+          <w:sz w:val="24"/>
+        </w:rPr>
+        <w:t>S0 / E1f-A59</w:t>
+      </w:r>
+      <w:r>
+        <w:rPr>
+          <w:rFonts w:ascii="Times New Roman" w:hAnsi="Times New Roman" w:eastAsia="宋体"/>
+          <w:b w:val="0"/>
+          <w:color w:val="000000"/>
+          <w:sz w:val="24"/>
+        </w:rPr>
+        <w:t xml:space="preserve">。OpenBMI 预训练用于系统底座 </w:t>
+      </w:r>
+      <w:r>
+        <w:rPr>
+          <w:rFonts w:ascii="Times New Roman" w:hAnsi="Times New Roman" w:eastAsia="宋体"/>
+          <w:b/>
+          <w:color w:val="000000"/>
+          <w:sz w:val="24"/>
+        </w:rPr>
+        <w:t>CausalFuse-8</w:t>
+      </w:r>
+      <w:r>
+        <w:rPr>
+          <w:rFonts w:ascii="Times New Roman" w:hAnsi="Times New Roman" w:eastAsia="宋体"/>
+          <w:b w:val="0"/>
+          <w:color w:val="000000"/>
+          <w:sz w:val="24"/>
+        </w:rPr>
+        <w:t xml:space="preserve"> 与公开库主结果，</w:t>
       </w:r>
       <w:r>
         <w:rPr>
@@ -7076,7 +7220,7 @@
                 <w:color w:val="000000"/>
                 <w:sz w:val="21"/>
               </w:rPr>
-              <w:t>栈</w:t>
+              <w:t>栈（对外 / 内部）</w:t>
             </w:r>
           </w:p>
         </w:tc>
@@ -7163,7 +7307,16 @@
                 <w:color w:val="000000"/>
                 <w:sz w:val="21"/>
               </w:rPr>
-              <w:t>E1f-A59（N0 / S0）</w:t>
+              <w:t>QuadFold-59</w:t>
+            </w:r>
+            <w:r>
+              <w:rPr>
+                <w:rFonts w:ascii="Times New Roman" w:hAnsi="Times New Roman" w:eastAsia="宋体"/>
+                <w:b w:val="0"/>
+                <w:color w:val="000000"/>
+                <w:sz w:val="21"/>
+              </w:rPr>
+              <w:t>（N0 / S0）</w:t>
             </w:r>
           </w:p>
         </w:tc>
@@ -7248,7 +7401,7 @@
                 <w:color w:val="000000"/>
                 <w:sz w:val="21"/>
               </w:rPr>
-              <w:t>E1f-A59</w:t>
+              <w:t>QuadFold-59（E1f-A59）</w:t>
             </w:r>
           </w:p>
         </w:tc>
@@ -7576,7 +7729,7 @@
           <w:color w:val="000000"/>
           <w:sz w:val="24"/>
         </w:rPr>
-        <w:t xml:space="preserve">：同一 E1f-A59 栈，折内 0.558 相对嵌套 0.511 高约 </w:t>
+        <w:t xml:space="preserve">：同一 QuadFold-59 栈，折内 0.558 相对嵌套 0.511 高约 </w:t>
       </w:r>
       <w:r>
         <w:rPr>
@@ -7637,7 +7790,7 @@
           <w:color w:val="000000"/>
           <w:sz w:val="24"/>
         </w:rPr>
-        <w:t>，落在 Val 六折支撑之外；且与 fold0「Rest 仅 12% 后崩到 0.300」方向相反。两栈对 test 皆为外推，但 S0 Val 最差折 0.427、无 0.300 前科，设计均衡下边际上限亦更高（90.8% vs 82.5%）。故提交 S0，R-B8 CSV 保留归档。该决策</w:t>
+        <w:t>，落在 Val 六折支撑之外；且与 fold0「Rest 仅 12% 后崩到 0.300」方向相反。两栈对 test 皆为外推，但 QuadFold-59 Val 最差折 0.427、无 0.300 前科，设计均衡下边际上限亦更高（90.8% vs 82.5%）。故提交 QuadFold-59（S0），R-B8 CSV 保留归档。该决策</w:t>
       </w:r>
       <w:r>
         <w:rPr>
@@ -7687,7 +7840,25 @@
           <w:color w:val="000000"/>
           <w:sz w:val="24"/>
         </w:rPr>
-        <w:t>在线系统由四部分组成：采集前端（Cyton + LSL）、推理服务（3 s/hop100 滑窗 + E1f 四成员 + 因果平滑读出）、游戏前端（第一人称虚拟手 + 连击计分）、操作台（会话控制与实时监测）。演示视频（MP4，≤10 分钟）按"实时采集 → 三类实时分类 → 视觉反馈 → 状态切换响应"四要素录制，脚本与分镜见随附《演示视频脚本》。</w:t>
+        <w:t>在线系统由四部分构成：采集前端（Cyton + LSL）、推理服务（</w:t>
+      </w:r>
+      <w:r>
+        <w:rPr>
+          <w:rFonts w:ascii="Times New Roman" w:hAnsi="Times New Roman" w:eastAsia="宋体"/>
+          <w:b/>
+          <w:color w:val="000000"/>
+          <w:sz w:val="24"/>
+        </w:rPr>
+        <w:t>CausalFuse-8 / -8FT</w:t>
+      </w:r>
+      <w:r>
+        <w:rPr>
+          <w:rFonts w:ascii="Times New Roman" w:hAnsi="Times New Roman" w:eastAsia="宋体"/>
+          <w:b w:val="0"/>
+          <w:color w:val="000000"/>
+          <w:sz w:val="24"/>
+        </w:rPr>
+        <w:t>：3 s/hop100 因果滑窗 + 冻结温度与融合权）、游戏前端（第一人称虚拟手 + 连击计分）、操作台（会话控制与实时监测）。演示视频（MP4，≤10 分钟）按"实时采集 → 三类实时分类 → 视觉反馈 → 状态切换响应"四要素录制，脚本与分镜见随附《演示视频脚本》。</w:t>
       </w:r>
     </w:p>
     <w:p>
@@ -7907,7 +8078,7 @@
           <w:color w:val="000000"/>
           <w:sz w:val="24"/>
         </w:rPr>
-        <w:t xml:space="preserve">本系统完成了从公开数据预训练、指定集从零评测、自采数据强化、少样本个体适配到在线游戏化交互的完整 MI-BCI 链路：OpenBMI 标准五折三分类 </w:t>
+        <w:t xml:space="preserve">本系统完成了从公开数据预训练、指定集从零评测、自采数据强化、少样本个体适配到在线游戏化交互的完整 MI-BCI 链路：在线主线 </w:t>
       </w:r>
       <w:r>
         <w:rPr>
@@ -7916,7 +8087,7 @@
           <w:color w:val="000000"/>
           <w:sz w:val="24"/>
         </w:rPr>
-        <w:t>61.88%</w:t>
+        <w:t>CausalFuse-8</w:t>
       </w:r>
       <w:r>
         <w:rPr>
@@ -7925,7 +8096,7 @@
           <w:color w:val="000000"/>
           <w:sz w:val="24"/>
         </w:rPr>
-        <w:t xml:space="preserve">；主办方指定集交卷 </w:t>
+        <w:t xml:space="preserve"> 于 OpenBMI 标准五折三分类 </w:t>
       </w:r>
       <w:r>
         <w:rPr>
@@ -7934,7 +8105,7 @@
           <w:color w:val="000000"/>
           <w:sz w:val="24"/>
         </w:rPr>
-        <w:t>S0 嵌套主读 0.511</w:t>
+        <w:t>61.88%</w:t>
       </w:r>
       <w:r>
         <w:rPr>
@@ -7943,7 +8114,7 @@
           <w:color w:val="000000"/>
           <w:sz w:val="24"/>
         </w:rPr>
-        <w:t xml:space="preserve">（折内双标注 0.558；备选 R-B8=0.540 已归档）；BCI2a Leave-Next 末档 all4 </w:t>
+        <w:t xml:space="preserve">；指定集交卷 </w:t>
       </w:r>
       <w:r>
         <w:rPr>
@@ -7952,7 +8123,7 @@
           <w:color w:val="000000"/>
           <w:sz w:val="24"/>
         </w:rPr>
-        <w:t>66.3%</w:t>
+        <w:t>QuadFold-59</w:t>
       </w:r>
       <w:r>
         <w:rPr>
@@ -7961,7 +8132,61 @@
           <w:color w:val="000000"/>
           <w:sz w:val="24"/>
         </w:rPr>
-        <w:t xml:space="preserve">（相对 so +21.1 pp）；真实被试个体适配最优 </w:t>
+        <w:t xml:space="preserve"> 嵌套主读 </w:t>
+      </w:r>
+      <w:r>
+        <w:rPr>
+          <w:rFonts w:ascii="Times New Roman" w:hAnsi="Times New Roman" w:eastAsia="宋体"/>
+          <w:b/>
+          <w:color w:val="000000"/>
+          <w:sz w:val="24"/>
+        </w:rPr>
+        <w:t>0.511</w:t>
+      </w:r>
+      <w:r>
+        <w:rPr>
+          <w:rFonts w:ascii="Times New Roman" w:hAnsi="Times New Roman" w:eastAsia="宋体"/>
+          <w:b w:val="0"/>
+          <w:color w:val="000000"/>
+          <w:sz w:val="24"/>
+        </w:rPr>
+        <w:t xml:space="preserve">（折内双标注 0.558；备选 R-B8=0.540 已归档）；BCI2a Leave-Next 末档 all4 </w:t>
+      </w:r>
+      <w:r>
+        <w:rPr>
+          <w:rFonts w:ascii="Times New Roman" w:hAnsi="Times New Roman" w:eastAsia="宋体"/>
+          <w:b/>
+          <w:color w:val="000000"/>
+          <w:sz w:val="24"/>
+        </w:rPr>
+        <w:t>66.3%</w:t>
+      </w:r>
+      <w:r>
+        <w:rPr>
+          <w:rFonts w:ascii="Times New Roman" w:hAnsi="Times New Roman" w:eastAsia="宋体"/>
+          <w:b w:val="0"/>
+          <w:color w:val="000000"/>
+          <w:sz w:val="24"/>
+        </w:rPr>
+        <w:t xml:space="preserve">（相对 so +21.1 pp）；真实被试 </w:t>
+      </w:r>
+      <w:r>
+        <w:rPr>
+          <w:rFonts w:ascii="Times New Roman" w:hAnsi="Times New Roman" w:eastAsia="宋体"/>
+          <w:b/>
+          <w:color w:val="000000"/>
+          <w:sz w:val="24"/>
+        </w:rPr>
+        <w:t>CausalFuse-8FT</w:t>
+      </w:r>
+      <w:r>
+        <w:rPr>
+          <w:rFonts w:ascii="Times New Roman" w:hAnsi="Times New Roman" w:eastAsia="宋体"/>
+          <w:b w:val="0"/>
+          <w:color w:val="000000"/>
+          <w:sz w:val="24"/>
+        </w:rPr>
+        <w:t xml:space="preserve"> 最优 </w:t>
       </w:r>
       <w:r>
         <w:rPr>
@@ -8521,11 +8746,20 @@
             <w:r>
               <w:rPr>
                 <w:rFonts w:ascii="Times New Roman" w:hAnsi="Times New Roman" w:eastAsia="宋体"/>
+                <w:b/>
+                <w:color w:val="000000"/>
+                <w:sz w:val="21"/>
+              </w:rPr>
+              <w:t>CausalFuse-8</w:t>
+            </w:r>
+            <w:r>
+              <w:rPr>
+                <w:rFonts w:ascii="Times New Roman" w:hAnsi="Times New Roman" w:eastAsia="宋体"/>
                 <w:b w:val="0"/>
                 <w:color w:val="000000"/>
                 <w:sz w:val="21"/>
               </w:rPr>
-              <w:t>E1f 四成员融合 → 因果平滑 lookback=2 → argmax；试次多数票</w:t>
+              <w:t>：四成员融合 → 因果滑窗 lookback=2 → argmax；试次多数票</w:t>
             </w:r>
           </w:p>
         </w:tc>

</xml_diff>